<commit_message>
Add logo image to the project
</commit_message>
<xml_diff>
--- a/Web Development (WEDE5112) POE.docx
+++ b/Web Development (WEDE5112) POE.docx
@@ -4982,12 +4982,18 @@
       <w:pPr>
         <w:pStyle w:val="Heading2"/>
         <w:spacing w:before="240" w:after="120" w:line="360" w:lineRule="auto"/>
+        <w:rPr>
+          <w:sz w:val="24"/>
+          <w:szCs w:val="24"/>
+        </w:rPr>
       </w:pPr>
       <w:bookmarkStart w:id="34" w:name="_Toc237557391"/>
       <w:bookmarkStart w:id="35" w:name="_Toc237564314"/>
       <w:r>
         <w:rPr>
           <w:rFonts w:ascii="Aptos" w:eastAsia="Aptos" w:hAnsi="Aptos" w:cs="Aptos"/>
+          <w:sz w:val="24"/>
+          <w:szCs w:val="24"/>
         </w:rPr>
         <w:t>7. Timeline and Milestones</w:t>
       </w:r>
@@ -5074,12 +5080,18 @@
       <w:pPr>
         <w:pStyle w:val="Heading2"/>
         <w:spacing w:before="240" w:after="120" w:line="360" w:lineRule="auto"/>
+        <w:rPr>
+          <w:sz w:val="24"/>
+          <w:szCs w:val="24"/>
+        </w:rPr>
       </w:pPr>
       <w:bookmarkStart w:id="36" w:name="_Toc237557392"/>
       <w:bookmarkStart w:id="37" w:name="_Toc237564315"/>
       <w:r>
         <w:rPr>
           <w:rFonts w:ascii="Aptos" w:eastAsia="Aptos" w:hAnsi="Aptos" w:cs="Aptos"/>
+          <w:sz w:val="24"/>
+          <w:szCs w:val="24"/>
         </w:rPr>
         <w:t>8. Budget</w:t>
       </w:r>
@@ -5121,12 +5133,18 @@
       <w:pPr>
         <w:pStyle w:val="Heading2"/>
         <w:spacing w:before="240" w:after="120" w:line="360" w:lineRule="auto"/>
+        <w:rPr>
+          <w:sz w:val="24"/>
+          <w:szCs w:val="24"/>
+        </w:rPr>
       </w:pPr>
       <w:bookmarkStart w:id="38" w:name="_Toc237557393"/>
       <w:bookmarkStart w:id="39" w:name="_Toc237564316"/>
       <w:r>
         <w:rPr>
           <w:rFonts w:ascii="Aptos" w:eastAsia="Aptos" w:hAnsi="Aptos" w:cs="Aptos"/>
+          <w:sz w:val="24"/>
+          <w:szCs w:val="24"/>
         </w:rPr>
         <w:t>9. References</w:t>
       </w:r>
@@ -5221,14 +5239,497 @@
     </w:p>
     <w:p>
       <w:pPr>
+        <w:pStyle w:val="Heading2"/>
+        <w:jc w:val="both"/>
+        <w:rPr>
+          <w:rFonts w:ascii="Aptos" w:hAnsi="Aptos"/>
+          <w:sz w:val="24"/>
+          <w:szCs w:val="24"/>
+        </w:rPr>
+      </w:pPr>
+      <w:r>
+        <w:rPr>
+          <w:rFonts w:ascii="Aptos" w:hAnsi="Aptos"/>
+          <w:sz w:val="24"/>
+          <w:szCs w:val="24"/>
+        </w:rPr>
+        <w:lastRenderedPageBreak/>
+        <w:t xml:space="preserve"> </w:t>
+      </w:r>
+      <w:r>
+        <w:rPr>
+          <w:rFonts w:ascii="Aptos" w:hAnsi="Aptos"/>
+          <w:sz w:val="24"/>
+          <w:szCs w:val="24"/>
+        </w:rPr>
+        <w:t xml:space="preserve">3. </w:t>
+      </w:r>
+      <w:r>
+        <w:rPr>
+          <w:rFonts w:ascii="Aptos" w:hAnsi="Aptos"/>
+          <w:sz w:val="24"/>
+          <w:szCs w:val="24"/>
+        </w:rPr>
+        <w:t>Content Research and Sourcing — Paw Haven Animal Rescue</w:t>
+      </w:r>
+    </w:p>
+    <w:p>
+      <w:pPr>
+        <w:jc w:val="both"/>
+      </w:pPr>
+      <w:r>
+        <w:t>Organisational content (history, mission, vision, animal profiles) is original content</w:t>
+      </w:r>
+      <w:r>
+        <w:t xml:space="preserve"> </w:t>
+      </w:r>
+      <w:r>
+        <w:t>written for this fictional organisation and does not require citation.</w:t>
+      </w:r>
+      <w:r>
+        <w:rPr>
+          <w:rFonts w:ascii="Consolas" w:eastAsia="Times New Roman" w:hAnsi="Consolas" w:cs="Times New Roman"/>
+          <w:color w:val="BBBEBF"/>
+          <w:kern w:val="0"/>
+          <w:sz w:val="21"/>
+          <w:szCs w:val="21"/>
+          <w:lang w:eastAsia="en-ZA"/>
+          <w14:ligatures w14:val="none"/>
+        </w:rPr>
+        <w:t xml:space="preserve"> </w:t>
+      </w:r>
+      <w:r>
+        <w:t>No external text content has been copied from any source; all page copy is original.</w:t>
+      </w:r>
+    </w:p>
+    <w:p>
+      <w:pPr>
+        <w:jc w:val="both"/>
+        <w:rPr>
+          <w:b/>
+          <w:bCs/>
+          <w:u w:val="single"/>
+        </w:rPr>
+      </w:pPr>
+      <w:r>
+        <w:rPr>
+          <w:b/>
+          <w:bCs/>
+          <w:u w:val="single"/>
+        </w:rPr>
+        <w:t>Per Section 3.1 of the brief, this document records where each page's content came from.</w:t>
+      </w:r>
+    </w:p>
+    <w:p>
+      <w:pPr>
+        <w:jc w:val="both"/>
+        <w:rPr>
+          <w:u w:val="single"/>
+        </w:rPr>
+      </w:pPr>
+      <w:r>
+        <w:rPr>
+          <w:b/>
+          <w:bCs/>
+        </w:rPr>
+        <w:t>Home (index.html)</w:t>
+      </w:r>
+    </w:p>
+    <w:p>
+      <w:pPr>
+        <w:pStyle w:val="ListParagraph"/>
+        <w:numPr>
+          <w:ilvl w:val="0"/>
+          <w:numId w:val="3"/>
+        </w:numPr>
+        <w:jc w:val="both"/>
+      </w:pPr>
+      <w:r>
+        <w:t xml:space="preserve">All text is original content written for this fictional organisation. No citation </w:t>
+      </w:r>
+      <w:proofErr w:type="gramStart"/>
+      <w:r>
+        <w:t>required..</w:t>
+      </w:r>
+      <w:proofErr w:type="gramEnd"/>
+    </w:p>
+    <w:p>
+      <w:pPr>
+        <w:jc w:val="both"/>
+      </w:pPr>
+      <w:r>
+        <w:rPr>
+          <w:b/>
+          <w:bCs/>
+        </w:rPr>
+        <w:t>About (about.html)</w:t>
+      </w:r>
+    </w:p>
+    <w:p>
+      <w:pPr>
+        <w:pStyle w:val="ListParagraph"/>
+        <w:numPr>
+          <w:ilvl w:val="0"/>
+          <w:numId w:val="3"/>
+        </w:numPr>
+        <w:jc w:val="both"/>
+      </w:pPr>
+      <w:r>
+        <w:t>History, mission, vision, and team descriptions are original content, developed from the</w:t>
+      </w:r>
+    </w:p>
+    <w:p>
+      <w:pPr>
+        <w:jc w:val="both"/>
+      </w:pPr>
+      <w:r>
+        <w:t>  organisation profile established in the Website Project Proposal document.</w:t>
+      </w:r>
+    </w:p>
+    <w:p>
+      <w:pPr>
+        <w:jc w:val="both"/>
+      </w:pPr>
+      <w:r>
+        <w:rPr>
+          <w:b/>
+          <w:bCs/>
+        </w:rPr>
+        <w:t>Adopt (adopt.html)</w:t>
+      </w:r>
+    </w:p>
+    <w:p>
+      <w:pPr>
+        <w:pStyle w:val="ListParagraph"/>
+        <w:numPr>
+          <w:ilvl w:val="0"/>
+          <w:numId w:val="3"/>
+        </w:numPr>
+        <w:jc w:val="both"/>
+      </w:pPr>
+      <w:r>
+        <w:t>All four animal profiles (Buddy, Whiskers, Nala, Max) are original fictional content</w:t>
+      </w:r>
+    </w:p>
+    <w:p>
+      <w:pPr>
+        <w:jc w:val="both"/>
+      </w:pPr>
+      <w:r>
+        <w:t>  created for this project. No real animals, real shelters, or real people are represented.</w:t>
+      </w:r>
+    </w:p>
+    <w:p>
+      <w:pPr>
+        <w:pStyle w:val="ListParagraph"/>
+        <w:numPr>
+          <w:ilvl w:val="0"/>
+          <w:numId w:val="3"/>
+        </w:numPr>
+        <w:jc w:val="both"/>
+      </w:pPr>
+      <w:r>
+        <w:t xml:space="preserve">-Animal photos: </w:t>
+      </w:r>
+    </w:p>
+    <w:p>
+      <w:pPr>
+        <w:jc w:val="both"/>
+      </w:pPr>
+      <w:r>
+        <w:rPr>
+          <w:b/>
+          <w:bCs/>
+        </w:rPr>
+        <w:t xml:space="preserve"> Enquiry (enquiry.html)</w:t>
+      </w:r>
+    </w:p>
+    <w:p>
+      <w:pPr>
+        <w:pStyle w:val="ListParagraph"/>
+        <w:numPr>
+          <w:ilvl w:val="0"/>
+          <w:numId w:val="3"/>
+        </w:numPr>
+        <w:jc w:val="both"/>
+      </w:pPr>
+      <w:r>
+        <w:t>-Form field structure (adopt/volunteer/sponsor enquiry types) is derived directly from the</w:t>
+      </w:r>
+    </w:p>
+    <w:p>
+      <w:pPr>
+        <w:pStyle w:val="ListParagraph"/>
+        <w:numPr>
+          <w:ilvl w:val="0"/>
+          <w:numId w:val="3"/>
+        </w:numPr>
+        <w:jc w:val="both"/>
+      </w:pPr>
+      <w:r>
+        <w:t xml:space="preserve">brief's explicit requirement that an NPO's enquiry page must support volunteer </w:t>
+      </w:r>
+      <w:r>
+        <w:t>and sponsor</w:t>
+      </w:r>
+      <w:r>
+        <w:t xml:space="preserve"> enquiries, not from an external source.</w:t>
+      </w:r>
+    </w:p>
+    <w:p>
+      <w:pPr>
+        <w:jc w:val="both"/>
+      </w:pPr>
+      <w:r>
+        <w:rPr>
+          <w:b/>
+          <w:bCs/>
+        </w:rPr>
+        <w:t>Contact (contact.html)</w:t>
+      </w:r>
+    </w:p>
+    <w:p>
+      <w:pPr>
+        <w:pStyle w:val="ListParagraph"/>
+        <w:numPr>
+          <w:ilvl w:val="0"/>
+          <w:numId w:val="4"/>
+        </w:numPr>
+        <w:jc w:val="both"/>
+      </w:pPr>
+      <w:r>
+        <w:t>Both addresses are fictional, created to satisfy the brief's requirement for more than</w:t>
+      </w:r>
+      <w:r>
+        <w:t xml:space="preserve"> </w:t>
+      </w:r>
+      <w:r>
+        <w:t>one mapped location. They do not correspond to real premises.</w:t>
+      </w:r>
+    </w:p>
+    <w:p>
+      <w:pPr>
+        <w:pStyle w:val="ListParagraph"/>
+        <w:numPr>
+          <w:ilvl w:val="0"/>
+          <w:numId w:val="4"/>
+        </w:numPr>
+        <w:jc w:val="both"/>
+      </w:pPr>
+      <w:r>
+        <w:t>Map images:  real map embeds are a Part 3 requirement (Integrate External</w:t>
+      </w:r>
+      <w:r>
+        <w:t xml:space="preserve"> </w:t>
+      </w:r>
+      <w:r>
+        <w:t>Services)</w:t>
+      </w:r>
+    </w:p>
+    <w:p>
+      <w:pPr>
+        <w:jc w:val="both"/>
+      </w:pPr>
+      <w:r>
+        <w:rPr>
+          <w:b/>
+          <w:bCs/>
+        </w:rPr>
+        <w:t>External sources actually used in Part 1</w:t>
+      </w:r>
+    </w:p>
+    <w:p>
+      <w:pPr>
+        <w:jc w:val="both"/>
+      </w:pPr>
+      <w:r>
+        <w:t>Only one external source has been used so far — the domain-registration pricing figure</w:t>
+      </w:r>
+    </w:p>
+    <w:p>
+      <w:pPr>
+        <w:jc w:val="both"/>
+      </w:pPr>
+      <w:r>
+        <w:t>in the Website Project Proposal's Budget section:</w:t>
+      </w:r>
+    </w:p>
+    <w:p>
+      <w:pPr>
+        <w:jc w:val="both"/>
+      </w:pPr>
+      <w:proofErr w:type="spellStart"/>
+      <w:r>
+        <w:t>xneelo</w:t>
+      </w:r>
+      <w:proofErr w:type="spellEnd"/>
+      <w:r>
+        <w:t>. 2026. Domain Name Search and Registration. [Online]. Available at:</w:t>
+      </w:r>
+    </w:p>
+    <w:p>
+      <w:pPr>
+        <w:jc w:val="both"/>
+      </w:pPr>
+      <w:hyperlink r:id="rId18" w:history="1">
+        <w:r>
+          <w:rPr>
+            <w:rStyle w:val="Hyperlink"/>
+          </w:rPr>
+          <w:t>https://xneelo.co.za/domains/</w:t>
+        </w:r>
+      </w:hyperlink>
+      <w:r>
+        <w:t xml:space="preserve"> </w:t>
+      </w:r>
+      <w:r>
+        <w:t xml:space="preserve"> [Accessed 11 August 2026].</w:t>
+      </w:r>
+    </w:p>
+    <w:p>
+      <w:hyperlink r:id="rId19" w:history="1">
+        <w:r>
+          <w:rPr>
+            <w:rStyle w:val="Hyperlink"/>
+          </w:rPr>
+          <w:t>https://www.w3schools.com/html/ht</w:t>
+        </w:r>
+        <w:r>
+          <w:rPr>
+            <w:rStyle w:val="Hyperlink"/>
+          </w:rPr>
+          <w:t>m</w:t>
+        </w:r>
+        <w:r>
+          <w:rPr>
+            <w:rStyle w:val="Hyperlink"/>
+          </w:rPr>
+          <w:t>l_formatting.asp</w:t>
+        </w:r>
+      </w:hyperlink>
+      <w:r>
+        <w:t xml:space="preserve"> (used for learning HTML) </w:t>
+      </w:r>
+    </w:p>
+    <w:p/>
+    <w:p/>
+    <w:p/>
+    <w:p>
+      <w:r>
+        <w:t>This is cited in-text in the proposal document and listed in full here and in the README,</w:t>
+      </w:r>
+    </w:p>
+    <w:p>
+      <w:r>
+        <w:t>per the brief's requirement that Part 1 references appear in both the proposal document and</w:t>
+      </w:r>
+    </w:p>
+    <w:p>
+      <w:r>
+        <w:t>README.md.</w:t>
+      </w:r>
+    </w:p>
+    <w:p/>
+    <w:p>
+      <w:r>
+        <w:t>No other external text, statistics, or claims have been used anywhere in the Part 1</w:t>
+      </w:r>
+    </w:p>
+    <w:p>
+      <w:r>
+        <w:t>content. Nothing has been copied from any website, textbook, or other student's work.</w:t>
+      </w:r>
+    </w:p>
+    <w:p/>
+    <w:p>
+      <w:pPr>
         <w:pStyle w:val="Caption"/>
         <w:rPr>
+          <w:rFonts w:ascii="Aptos" w:eastAsia="Times New Roman" w:hAnsi="Aptos" w:cs="Arial"/>
+          <w:b/>
+          <w:bCs/>
           <w:i w:val="0"/>
           <w:iCs w:val="0"/>
-          <w:sz w:val="20"/>
-          <w:szCs w:val="20"/>
-        </w:rPr>
-      </w:pPr>
+          <w:color w:val="1F1F1F"/>
+          <w:kern w:val="0"/>
+          <w:sz w:val="22"/>
+          <w:szCs w:val="22"/>
+          <w:bdr w:val="none" w:sz="0" w:space="0" w:color="auto" w:frame="1"/>
+          <w:lang w:eastAsia="en-ZA"/>
+          <w14:ligatures w14:val="none"/>
+        </w:rPr>
+      </w:pPr>
+      <w:r>
+        <w:rPr>
+          <w:rFonts w:ascii="Aptos" w:eastAsia="Times New Roman" w:hAnsi="Aptos" w:cs="Arial"/>
+          <w:b/>
+          <w:bCs/>
+          <w:i w:val="0"/>
+          <w:iCs w:val="0"/>
+          <w:color w:val="1F1F1F"/>
+          <w:kern w:val="0"/>
+          <w:sz w:val="22"/>
+          <w:szCs w:val="22"/>
+          <w:bdr w:val="none" w:sz="0" w:space="0" w:color="auto" w:frame="1"/>
+          <w:lang w:eastAsia="en-ZA"/>
+          <w14:ligatures w14:val="none"/>
+        </w:rPr>
+        <w:t>Sitemap:</w:t>
+      </w:r>
+    </w:p>
+    <w:p>
+      <w:pPr>
+        <w:rPr>
+          <w:lang w:eastAsia="en-ZA"/>
+        </w:rPr>
+      </w:pPr>
+      <w:r>
+        <w:rPr>
+          <w:noProof/>
+          <w:lang w:eastAsia="en-ZA"/>
+        </w:rPr>
+        <w:drawing>
+          <wp:inline distT="0" distB="0" distL="0" distR="0" wp14:anchorId="7A0514D4" wp14:editId="484548D9">
+            <wp:extent cx="5731510" cy="3825240"/>
+            <wp:effectExtent l="0" t="0" r="2540" b="3810"/>
+            <wp:docPr id="151706149" name="Picture 1"/>
+            <wp:cNvGraphicFramePr>
+              <a:graphicFrameLocks xmlns:a="http://schemas.openxmlformats.org/drawingml/2006/main" noChangeAspect="1"/>
+            </wp:cNvGraphicFramePr>
+            <a:graphic xmlns:a="http://schemas.openxmlformats.org/drawingml/2006/main">
+              <a:graphicData uri="http://schemas.openxmlformats.org/drawingml/2006/picture">
+                <pic:pic xmlns:pic="http://schemas.openxmlformats.org/drawingml/2006/picture">
+                  <pic:nvPicPr>
+                    <pic:cNvPr id="151706149" name="Picture 151706149"/>
+                    <pic:cNvPicPr/>
+                  </pic:nvPicPr>
+                  <pic:blipFill>
+                    <a:blip r:embed="rId20">
+                      <a:extLst>
+                        <a:ext uri="{28A0092B-C50C-407E-A947-70E740481C1C}">
+                          <a14:useLocalDpi xmlns:a14="http://schemas.microsoft.com/office/drawing/2010/main" val="0"/>
+                        </a:ext>
+                      </a:extLst>
+                    </a:blip>
+                    <a:stretch>
+                      <a:fillRect/>
+                    </a:stretch>
+                  </pic:blipFill>
+                  <pic:spPr>
+                    <a:xfrm>
+                      <a:off x="0" y="0"/>
+                      <a:ext cx="5731510" cy="3825240"/>
+                    </a:xfrm>
+                    <a:prstGeom prst="rect">
+                      <a:avLst/>
+                    </a:prstGeom>
+                  </pic:spPr>
+                </pic:pic>
+              </a:graphicData>
+            </a:graphic>
+          </wp:inline>
+        </w:drawing>
+      </w:r>
     </w:p>
     <w:sectPr>
       <w:pgSz w:w="11906" w:h="16838"/>
@@ -5243,6 +5744,119 @@
 <file path=word/numbering.xml><?xml version="1.0" encoding="utf-8"?>
 <w:numbering xmlns:wpc="http://schemas.microsoft.com/office/word/2010/wordprocessingCanvas" xmlns:cx="http://schemas.microsoft.com/office/drawing/2014/chartex" xmlns:cx1="http://schemas.microsoft.com/office/drawing/2015/9/8/chartex" xmlns:cx2="http://schemas.microsoft.com/office/drawing/2015/10/21/chartex" xmlns:cx3="http://schemas.microsoft.com/office/drawing/2016/5/9/chartex" xmlns:cx4="http://schemas.microsoft.com/office/drawing/2016/5/10/chartex" xmlns:cx5="http://schemas.microsoft.com/office/drawing/2016/5/11/chartex" xmlns:cx6="http://schemas.microsoft.com/office/drawing/2016/5/12/chartex" xmlns:cx7="http://schemas.microsoft.com/office/drawing/2016/5/13/chartex" xmlns:cx8="http://schemas.microsoft.com/office/drawing/2016/5/14/chartex" xmlns:mc="http://schemas.openxmlformats.org/markup-compatibility/2006" xmlns:aink="http://schemas.microsoft.com/office/drawing/2016/ink" xmlns:am3d="http://schemas.microsoft.com/office/drawing/2017/model3d" xmlns:o="urn:schemas-microsoft-com:office:office" xmlns:oel="http://schemas.microsoft.com/office/2019/extlst" xmlns:r="http://schemas.openxmlformats.org/officeDocument/2006/relationships" xmlns:m="http://schemas.openxmlformats.org/officeDocument/2006/math" xmlns:v="urn:schemas-microsoft-com:vml" xmlns:wp14="http://schemas.microsoft.com/office/word/2010/wordprocessingDrawing" xmlns:wp="http://schemas.openxmlformats.org/drawingml/2006/wordprocessingDrawing" xmlns:w10="urn:schemas-microsoft-com:office:word" xmlns:w="http://schemas.openxmlformats.org/wordprocessingml/2006/main" xmlns:w14="http://schemas.microsoft.com/office/word/2010/wordml" xmlns:w15="http://schemas.microsoft.com/office/word/2012/wordml" xmlns:w16cex="http://schemas.microsoft.com/office/word/2018/wordml/cex" xmlns:w16cid="http://schemas.microsoft.com/office/word/2016/wordml/cid" xmlns:w16="http://schemas.microsoft.com/office/word/2018/wordml" xmlns:w16du="http://schemas.microsoft.com/office/word/2023/wordml/word16du" xmlns:w16sdtdh="http://schemas.microsoft.com/office/word/2020/wordml/sdtdatahash" xmlns:w16sdtfl="http://schemas.microsoft.com/office/word/2024/wordml/sdtformatlock" xmlns:w16se="http://schemas.microsoft.com/office/word/2015/wordml/symex" xmlns:wpg="http://schemas.microsoft.com/office/word/2010/wordprocessingGroup" xmlns:wpi="http://schemas.microsoft.com/office/word/2010/wordprocessingInk" xmlns:wne="http://schemas.microsoft.com/office/word/2006/wordml" xmlns:wps="http://schemas.microsoft.com/office/word/2010/wordprocessingShape" mc:Ignorable="w14 w15 w16se w16cid w16 w16cex w16sdtdh w16sdtfl w16du wp14">
   <w:abstractNum w:abstractNumId="0" w15:restartNumberingAfterBreak="0">
+    <w:nsid w:val="2A5838F2"/>
+    <w:multiLevelType w:val="hybridMultilevel"/>
+    <w:tmpl w:val="9EB02D2A"/>
+    <w:lvl w:ilvl="0" w:tplc="1C090001">
+      <w:start w:val="1"/>
+      <w:numFmt w:val="bullet"/>
+      <w:lvlText w:val=""/>
+      <w:lvlJc w:val="left"/>
+      <w:pPr>
+        <w:ind w:left="720" w:hanging="360"/>
+      </w:pPr>
+      <w:rPr>
+        <w:rFonts w:ascii="Symbol" w:hAnsi="Symbol" w:hint="default"/>
+      </w:rPr>
+    </w:lvl>
+    <w:lvl w:ilvl="1" w:tplc="1C090003" w:tentative="1">
+      <w:start w:val="1"/>
+      <w:numFmt w:val="bullet"/>
+      <w:lvlText w:val="o"/>
+      <w:lvlJc w:val="left"/>
+      <w:pPr>
+        <w:ind w:left="1440" w:hanging="360"/>
+      </w:pPr>
+      <w:rPr>
+        <w:rFonts w:ascii="Courier New" w:hAnsi="Courier New" w:cs="Courier New" w:hint="default"/>
+      </w:rPr>
+    </w:lvl>
+    <w:lvl w:ilvl="2" w:tplc="1C090005" w:tentative="1">
+      <w:start w:val="1"/>
+      <w:numFmt w:val="bullet"/>
+      <w:lvlText w:val=""/>
+      <w:lvlJc w:val="left"/>
+      <w:pPr>
+        <w:ind w:left="2160" w:hanging="360"/>
+      </w:pPr>
+      <w:rPr>
+        <w:rFonts w:ascii="Wingdings" w:hAnsi="Wingdings" w:hint="default"/>
+      </w:rPr>
+    </w:lvl>
+    <w:lvl w:ilvl="3" w:tplc="1C090001" w:tentative="1">
+      <w:start w:val="1"/>
+      <w:numFmt w:val="bullet"/>
+      <w:lvlText w:val=""/>
+      <w:lvlJc w:val="left"/>
+      <w:pPr>
+        <w:ind w:left="2880" w:hanging="360"/>
+      </w:pPr>
+      <w:rPr>
+        <w:rFonts w:ascii="Symbol" w:hAnsi="Symbol" w:hint="default"/>
+      </w:rPr>
+    </w:lvl>
+    <w:lvl w:ilvl="4" w:tplc="1C090003" w:tentative="1">
+      <w:start w:val="1"/>
+      <w:numFmt w:val="bullet"/>
+      <w:lvlText w:val="o"/>
+      <w:lvlJc w:val="left"/>
+      <w:pPr>
+        <w:ind w:left="3600" w:hanging="360"/>
+      </w:pPr>
+      <w:rPr>
+        <w:rFonts w:ascii="Courier New" w:hAnsi="Courier New" w:cs="Courier New" w:hint="default"/>
+      </w:rPr>
+    </w:lvl>
+    <w:lvl w:ilvl="5" w:tplc="1C090005" w:tentative="1">
+      <w:start w:val="1"/>
+      <w:numFmt w:val="bullet"/>
+      <w:lvlText w:val=""/>
+      <w:lvlJc w:val="left"/>
+      <w:pPr>
+        <w:ind w:left="4320" w:hanging="360"/>
+      </w:pPr>
+      <w:rPr>
+        <w:rFonts w:ascii="Wingdings" w:hAnsi="Wingdings" w:hint="default"/>
+      </w:rPr>
+    </w:lvl>
+    <w:lvl w:ilvl="6" w:tplc="1C090001" w:tentative="1">
+      <w:start w:val="1"/>
+      <w:numFmt w:val="bullet"/>
+      <w:lvlText w:val=""/>
+      <w:lvlJc w:val="left"/>
+      <w:pPr>
+        <w:ind w:left="5040" w:hanging="360"/>
+      </w:pPr>
+      <w:rPr>
+        <w:rFonts w:ascii="Symbol" w:hAnsi="Symbol" w:hint="default"/>
+      </w:rPr>
+    </w:lvl>
+    <w:lvl w:ilvl="7" w:tplc="1C090003" w:tentative="1">
+      <w:start w:val="1"/>
+      <w:numFmt w:val="bullet"/>
+      <w:lvlText w:val="o"/>
+      <w:lvlJc w:val="left"/>
+      <w:pPr>
+        <w:ind w:left="5760" w:hanging="360"/>
+      </w:pPr>
+      <w:rPr>
+        <w:rFonts w:ascii="Courier New" w:hAnsi="Courier New" w:cs="Courier New" w:hint="default"/>
+      </w:rPr>
+    </w:lvl>
+    <w:lvl w:ilvl="8" w:tplc="1C090005" w:tentative="1">
+      <w:start w:val="1"/>
+      <w:numFmt w:val="bullet"/>
+      <w:lvlText w:val=""/>
+      <w:lvlJc w:val="left"/>
+      <w:pPr>
+        <w:ind w:left="6480" w:hanging="360"/>
+      </w:pPr>
+      <w:rPr>
+        <w:rFonts w:ascii="Wingdings" w:hAnsi="Wingdings" w:hint="default"/>
+      </w:rPr>
+    </w:lvl>
+  </w:abstractNum>
+  <w:abstractNum w:abstractNumId="1" w15:restartNumberingAfterBreak="0">
     <w:nsid w:val="6CE13B78"/>
     <w:multiLevelType w:val="hybridMultilevel"/>
     <w:tmpl w:val="6D70EBDE"/>
@@ -5296,7 +5910,7 @@
       <w:lvlJc w:val="left"/>
     </w:lvl>
   </w:abstractNum>
-  <w:abstractNum w:abstractNumId="1" w15:restartNumberingAfterBreak="0">
+  <w:abstractNum w:abstractNumId="2" w15:restartNumberingAfterBreak="0">
     <w:nsid w:val="738050E2"/>
     <w:multiLevelType w:val="hybridMultilevel"/>
     <w:tmpl w:val="4EFEBF62"/>
@@ -5350,17 +5964,136 @@
       <w:lvlJc w:val="left"/>
     </w:lvl>
   </w:abstractNum>
+  <w:abstractNum w:abstractNumId="3" w15:restartNumberingAfterBreak="0">
+    <w:nsid w:val="740F27EE"/>
+    <w:multiLevelType w:val="hybridMultilevel"/>
+    <w:tmpl w:val="447CC62C"/>
+    <w:lvl w:ilvl="0" w:tplc="1C090001">
+      <w:start w:val="1"/>
+      <w:numFmt w:val="bullet"/>
+      <w:lvlText w:val=""/>
+      <w:lvlJc w:val="left"/>
+      <w:pPr>
+        <w:ind w:left="720" w:hanging="360"/>
+      </w:pPr>
+      <w:rPr>
+        <w:rFonts w:ascii="Symbol" w:hAnsi="Symbol" w:hint="default"/>
+      </w:rPr>
+    </w:lvl>
+    <w:lvl w:ilvl="1" w:tplc="1C090003" w:tentative="1">
+      <w:start w:val="1"/>
+      <w:numFmt w:val="bullet"/>
+      <w:lvlText w:val="o"/>
+      <w:lvlJc w:val="left"/>
+      <w:pPr>
+        <w:ind w:left="1440" w:hanging="360"/>
+      </w:pPr>
+      <w:rPr>
+        <w:rFonts w:ascii="Courier New" w:hAnsi="Courier New" w:cs="Courier New" w:hint="default"/>
+      </w:rPr>
+    </w:lvl>
+    <w:lvl w:ilvl="2" w:tplc="1C090005" w:tentative="1">
+      <w:start w:val="1"/>
+      <w:numFmt w:val="bullet"/>
+      <w:lvlText w:val=""/>
+      <w:lvlJc w:val="left"/>
+      <w:pPr>
+        <w:ind w:left="2160" w:hanging="360"/>
+      </w:pPr>
+      <w:rPr>
+        <w:rFonts w:ascii="Wingdings" w:hAnsi="Wingdings" w:hint="default"/>
+      </w:rPr>
+    </w:lvl>
+    <w:lvl w:ilvl="3" w:tplc="1C090001" w:tentative="1">
+      <w:start w:val="1"/>
+      <w:numFmt w:val="bullet"/>
+      <w:lvlText w:val=""/>
+      <w:lvlJc w:val="left"/>
+      <w:pPr>
+        <w:ind w:left="2880" w:hanging="360"/>
+      </w:pPr>
+      <w:rPr>
+        <w:rFonts w:ascii="Symbol" w:hAnsi="Symbol" w:hint="default"/>
+      </w:rPr>
+    </w:lvl>
+    <w:lvl w:ilvl="4" w:tplc="1C090003" w:tentative="1">
+      <w:start w:val="1"/>
+      <w:numFmt w:val="bullet"/>
+      <w:lvlText w:val="o"/>
+      <w:lvlJc w:val="left"/>
+      <w:pPr>
+        <w:ind w:left="3600" w:hanging="360"/>
+      </w:pPr>
+      <w:rPr>
+        <w:rFonts w:ascii="Courier New" w:hAnsi="Courier New" w:cs="Courier New" w:hint="default"/>
+      </w:rPr>
+    </w:lvl>
+    <w:lvl w:ilvl="5" w:tplc="1C090005" w:tentative="1">
+      <w:start w:val="1"/>
+      <w:numFmt w:val="bullet"/>
+      <w:lvlText w:val=""/>
+      <w:lvlJc w:val="left"/>
+      <w:pPr>
+        <w:ind w:left="4320" w:hanging="360"/>
+      </w:pPr>
+      <w:rPr>
+        <w:rFonts w:ascii="Wingdings" w:hAnsi="Wingdings" w:hint="default"/>
+      </w:rPr>
+    </w:lvl>
+    <w:lvl w:ilvl="6" w:tplc="1C090001" w:tentative="1">
+      <w:start w:val="1"/>
+      <w:numFmt w:val="bullet"/>
+      <w:lvlText w:val=""/>
+      <w:lvlJc w:val="left"/>
+      <w:pPr>
+        <w:ind w:left="5040" w:hanging="360"/>
+      </w:pPr>
+      <w:rPr>
+        <w:rFonts w:ascii="Symbol" w:hAnsi="Symbol" w:hint="default"/>
+      </w:rPr>
+    </w:lvl>
+    <w:lvl w:ilvl="7" w:tplc="1C090003" w:tentative="1">
+      <w:start w:val="1"/>
+      <w:numFmt w:val="bullet"/>
+      <w:lvlText w:val="o"/>
+      <w:lvlJc w:val="left"/>
+      <w:pPr>
+        <w:ind w:left="5760" w:hanging="360"/>
+      </w:pPr>
+      <w:rPr>
+        <w:rFonts w:ascii="Courier New" w:hAnsi="Courier New" w:cs="Courier New" w:hint="default"/>
+      </w:rPr>
+    </w:lvl>
+    <w:lvl w:ilvl="8" w:tplc="1C090005" w:tentative="1">
+      <w:start w:val="1"/>
+      <w:numFmt w:val="bullet"/>
+      <w:lvlText w:val=""/>
+      <w:lvlJc w:val="left"/>
+      <w:pPr>
+        <w:ind w:left="6480" w:hanging="360"/>
+      </w:pPr>
+      <w:rPr>
+        <w:rFonts w:ascii="Wingdings" w:hAnsi="Wingdings" w:hint="default"/>
+      </w:rPr>
+    </w:lvl>
+  </w:abstractNum>
   <w:num w:numId="1" w16cid:durableId="1646860371">
-    <w:abstractNumId w:val="0"/>
+    <w:abstractNumId w:val="1"/>
     <w:lvlOverride w:ilvl="0">
       <w:startOverride w:val="1"/>
     </w:lvlOverride>
   </w:num>
   <w:num w:numId="2" w16cid:durableId="238562914">
-    <w:abstractNumId w:val="1"/>
+    <w:abstractNumId w:val="2"/>
     <w:lvlOverride w:ilvl="0">
       <w:startOverride w:val="1"/>
     </w:lvlOverride>
+  </w:num>
+  <w:num w:numId="3" w16cid:durableId="1187863700">
+    <w:abstractNumId w:val="3"/>
+  </w:num>
+  <w:num w:numId="4" w16cid:durableId="818114558">
+    <w:abstractNumId w:val="0"/>
   </w:num>
 </w:numbering>
 </file>

</xml_diff>

<commit_message>
Add README and CHANGELOG files; document content sourcing for website project
</commit_message>
<xml_diff>
--- a/Web Development (WEDE5112) POE.docx
+++ b/Web Development (WEDE5112) POE.docx
@@ -2222,25 +2222,7 @@
           <w:sz w:val="22"/>
           <w:szCs w:val="22"/>
         </w:rPr>
-        <w:t xml:space="preserve">As a newly proposed organisation, Paw Haven has no existing website; there are no legacy strengths or weaknesses to analyse. This is treated as a greenfield build. The gap </w:t>
-      </w:r>
-      <w:proofErr w:type="gramStart"/>
-      <w:r>
-        <w:rPr>
-          <w:rFonts w:ascii="Aptos" w:eastAsia="Aptos" w:hAnsi="Aptos" w:cs="Aptos"/>
-          <w:sz w:val="22"/>
-          <w:szCs w:val="22"/>
-        </w:rPr>
-        <w:t>this fills</w:t>
-      </w:r>
-      <w:proofErr w:type="gramEnd"/>
-      <w:r>
-        <w:rPr>
-          <w:rFonts w:ascii="Aptos" w:eastAsia="Aptos" w:hAnsi="Aptos" w:cs="Aptos"/>
-          <w:sz w:val="22"/>
-          <w:szCs w:val="22"/>
-        </w:rPr>
-        <w:t xml:space="preserve"> is specific: smaller NPO shelters in the area typically rely only on a Facebook page, which cannot support a structured adoption enquiry with volunteer/sponsor options</w:t>
+        <w:t>As a newly proposed organisation, Paw Haven has no existing website; there are no legacy strengths or weaknesses to analyse. This is treated as a greenfield build. The gap this fills is specific: smaller NPO shelters in the area typically rely only on a Facebook page, which cannot support a structured adoption enquiry with volunteer/sponsor options</w:t>
       </w:r>
       <w:r>
         <w:rPr>
@@ -3666,16 +3648,51 @@
           <w:sz w:val="22"/>
           <w:szCs w:val="22"/>
         </w:rPr>
-        <w:t>created the wire</w:t>
-      </w:r>
-      <w:r>
-        <w:rPr>
-          <w:rFonts w:ascii="Aptos" w:eastAsia="Aptos" w:hAnsi="Aptos" w:cs="Aptos"/>
-          <w:sz w:val="22"/>
-          <w:szCs w:val="22"/>
-        </w:rPr>
-        <w:t>frames)</w:t>
-      </w:r>
+        <w:t>created the wireframes) &amp;</w:t>
+      </w:r>
+      <w:r>
+        <w:t xml:space="preserve"> </w:t>
+      </w:r>
+      <w:hyperlink r:id="rId12" w:history="1">
+        <w:r>
+          <w:rPr>
+            <w:rStyle w:val="Hyperlink"/>
+            <w:rFonts w:ascii="Aptos" w:eastAsia="Aptos" w:hAnsi="Aptos" w:cs="Aptos"/>
+            <w:sz w:val="22"/>
+            <w:szCs w:val="22"/>
+          </w:rPr>
+          <w:t>https://ww</w:t>
+        </w:r>
+        <w:r>
+          <w:rPr>
+            <w:rStyle w:val="Hyperlink"/>
+            <w:rFonts w:ascii="Aptos" w:eastAsia="Aptos" w:hAnsi="Aptos" w:cs="Aptos"/>
+            <w:sz w:val="22"/>
+            <w:szCs w:val="22"/>
+          </w:rPr>
+          <w:t>w</w:t>
+        </w:r>
+        <w:r>
+          <w:rPr>
+            <w:rStyle w:val="Hyperlink"/>
+            <w:rFonts w:ascii="Aptos" w:eastAsia="Aptos" w:hAnsi="Aptos" w:cs="Aptos"/>
+            <w:sz w:val="22"/>
+            <w:szCs w:val="22"/>
+          </w:rPr>
+          <w:t>.drawio.com/</w:t>
+        </w:r>
+      </w:hyperlink>
+    </w:p>
+    <w:p>
+      <w:pPr>
+        <w:spacing w:line="360" w:lineRule="auto"/>
+        <w:jc w:val="both"/>
+        <w:rPr>
+          <w:rFonts w:ascii="Aptos" w:eastAsia="Aptos" w:hAnsi="Aptos" w:cs="Aptos"/>
+          <w:sz w:val="22"/>
+          <w:szCs w:val="22"/>
+        </w:rPr>
+      </w:pPr>
     </w:p>
     <w:p/>
     <w:p>
@@ -4024,25 +4041,7 @@
           <w:sz w:val="22"/>
           <w:szCs w:val="22"/>
         </w:rPr>
-        <w:t xml:space="preserve">Kelder &amp; Vine is proposed as a new business with no existing website; this project establishes its first web presence rather than redesigning an existing one. The gap </w:t>
-      </w:r>
-      <w:proofErr w:type="gramStart"/>
-      <w:r>
-        <w:rPr>
-          <w:rFonts w:ascii="Aptos" w:eastAsia="Aptos" w:hAnsi="Aptos" w:cs="Aptos"/>
-          <w:sz w:val="22"/>
-          <w:szCs w:val="22"/>
-        </w:rPr>
-        <w:t>this fills</w:t>
-      </w:r>
-      <w:proofErr w:type="gramEnd"/>
-      <w:r>
-        <w:rPr>
-          <w:rFonts w:ascii="Aptos" w:eastAsia="Aptos" w:hAnsi="Aptos" w:cs="Aptos"/>
-          <w:sz w:val="22"/>
-          <w:szCs w:val="22"/>
-        </w:rPr>
-        <w:t xml:space="preserve"> is specific: independent Stellenbosch wine-and-deli sellers without a site rely on passing foot traffic alone, missing tourists who plan visits online before arriving — a dedicated site captures that pre-visit search.</w:t>
+        <w:t>Kelder &amp; Vine is proposed as a new business with no existing website; this project establishes its first web presence rather than redesigning an existing one. The gap this fills is specific: independent Stellenbosch wine-and-deli sellers without a site rely on passing foot traffic alone, missing tourists who plan visits online before arriving — a dedicated site captures that pre-visit search.</w:t>
       </w:r>
     </w:p>
     <w:p>
@@ -4308,129 +4307,6 @@
             <wp:extent cx="5105400" cy="3822700"/>
             <wp:effectExtent l="0" t="0" r="0" b="6350"/>
             <wp:docPr id="76964292" name="Picture 76964292"/>
-            <wp:cNvGraphicFramePr>
-              <a:graphicFrameLocks xmlns:a="http://schemas.openxmlformats.org/drawingml/2006/main" noChangeAspect="1"/>
-            </wp:cNvGraphicFramePr>
-            <a:graphic xmlns:a="http://schemas.openxmlformats.org/drawingml/2006/main">
-              <a:graphicData uri="http://schemas.openxmlformats.org/drawingml/2006/picture">
-                <pic:pic xmlns:pic="http://schemas.openxmlformats.org/drawingml/2006/picture">
-                  <pic:nvPicPr>
-                    <pic:cNvPr id="0" name=""/>
-                    <pic:cNvPicPr>
-                      <a:picLocks noChangeAspect="1" noChangeArrowheads="1"/>
-                    </pic:cNvPicPr>
-                  </pic:nvPicPr>
-                  <pic:blipFill>
-                    <a:blip r:embed="rId12"/>
-                    <a:srcRect/>
-                    <a:stretch>
-                      <a:fillRect/>
-                    </a:stretch>
-                  </pic:blipFill>
-                  <pic:spPr bwMode="auto">
-                    <a:xfrm>
-                      <a:off x="0" y="0"/>
-                      <a:ext cx="5105400" cy="3822700"/>
-                    </a:xfrm>
-                    <a:prstGeom prst="rect">
-                      <a:avLst/>
-                    </a:prstGeom>
-                  </pic:spPr>
-                </pic:pic>
-              </a:graphicData>
-            </a:graphic>
-          </wp:inline>
-        </w:drawing>
-      </w:r>
-    </w:p>
-    <w:p>
-      <w:pPr>
-        <w:pStyle w:val="Caption"/>
-        <w:rPr>
-          <w:sz w:val="20"/>
-          <w:szCs w:val="20"/>
-        </w:rPr>
-      </w:pPr>
-      <w:r>
-        <w:rPr>
-          <w:sz w:val="20"/>
-          <w:szCs w:val="20"/>
-        </w:rPr>
-        <w:t xml:space="preserve">Figure </w:t>
-      </w:r>
-      <w:r>
-        <w:rPr>
-          <w:sz w:val="20"/>
-          <w:szCs w:val="20"/>
-        </w:rPr>
-        <w:fldChar w:fldCharType="begin"/>
-      </w:r>
-      <w:r>
-        <w:rPr>
-          <w:sz w:val="20"/>
-          <w:szCs w:val="20"/>
-        </w:rPr>
-        <w:instrText xml:space="preserve"> SEQ Figure \* ARABIC </w:instrText>
-      </w:r>
-      <w:r>
-        <w:rPr>
-          <w:sz w:val="20"/>
-          <w:szCs w:val="20"/>
-        </w:rPr>
-        <w:fldChar w:fldCharType="separate"/>
-      </w:r>
-      <w:r>
-        <w:rPr>
-          <w:noProof/>
-          <w:sz w:val="20"/>
-          <w:szCs w:val="20"/>
-        </w:rPr>
-        <w:t>6</w:t>
-      </w:r>
-      <w:r>
-        <w:rPr>
-          <w:sz w:val="20"/>
-          <w:szCs w:val="20"/>
-        </w:rPr>
-        <w:fldChar w:fldCharType="end"/>
-      </w:r>
-      <w:r>
-        <w:rPr>
-          <w:sz w:val="20"/>
-          <w:szCs w:val="20"/>
-        </w:rPr>
-        <w:t>: Home page wireframe — Kelder &amp; Vine. [Personal drawing].</w:t>
-      </w:r>
-    </w:p>
-    <w:p>
-      <w:pPr>
-        <w:spacing w:line="360" w:lineRule="auto"/>
-      </w:pPr>
-      <w:r>
-        <w:rPr>
-          <w:rFonts w:ascii="Aptos" w:eastAsia="Aptos" w:hAnsi="Aptos" w:cs="Aptos"/>
-          <w:b/>
-          <w:bCs/>
-          <w:sz w:val="22"/>
-          <w:szCs w:val="22"/>
-        </w:rPr>
-        <w:lastRenderedPageBreak/>
-        <w:t>About page</w:t>
-      </w:r>
-    </w:p>
-    <w:p>
-      <w:pPr>
-        <w:keepNext/>
-      </w:pPr>
-      <w:r>
-        <w:rPr>
-          <w:noProof/>
-        </w:rPr>
-        <w:drawing>
-          <wp:inline distT="0" distB="0" distL="0" distR="0" wp14:anchorId="47B10325" wp14:editId="61049098">
-            <wp:extent cx="5480050" cy="7727950"/>
-            <wp:effectExtent l="0" t="0" r="6350" b="6350"/>
-            <wp:docPr id="985062277" name="Picture 985062277"/>
             <wp:cNvGraphicFramePr>
               <a:graphicFrameLocks xmlns:a="http://schemas.openxmlformats.org/drawingml/2006/main" noChangeAspect="1"/>
             </wp:cNvGraphicFramePr>
@@ -4453,7 +4329,7 @@
                   <pic:spPr bwMode="auto">
                     <a:xfrm>
                       <a:off x="0" y="0"/>
-                      <a:ext cx="5480050" cy="7727950"/>
+                      <a:ext cx="5105400" cy="3822700"/>
                     </a:xfrm>
                     <a:prstGeom prst="rect">
                       <a:avLst/>
@@ -4508,7 +4384,7 @@
           <w:sz w:val="20"/>
           <w:szCs w:val="20"/>
         </w:rPr>
-        <w:t>7</w:t>
+        <w:t>6</w:t>
       </w:r>
       <w:r>
         <w:rPr>
@@ -4522,12 +4398,7 @@
           <w:sz w:val="20"/>
           <w:szCs w:val="20"/>
         </w:rPr>
-        <w:t>: About page wireframe — Kelder &amp; Vine. [Personal drawing].</w:t>
-      </w:r>
-    </w:p>
-    <w:p>
-      <w:r>
-        <w:br w:type="page"/>
+        <w:t>: Home page wireframe — Kelder &amp; Vine. [Personal drawing].</w:t>
       </w:r>
     </w:p>
     <w:p>
@@ -4543,7 +4414,7 @@
           <w:szCs w:val="22"/>
         </w:rPr>
         <w:lastRenderedPageBreak/>
-        <w:t>Products page</w:t>
+        <w:t>About page</w:t>
       </w:r>
     </w:p>
     <w:p>
@@ -4555,10 +4426,10 @@
           <w:noProof/>
         </w:rPr>
         <w:drawing>
-          <wp:inline distT="0" distB="0" distL="0" distR="0" wp14:anchorId="560F1C77" wp14:editId="6553FFE0">
-            <wp:extent cx="5638800" cy="7607300"/>
-            <wp:effectExtent l="0" t="0" r="0" b="0"/>
-            <wp:docPr id="1298478895" name="Picture 1298478895"/>
+          <wp:inline distT="0" distB="0" distL="0" distR="0" wp14:anchorId="47B10325" wp14:editId="61049098">
+            <wp:extent cx="5480050" cy="7727950"/>
+            <wp:effectExtent l="0" t="0" r="6350" b="6350"/>
+            <wp:docPr id="985062277" name="Picture 985062277"/>
             <wp:cNvGraphicFramePr>
               <a:graphicFrameLocks xmlns:a="http://schemas.openxmlformats.org/drawingml/2006/main" noChangeAspect="1"/>
             </wp:cNvGraphicFramePr>
@@ -4581,7 +4452,7 @@
                   <pic:spPr bwMode="auto">
                     <a:xfrm>
                       <a:off x="0" y="0"/>
-                      <a:ext cx="5638800" cy="7607300"/>
+                      <a:ext cx="5480050" cy="7727950"/>
                     </a:xfrm>
                     <a:prstGeom prst="rect">
                       <a:avLst/>
@@ -4636,7 +4507,7 @@
           <w:sz w:val="20"/>
           <w:szCs w:val="20"/>
         </w:rPr>
-        <w:t>8</w:t>
+        <w:t>7</w:t>
       </w:r>
       <w:r>
         <w:rPr>
@@ -4650,24 +4521,11 @@
           <w:sz w:val="20"/>
           <w:szCs w:val="20"/>
         </w:rPr>
-        <w:t>: Products page wireframe — Kelder &amp; Vine. [Personal drawing].</w:t>
-      </w:r>
-    </w:p>
-    <w:p>
-      <w:pPr>
-        <w:rPr>
-          <w:i/>
-          <w:iCs/>
-          <w:color w:val="44546A" w:themeColor="text2"/>
-          <w:sz w:val="20"/>
-          <w:szCs w:val="20"/>
-        </w:rPr>
-      </w:pPr>
-      <w:r>
-        <w:rPr>
-          <w:sz w:val="20"/>
-          <w:szCs w:val="20"/>
-        </w:rPr>
+        <w:t>: About page wireframe — Kelder &amp; Vine. [Personal drawing].</w:t>
+      </w:r>
+    </w:p>
+    <w:p>
+      <w:r>
         <w:br w:type="page"/>
       </w:r>
     </w:p>
@@ -4684,12 +4542,11 @@
           <w:szCs w:val="22"/>
         </w:rPr>
         <w:lastRenderedPageBreak/>
-        <w:t>Enquiry page</w:t>
-      </w:r>
-    </w:p>
-    <w:p>
-      <w:pPr>
-        <w:pStyle w:val="Caption"/>
+        <w:t>Products page</w:t>
+      </w:r>
+    </w:p>
+    <w:p>
+      <w:pPr>
         <w:keepNext/>
       </w:pPr>
       <w:r>
@@ -4697,10 +4554,10 @@
           <w:noProof/>
         </w:rPr>
         <w:drawing>
-          <wp:inline distT="0" distB="0" distL="0" distR="0" wp14:anchorId="121001F5" wp14:editId="1CC252D6">
-            <wp:extent cx="5448300" cy="7423150"/>
-            <wp:effectExtent l="0" t="0" r="0" b="6350"/>
-            <wp:docPr id="1460658215" name="Picture 1460658215"/>
+          <wp:inline distT="0" distB="0" distL="0" distR="0" wp14:anchorId="560F1C77" wp14:editId="6553FFE0">
+            <wp:extent cx="5638800" cy="7607300"/>
+            <wp:effectExtent l="0" t="0" r="0" b="0"/>
+            <wp:docPr id="1298478895" name="Picture 1298478895"/>
             <wp:cNvGraphicFramePr>
               <a:graphicFrameLocks xmlns:a="http://schemas.openxmlformats.org/drawingml/2006/main" noChangeAspect="1"/>
             </wp:cNvGraphicFramePr>
@@ -4723,7 +4580,7 @@
                   <pic:spPr bwMode="auto">
                     <a:xfrm>
                       <a:off x="0" y="0"/>
-                      <a:ext cx="5448300" cy="7423150"/>
+                      <a:ext cx="5638800" cy="7607300"/>
                     </a:xfrm>
                     <a:prstGeom prst="rect">
                       <a:avLst/>
@@ -4778,7 +4635,7 @@
           <w:sz w:val="20"/>
           <w:szCs w:val="20"/>
         </w:rPr>
-        <w:t>9</w:t>
+        <w:t>8</w:t>
       </w:r>
       <w:r>
         <w:rPr>
@@ -4792,7 +4649,7 @@
           <w:sz w:val="20"/>
           <w:szCs w:val="20"/>
         </w:rPr>
-        <w:t>: Enquiry page wireframe — Kelder &amp; Vine. [Personal drawing].</w:t>
+        <w:t>: Products page wireframe — Kelder &amp; Vine. [Personal drawing].</w:t>
       </w:r>
     </w:p>
     <w:p>
@@ -4826,28 +4683,23 @@
           <w:szCs w:val="22"/>
         </w:rPr>
         <w:lastRenderedPageBreak/>
-        <w:t>Contact page</w:t>
-      </w:r>
-    </w:p>
-    <w:p>
-      <w:pPr>
+        <w:t>Enquiry page</w:t>
+      </w:r>
+    </w:p>
+    <w:p>
+      <w:pPr>
+        <w:pStyle w:val="Caption"/>
         <w:keepNext/>
-        <w:rPr>
-          <w:sz w:val="28"/>
-          <w:szCs w:val="28"/>
-        </w:rPr>
       </w:pPr>
       <w:r>
         <w:rPr>
           <w:noProof/>
-          <w:sz w:val="28"/>
-          <w:szCs w:val="28"/>
         </w:rPr>
         <w:drawing>
-          <wp:inline distT="0" distB="0" distL="0" distR="0" wp14:anchorId="2C88CDEF" wp14:editId="2462F53A">
-            <wp:extent cx="5200650" cy="8108950"/>
+          <wp:inline distT="0" distB="0" distL="0" distR="0" wp14:anchorId="121001F5" wp14:editId="1CC252D6">
+            <wp:extent cx="5448300" cy="7423150"/>
             <wp:effectExtent l="0" t="0" r="0" b="6350"/>
-            <wp:docPr id="1919793741" name="Picture 1919793741"/>
+            <wp:docPr id="1460658215" name="Picture 1460658215"/>
             <wp:cNvGraphicFramePr>
               <a:graphicFrameLocks xmlns:a="http://schemas.openxmlformats.org/drawingml/2006/main" noChangeAspect="1"/>
             </wp:cNvGraphicFramePr>
@@ -4870,6 +4722,153 @@
                   <pic:spPr bwMode="auto">
                     <a:xfrm>
                       <a:off x="0" y="0"/>
+                      <a:ext cx="5448300" cy="7423150"/>
+                    </a:xfrm>
+                    <a:prstGeom prst="rect">
+                      <a:avLst/>
+                    </a:prstGeom>
+                  </pic:spPr>
+                </pic:pic>
+              </a:graphicData>
+            </a:graphic>
+          </wp:inline>
+        </w:drawing>
+      </w:r>
+    </w:p>
+    <w:p>
+      <w:pPr>
+        <w:pStyle w:val="Caption"/>
+        <w:rPr>
+          <w:sz w:val="20"/>
+          <w:szCs w:val="20"/>
+        </w:rPr>
+      </w:pPr>
+      <w:r>
+        <w:rPr>
+          <w:sz w:val="20"/>
+          <w:szCs w:val="20"/>
+        </w:rPr>
+        <w:t xml:space="preserve">Figure </w:t>
+      </w:r>
+      <w:r>
+        <w:rPr>
+          <w:sz w:val="20"/>
+          <w:szCs w:val="20"/>
+        </w:rPr>
+        <w:fldChar w:fldCharType="begin"/>
+      </w:r>
+      <w:r>
+        <w:rPr>
+          <w:sz w:val="20"/>
+          <w:szCs w:val="20"/>
+        </w:rPr>
+        <w:instrText xml:space="preserve"> SEQ Figure \* ARABIC </w:instrText>
+      </w:r>
+      <w:r>
+        <w:rPr>
+          <w:sz w:val="20"/>
+          <w:szCs w:val="20"/>
+        </w:rPr>
+        <w:fldChar w:fldCharType="separate"/>
+      </w:r>
+      <w:r>
+        <w:rPr>
+          <w:noProof/>
+          <w:sz w:val="20"/>
+          <w:szCs w:val="20"/>
+        </w:rPr>
+        <w:t>9</w:t>
+      </w:r>
+      <w:r>
+        <w:rPr>
+          <w:sz w:val="20"/>
+          <w:szCs w:val="20"/>
+        </w:rPr>
+        <w:fldChar w:fldCharType="end"/>
+      </w:r>
+      <w:r>
+        <w:rPr>
+          <w:sz w:val="20"/>
+          <w:szCs w:val="20"/>
+        </w:rPr>
+        <w:t>: Enquiry page wireframe — Kelder &amp; Vine. [Personal drawing].</w:t>
+      </w:r>
+    </w:p>
+    <w:p>
+      <w:pPr>
+        <w:rPr>
+          <w:i/>
+          <w:iCs/>
+          <w:color w:val="44546A" w:themeColor="text2"/>
+          <w:sz w:val="20"/>
+          <w:szCs w:val="20"/>
+        </w:rPr>
+      </w:pPr>
+      <w:r>
+        <w:rPr>
+          <w:sz w:val="20"/>
+          <w:szCs w:val="20"/>
+        </w:rPr>
+        <w:br w:type="page"/>
+      </w:r>
+    </w:p>
+    <w:p>
+      <w:pPr>
+        <w:spacing w:line="360" w:lineRule="auto"/>
+      </w:pPr>
+      <w:r>
+        <w:rPr>
+          <w:rFonts w:ascii="Aptos" w:eastAsia="Aptos" w:hAnsi="Aptos" w:cs="Aptos"/>
+          <w:b/>
+          <w:bCs/>
+          <w:sz w:val="22"/>
+          <w:szCs w:val="22"/>
+        </w:rPr>
+        <w:lastRenderedPageBreak/>
+        <w:t>Contact page</w:t>
+      </w:r>
+    </w:p>
+    <w:p>
+      <w:pPr>
+        <w:keepNext/>
+        <w:rPr>
+          <w:sz w:val="28"/>
+          <w:szCs w:val="28"/>
+        </w:rPr>
+      </w:pPr>
+      <w:r>
+        <w:rPr>
+          <w:noProof/>
+          <w:sz w:val="28"/>
+          <w:szCs w:val="28"/>
+        </w:rPr>
+        <w:drawing>
+          <wp:inline distT="0" distB="0" distL="0" distR="0" wp14:anchorId="2C88CDEF" wp14:editId="2462F53A">
+            <wp:extent cx="5200650" cy="8108950"/>
+            <wp:effectExtent l="0" t="0" r="0" b="6350"/>
+            <wp:docPr id="1919793741" name="Picture 1919793741"/>
+            <wp:cNvGraphicFramePr>
+              <a:graphicFrameLocks xmlns:a="http://schemas.openxmlformats.org/drawingml/2006/main" noChangeAspect="1"/>
+            </wp:cNvGraphicFramePr>
+            <a:graphic xmlns:a="http://schemas.openxmlformats.org/drawingml/2006/main">
+              <a:graphicData uri="http://schemas.openxmlformats.org/drawingml/2006/picture">
+                <pic:pic xmlns:pic="http://schemas.openxmlformats.org/drawingml/2006/picture">
+                  <pic:nvPicPr>
+                    <pic:cNvPr id="0" name=""/>
+                    <pic:cNvPicPr>
+                      <a:picLocks noChangeAspect="1" noChangeArrowheads="1"/>
+                    </pic:cNvPicPr>
+                  </pic:nvPicPr>
+                  <pic:blipFill>
+                    <a:blip r:embed="rId17"/>
+                    <a:srcRect/>
+                    <a:stretch>
+                      <a:fillRect/>
+                    </a:stretch>
+                  </pic:blipFill>
+                  <pic:spPr bwMode="auto">
+                    <a:xfrm>
+                      <a:off x="0" y="0"/>
                       <a:ext cx="5200650" cy="8108950"/>
                     </a:xfrm>
                     <a:prstGeom prst="rect">
@@ -5155,7 +5154,7 @@
       <w:pPr>
         <w:spacing w:line="360" w:lineRule="auto"/>
       </w:pPr>
-      <w:hyperlink r:id="rId17" w:history="1">
+      <w:hyperlink r:id="rId18" w:history="1">
         <w:r>
           <w:rPr>
             <w:rStyle w:val="Hyperlink"/>
@@ -5231,6 +5230,55 @@
       </w:r>
       <w:r>
         <w:rPr>
+          <w:rFonts w:ascii="Aptos" w:eastAsia="Aptos" w:hAnsi="Aptos" w:cs="Aptos"/>
+          <w:sz w:val="22"/>
+          <w:szCs w:val="22"/>
+        </w:rPr>
+        <w:t xml:space="preserve"> </w:t>
+      </w:r>
+      <w:r>
+        <w:rPr>
+          <w:rFonts w:ascii="Aptos" w:eastAsia="Aptos" w:hAnsi="Aptos" w:cs="Aptos"/>
+          <w:sz w:val="22"/>
+          <w:szCs w:val="22"/>
+        </w:rPr>
+        <w:t>&amp;</w:t>
+      </w:r>
+      <w:r>
+        <w:t xml:space="preserve"> </w:t>
+      </w:r>
+      <w:hyperlink r:id="rId19" w:history="1">
+        <w:r>
+          <w:rPr>
+            <w:rStyle w:val="Hyperlink"/>
+            <w:rFonts w:ascii="Aptos" w:eastAsia="Aptos" w:hAnsi="Aptos" w:cs="Aptos"/>
+            <w:sz w:val="22"/>
+            <w:szCs w:val="22"/>
+          </w:rPr>
+          <w:t>https://www.drawio.com/</w:t>
+        </w:r>
+      </w:hyperlink>
+      <w:r>
+        <w:rPr>
+          <w:rFonts w:ascii="Aptos" w:eastAsia="Aptos" w:hAnsi="Aptos" w:cs="Aptos"/>
+          <w:sz w:val="22"/>
+          <w:szCs w:val="22"/>
+        </w:rPr>
+        <w:t xml:space="preserve"> </w:t>
+      </w:r>
+    </w:p>
+    <w:p>
+      <w:pPr>
+        <w:spacing w:line="360" w:lineRule="auto"/>
+        <w:jc w:val="both"/>
+        <w:rPr>
+          <w:rFonts w:ascii="Aptos" w:eastAsia="Aptos" w:hAnsi="Aptos" w:cs="Aptos"/>
+          <w:sz w:val="22"/>
+          <w:szCs w:val="22"/>
+        </w:rPr>
+      </w:pPr>
+      <w:r>
+        <w:rPr>
           <w:sz w:val="20"/>
           <w:szCs w:val="20"/>
         </w:rPr>
@@ -5345,13 +5393,8 @@
         <w:jc w:val="both"/>
       </w:pPr>
       <w:r>
-        <w:t xml:space="preserve">All text is original content written for this fictional organisation. No citation </w:t>
-      </w:r>
-      <w:proofErr w:type="gramStart"/>
-      <w:r>
-        <w:t>required..</w:t>
-      </w:r>
-      <w:proofErr w:type="gramEnd"/>
+        <w:t>All text is original content written for this fictional organisation. No citation required..</w:t>
+      </w:r>
     </w:p>
     <w:p>
       <w:pPr>
@@ -5571,7 +5614,7 @@
       <w:pPr>
         <w:jc w:val="both"/>
       </w:pPr>
-      <w:hyperlink r:id="rId18" w:history="1">
+      <w:hyperlink r:id="rId20" w:history="1">
         <w:r>
           <w:rPr>
             <w:rStyle w:val="Hyperlink"/>
@@ -5587,7 +5630,7 @@
       </w:r>
     </w:p>
     <w:p>
-      <w:hyperlink r:id="rId19" w:history="1">
+      <w:hyperlink r:id="rId21" w:history="1">
         <w:r>
           <w:rPr>
             <w:rStyle w:val="Hyperlink"/>
@@ -5611,6 +5654,33 @@
         <w:t xml:space="preserve"> (used for learning HTML) </w:t>
       </w:r>
     </w:p>
+    <w:p>
+      <w:r>
+        <w:lastRenderedPageBreak/>
+        <w:t xml:space="preserve">Microsoft, 2026. </w:t>
+      </w:r>
+      <w:r>
+        <w:rPr>
+          <w:i/>
+          <w:iCs/>
+        </w:rPr>
+        <w:t>Microsoft Word (</w:t>
+      </w:r>
+      <w:r>
+        <w:t xml:space="preserve">created the wireframes) &amp; </w:t>
+      </w:r>
+      <w:hyperlink r:id="rId22" w:history="1">
+        <w:r>
+          <w:rPr>
+            <w:rStyle w:val="Hyperlink"/>
+          </w:rPr>
+          <w:t>https://www.drawio.com/</w:t>
+        </w:r>
+      </w:hyperlink>
+      <w:r>
+        <w:t xml:space="preserve"> </w:t>
+      </w:r>
+    </w:p>
     <w:p/>
     <w:p/>
     <w:p/>
@@ -5704,7 +5774,7 @@
                     <pic:cNvPicPr/>
                   </pic:nvPicPr>
                   <pic:blipFill>
-                    <a:blip r:embed="rId20">
+                    <a:blip r:embed="rId23">
                       <a:extLst>
                         <a:ext uri="{28A0092B-C50C-407E-A947-70E740481C1C}">
                           <a14:useLocalDpi xmlns:a14="http://schemas.microsoft.com/office/drawing/2010/main" val="0"/>

</xml_diff>

<commit_message>
Update document title and formatting for website project proposals
</commit_message>
<xml_diff>
--- a/Web Development (WEDE5112) POE.docx
+++ b/Web Development (WEDE5112) POE.docx
@@ -3,24 +3,102 @@
 <w:document xmlns:wpc="http://schemas.microsoft.com/office/word/2010/wordprocessingCanvas" xmlns:cx="http://schemas.microsoft.com/office/drawing/2014/chartex" xmlns:cx1="http://schemas.microsoft.com/office/drawing/2015/9/8/chartex" xmlns:cx2="http://schemas.microsoft.com/office/drawing/2015/10/21/chartex" xmlns:cx3="http://schemas.microsoft.com/office/drawing/2016/5/9/chartex" xmlns:cx4="http://schemas.microsoft.com/office/drawing/2016/5/10/chartex" xmlns:cx5="http://schemas.microsoft.com/office/drawing/2016/5/11/chartex" xmlns:cx6="http://schemas.microsoft.com/office/drawing/2016/5/12/chartex" xmlns:cx7="http://schemas.microsoft.com/office/drawing/2016/5/13/chartex" xmlns:cx8="http://schemas.microsoft.com/office/drawing/2016/5/14/chartex" xmlns:mc="http://schemas.openxmlformats.org/markup-compatibility/2006" xmlns:aink="http://schemas.microsoft.com/office/drawing/2016/ink" xmlns:am3d="http://schemas.microsoft.com/office/drawing/2017/model3d" xmlns:o="urn:schemas-microsoft-com:office:office" xmlns:oel="http://schemas.microsoft.com/office/2019/extlst" xmlns:r="http://schemas.openxmlformats.org/officeDocument/2006/relationships" xmlns:m="http://schemas.openxmlformats.org/officeDocument/2006/math" xmlns:v="urn:schemas-microsoft-com:vml" xmlns:wp14="http://schemas.microsoft.com/office/word/2010/wordprocessingDrawing" xmlns:wp="http://schemas.openxmlformats.org/drawingml/2006/wordprocessingDrawing" xmlns:w10="urn:schemas-microsoft-com:office:word" xmlns:w="http://schemas.openxmlformats.org/wordprocessingml/2006/main" xmlns:w14="http://schemas.microsoft.com/office/word/2010/wordml" xmlns:w15="http://schemas.microsoft.com/office/word/2012/wordml" xmlns:w16cex="http://schemas.microsoft.com/office/word/2018/wordml/cex" xmlns:w16cid="http://schemas.microsoft.com/office/word/2016/wordml/cid" xmlns:w16="http://schemas.microsoft.com/office/word/2018/wordml" xmlns:w16du="http://schemas.microsoft.com/office/word/2023/wordml/word16du" xmlns:w16sdtdh="http://schemas.microsoft.com/office/word/2020/wordml/sdtdatahash" xmlns:w16sdtfl="http://schemas.microsoft.com/office/word/2024/wordml/sdtformatlock" xmlns:w16se="http://schemas.microsoft.com/office/word/2015/wordml/symex" xmlns:wpg="http://schemas.microsoft.com/office/word/2010/wordprocessingGroup" xmlns:wpi="http://schemas.microsoft.com/office/word/2010/wordprocessingInk" xmlns:wne="http://schemas.microsoft.com/office/word/2006/wordml" xmlns:wps="http://schemas.microsoft.com/office/word/2010/wordprocessingShape" mc:Ignorable="w14 w15 w16se w16cid w16 w16cex w16sdtdh w16sdtfl w16du wp14">
   <w:body>
     <w:p>
-      <w:r>
-        <w:t xml:space="preserve">Donald Mudzani </w:t>
-      </w:r>
-    </w:p>
-    <w:p>
-      <w:r>
-        <w:t>ST10512213</w:t>
-      </w:r>
-    </w:p>
-    <w:p>
-      <w:r>
-        <w:t>WEDE5112</w:t>
-      </w:r>
-    </w:p>
-    <w:p>
-      <w:r>
-        <w:t xml:space="preserve">POE </w:t>
-      </w:r>
+      <w:pPr>
+        <w:spacing w:before="1600"/>
+        <w:jc w:val="center"/>
+      </w:pPr>
+      <w:r>
+        <w:rPr>
+          <w:rFonts w:ascii="Aptos" w:eastAsia="Aptos" w:hAnsi="Aptos" w:cs="Aptos"/>
+          <w:b/>
+          <w:bCs/>
+          <w:sz w:val="32"/>
+          <w:szCs w:val="32"/>
+        </w:rPr>
+        <w:t>WEB DEVELOPMENT (INTRODUCTION)</w:t>
+      </w:r>
+    </w:p>
+    <w:p>
+      <w:pPr>
+        <w:spacing w:after="400"/>
+        <w:jc w:val="center"/>
+      </w:pPr>
+      <w:r>
+        <w:rPr>
+          <w:rFonts w:ascii="Aptos" w:eastAsia="Aptos" w:hAnsi="Aptos" w:cs="Aptos"/>
+          <w:b/>
+          <w:bCs/>
+          <w:sz w:val="26"/>
+          <w:szCs w:val="26"/>
+        </w:rPr>
+        <w:t>WED5112POE</w:t>
+      </w:r>
+    </w:p>
+    <w:p>
+      <w:pPr>
+        <w:spacing w:before="800"/>
+        <w:jc w:val="center"/>
+      </w:pPr>
+      <w:r>
+        <w:rPr>
+          <w:rFonts w:ascii="Aptos" w:eastAsia="Aptos" w:hAnsi="Aptos" w:cs="Aptos"/>
+          <w:b/>
+          <w:bCs/>
+          <w:sz w:val="28"/>
+          <w:szCs w:val="28"/>
+        </w:rPr>
+        <w:t>Part 1: Website Project Proposals</w:t>
+      </w:r>
+    </w:p>
+    <w:p>
+      <w:pPr>
+        <w:spacing w:before="1200"/>
+        <w:jc w:val="center"/>
+      </w:pPr>
+      <w:proofErr w:type="spellStart"/>
+      <w:r>
+        <w:rPr>
+          <w:rFonts w:ascii="Aptos" w:eastAsia="Aptos" w:hAnsi="Aptos" w:cs="Aptos"/>
+          <w:sz w:val="22"/>
+          <w:szCs w:val="22"/>
+        </w:rPr>
+        <w:t>Donald</w:t>
+      </w:r>
+      <w:r>
+        <w:rPr>
+          <w:rFonts w:ascii="Aptos" w:eastAsia="Aptos" w:hAnsi="Aptos" w:cs="Aptos"/>
+          <w:sz w:val="22"/>
+          <w:szCs w:val="22"/>
+        </w:rPr>
+        <w:t>n</w:t>
+      </w:r>
+      <w:proofErr w:type="spellEnd"/>
+      <w:r>
+        <w:rPr>
+          <w:rFonts w:ascii="Aptos" w:eastAsia="Aptos" w:hAnsi="Aptos" w:cs="Aptos"/>
+          <w:sz w:val="22"/>
+          <w:szCs w:val="22"/>
+        </w:rPr>
+        <w:t xml:space="preserve"> Mduzani</w:t>
+      </w:r>
+    </w:p>
+    <w:p>
+      <w:pPr>
+        <w:jc w:val="center"/>
+      </w:pPr>
+      <w:r>
+        <w:rPr>
+          <w:rFonts w:ascii="Aptos" w:eastAsia="Aptos" w:hAnsi="Aptos" w:cs="Aptos"/>
+          <w:sz w:val="22"/>
+          <w:szCs w:val="22"/>
+        </w:rPr>
+        <w:t>Student Number: ST10512213</w:t>
+      </w:r>
+    </w:p>
+    <w:p>
+      <w:pPr>
+        <w:jc w:val="center"/>
+      </w:pPr>
     </w:p>
     <w:p>
       <w:r>
@@ -2222,7 +2300,25 @@
           <w:sz w:val="22"/>
           <w:szCs w:val="22"/>
         </w:rPr>
-        <w:t>As a newly proposed organisation, Paw Haven has no existing website; there are no legacy strengths or weaknesses to analyse. This is treated as a greenfield build. The gap this fills is specific: smaller NPO shelters in the area typically rely only on a Facebook page, which cannot support a structured adoption enquiry with volunteer/sponsor options</w:t>
+        <w:t xml:space="preserve">As a newly proposed organisation, Paw Haven has no existing website; there are no legacy strengths or weaknesses to analyse. This is treated as a greenfield build. The gap </w:t>
+      </w:r>
+      <w:proofErr w:type="gramStart"/>
+      <w:r>
+        <w:rPr>
+          <w:rFonts w:ascii="Aptos" w:eastAsia="Aptos" w:hAnsi="Aptos" w:cs="Aptos"/>
+          <w:sz w:val="22"/>
+          <w:szCs w:val="22"/>
+        </w:rPr>
+        <w:t>this fills</w:t>
+      </w:r>
+      <w:proofErr w:type="gramEnd"/>
+      <w:r>
+        <w:rPr>
+          <w:rFonts w:ascii="Aptos" w:eastAsia="Aptos" w:hAnsi="Aptos" w:cs="Aptos"/>
+          <w:sz w:val="22"/>
+          <w:szCs w:val="22"/>
+        </w:rPr>
+        <w:t xml:space="preserve"> is specific: smaller NPO shelters in the area typically rely only on a Facebook page, which cannot support a structured adoption enquiry with volunteer/sponsor options</w:t>
       </w:r>
       <w:r>
         <w:rPr>
@@ -4041,7 +4137,25 @@
           <w:sz w:val="22"/>
           <w:szCs w:val="22"/>
         </w:rPr>
-        <w:t>Kelder &amp; Vine is proposed as a new business with no existing website; this project establishes its first web presence rather than redesigning an existing one. The gap this fills is specific: independent Stellenbosch wine-and-deli sellers without a site rely on passing foot traffic alone, missing tourists who plan visits online before arriving — a dedicated site captures that pre-visit search.</w:t>
+        <w:t xml:space="preserve">Kelder &amp; Vine is proposed as a new business with no existing website; this project establishes its first web presence rather than redesigning an existing one. The gap </w:t>
+      </w:r>
+      <w:proofErr w:type="gramStart"/>
+      <w:r>
+        <w:rPr>
+          <w:rFonts w:ascii="Aptos" w:eastAsia="Aptos" w:hAnsi="Aptos" w:cs="Aptos"/>
+          <w:sz w:val="22"/>
+          <w:szCs w:val="22"/>
+        </w:rPr>
+        <w:t>this fills</w:t>
+      </w:r>
+      <w:proofErr w:type="gramEnd"/>
+      <w:r>
+        <w:rPr>
+          <w:rFonts w:ascii="Aptos" w:eastAsia="Aptos" w:hAnsi="Aptos" w:cs="Aptos"/>
+          <w:sz w:val="22"/>
+          <w:szCs w:val="22"/>
+        </w:rPr>
+        <w:t xml:space="preserve"> is specific: independent Stellenbosch wine-and-deli sellers without a site rely on passing foot traffic alone, missing tourists who plan visits online before arriving — a dedicated site captures that pre-visit search.</w:t>
       </w:r>
     </w:p>
     <w:p>
@@ -5393,8 +5507,13 @@
         <w:jc w:val="both"/>
       </w:pPr>
       <w:r>
-        <w:t>All text is original content written for this fictional organisation. No citation required..</w:t>
-      </w:r>
+        <w:t xml:space="preserve">All text is original content written for this fictional organisation. No citation </w:t>
+      </w:r>
+      <w:proofErr w:type="gramStart"/>
+      <w:r>
+        <w:t>required..</w:t>
+      </w:r>
+      <w:proofErr w:type="gramEnd"/>
     </w:p>
     <w:p>
       <w:pPr>

</xml_diff>

<commit_message>
Add GitHub link to project documentation
</commit_message>
<xml_diff>
--- a/Web Development (WEDE5112) POE.docx
+++ b/Web Development (WEDE5112) POE.docx
@@ -55,7 +55,6 @@
         <w:spacing w:before="1200"/>
         <w:jc w:val="center"/>
       </w:pPr>
-      <w:proofErr w:type="spellStart"/>
       <w:r>
         <w:rPr>
           <w:rFonts w:ascii="Aptos" w:eastAsia="Aptos" w:hAnsi="Aptos" w:cs="Aptos"/>
@@ -70,16 +69,7 @@
           <w:sz w:val="22"/>
           <w:szCs w:val="22"/>
         </w:rPr>
-        <w:t>n</w:t>
-      </w:r>
-      <w:proofErr w:type="spellEnd"/>
-      <w:r>
-        <w:rPr>
-          <w:rFonts w:ascii="Aptos" w:eastAsia="Aptos" w:hAnsi="Aptos" w:cs="Aptos"/>
-          <w:sz w:val="22"/>
-          <w:szCs w:val="22"/>
-        </w:rPr>
-        <w:t xml:space="preserve"> Mduzani</w:t>
+        <w:t>n Mduzani</w:t>
       </w:r>
     </w:p>
     <w:p>
@@ -2300,25 +2290,7 @@
           <w:sz w:val="22"/>
           <w:szCs w:val="22"/>
         </w:rPr>
-        <w:t xml:space="preserve">As a newly proposed organisation, Paw Haven has no existing website; there are no legacy strengths or weaknesses to analyse. This is treated as a greenfield build. The gap </w:t>
-      </w:r>
-      <w:proofErr w:type="gramStart"/>
-      <w:r>
-        <w:rPr>
-          <w:rFonts w:ascii="Aptos" w:eastAsia="Aptos" w:hAnsi="Aptos" w:cs="Aptos"/>
-          <w:sz w:val="22"/>
-          <w:szCs w:val="22"/>
-        </w:rPr>
-        <w:t>this fills</w:t>
-      </w:r>
-      <w:proofErr w:type="gramEnd"/>
-      <w:r>
-        <w:rPr>
-          <w:rFonts w:ascii="Aptos" w:eastAsia="Aptos" w:hAnsi="Aptos" w:cs="Aptos"/>
-          <w:sz w:val="22"/>
-          <w:szCs w:val="22"/>
-        </w:rPr>
-        <w:t xml:space="preserve"> is specific: smaller NPO shelters in the area typically rely only on a Facebook page, which cannot support a structured adoption enquiry with volunteer/sponsor options</w:t>
+        <w:t>As a newly proposed organisation, Paw Haven has no existing website; there are no legacy strengths or weaknesses to analyse. This is treated as a greenfield build. The gap this fills is specific: smaller NPO shelters in the area typically rely only on a Facebook page, which cannot support a structured adoption enquiry with volunteer/sponsor options</w:t>
       </w:r>
       <w:r>
         <w:rPr>
@@ -2732,342 +2704,6 @@
             <wp:extent cx="5316220" cy="5930900"/>
             <wp:effectExtent l="0" t="0" r="0" b="0"/>
             <wp:docPr id="1" name="Picture 1"/>
-            <wp:cNvGraphicFramePr>
-              <a:graphicFrameLocks xmlns:a="http://schemas.openxmlformats.org/drawingml/2006/main" noChangeAspect="1"/>
-            </wp:cNvGraphicFramePr>
-            <a:graphic xmlns:a="http://schemas.openxmlformats.org/drawingml/2006/main">
-              <a:graphicData uri="http://schemas.openxmlformats.org/drawingml/2006/picture">
-                <pic:pic xmlns:pic="http://schemas.openxmlformats.org/drawingml/2006/picture">
-                  <pic:nvPicPr>
-                    <pic:cNvPr id="0" name=""/>
-                    <pic:cNvPicPr>
-                      <a:picLocks noChangeAspect="1" noChangeArrowheads="1"/>
-                    </pic:cNvPicPr>
-                  </pic:nvPicPr>
-                  <pic:blipFill>
-                    <a:blip r:embed="rId6"/>
-                    <a:srcRect/>
-                    <a:stretch>
-                      <a:fillRect/>
-                    </a:stretch>
-                  </pic:blipFill>
-                  <pic:spPr bwMode="auto">
-                    <a:xfrm>
-                      <a:off x="0" y="0"/>
-                      <a:ext cx="5321297" cy="5936564"/>
-                    </a:xfrm>
-                    <a:prstGeom prst="rect">
-                      <a:avLst/>
-                    </a:prstGeom>
-                  </pic:spPr>
-                </pic:pic>
-              </a:graphicData>
-            </a:graphic>
-          </wp:inline>
-        </w:drawing>
-      </w:r>
-    </w:p>
-    <w:p>
-      <w:pPr>
-        <w:pStyle w:val="Caption"/>
-        <w:jc w:val="both"/>
-        <w:rPr>
-          <w:sz w:val="20"/>
-          <w:szCs w:val="20"/>
-        </w:rPr>
-      </w:pPr>
-      <w:r>
-        <w:rPr>
-          <w:sz w:val="20"/>
-          <w:szCs w:val="20"/>
-        </w:rPr>
-        <w:t xml:space="preserve">Figure </w:t>
-      </w:r>
-      <w:r>
-        <w:rPr>
-          <w:sz w:val="20"/>
-          <w:szCs w:val="20"/>
-        </w:rPr>
-        <w:fldChar w:fldCharType="begin"/>
-      </w:r>
-      <w:r>
-        <w:rPr>
-          <w:sz w:val="20"/>
-          <w:szCs w:val="20"/>
-        </w:rPr>
-        <w:instrText xml:space="preserve"> SEQ Figure \* ARABIC </w:instrText>
-      </w:r>
-      <w:r>
-        <w:rPr>
-          <w:sz w:val="20"/>
-          <w:szCs w:val="20"/>
-        </w:rPr>
-        <w:fldChar w:fldCharType="separate"/>
-      </w:r>
-      <w:r>
-        <w:rPr>
-          <w:noProof/>
-          <w:sz w:val="20"/>
-          <w:szCs w:val="20"/>
-        </w:rPr>
-        <w:t>1</w:t>
-      </w:r>
-      <w:r>
-        <w:rPr>
-          <w:sz w:val="20"/>
-          <w:szCs w:val="20"/>
-        </w:rPr>
-        <w:fldChar w:fldCharType="end"/>
-      </w:r>
-      <w:r>
-        <w:rPr>
-          <w:sz w:val="20"/>
-          <w:szCs w:val="20"/>
-        </w:rPr>
-        <w:t>: Home page wireframe — Paw Haven Animal Rescue. [Personal drawing].</w:t>
-      </w:r>
-    </w:p>
-    <w:p>
-      <w:pPr>
-        <w:spacing w:line="360" w:lineRule="auto"/>
-        <w:jc w:val="both"/>
-        <w:rPr>
-          <w:rFonts w:ascii="Aptos" w:eastAsia="Aptos" w:hAnsi="Aptos" w:cs="Aptos"/>
-          <w:b/>
-          <w:bCs/>
-          <w:sz w:val="22"/>
-          <w:szCs w:val="22"/>
-        </w:rPr>
-      </w:pPr>
-    </w:p>
-    <w:p>
-      <w:pPr>
-        <w:spacing w:line="360" w:lineRule="auto"/>
-        <w:jc w:val="both"/>
-        <w:rPr>
-          <w:rFonts w:ascii="Aptos" w:eastAsia="Aptos" w:hAnsi="Aptos" w:cs="Aptos"/>
-          <w:b/>
-          <w:bCs/>
-          <w:sz w:val="22"/>
-          <w:szCs w:val="22"/>
-        </w:rPr>
-      </w:pPr>
-    </w:p>
-    <w:p>
-      <w:pPr>
-        <w:spacing w:line="360" w:lineRule="auto"/>
-        <w:jc w:val="both"/>
-        <w:rPr>
-          <w:rFonts w:ascii="Aptos" w:eastAsia="Aptos" w:hAnsi="Aptos" w:cs="Aptos"/>
-          <w:b/>
-          <w:bCs/>
-          <w:sz w:val="22"/>
-          <w:szCs w:val="22"/>
-        </w:rPr>
-      </w:pPr>
-    </w:p>
-    <w:p>
-      <w:pPr>
-        <w:spacing w:line="360" w:lineRule="auto"/>
-        <w:jc w:val="both"/>
-        <w:rPr>
-          <w:rFonts w:ascii="Aptos" w:eastAsia="Aptos" w:hAnsi="Aptos" w:cs="Aptos"/>
-          <w:b/>
-          <w:bCs/>
-          <w:sz w:val="22"/>
-          <w:szCs w:val="22"/>
-        </w:rPr>
-      </w:pPr>
-    </w:p>
-    <w:p>
-      <w:pPr>
-        <w:spacing w:line="360" w:lineRule="auto"/>
-        <w:jc w:val="both"/>
-        <w:rPr>
-          <w:rFonts w:ascii="Aptos" w:eastAsia="Aptos" w:hAnsi="Aptos" w:cs="Aptos"/>
-          <w:b/>
-          <w:bCs/>
-          <w:sz w:val="22"/>
-          <w:szCs w:val="22"/>
-        </w:rPr>
-      </w:pPr>
-    </w:p>
-    <w:p>
-      <w:pPr>
-        <w:spacing w:line="360" w:lineRule="auto"/>
-        <w:jc w:val="both"/>
-        <w:rPr>
-          <w:rFonts w:ascii="Aptos" w:eastAsia="Aptos" w:hAnsi="Aptos" w:cs="Aptos"/>
-          <w:b/>
-          <w:bCs/>
-          <w:sz w:val="22"/>
-          <w:szCs w:val="22"/>
-        </w:rPr>
-      </w:pPr>
-    </w:p>
-    <w:p>
-      <w:pPr>
-        <w:spacing w:line="360" w:lineRule="auto"/>
-        <w:jc w:val="both"/>
-      </w:pPr>
-      <w:r>
-        <w:rPr>
-          <w:b/>
-          <w:bCs/>
-        </w:rPr>
-        <w:lastRenderedPageBreak/>
-        <w:t>About page</w:t>
-      </w:r>
-    </w:p>
-    <w:p>
-      <w:pPr>
-        <w:keepNext/>
-        <w:jc w:val="both"/>
-      </w:pPr>
-      <w:r>
-        <w:rPr>
-          <w:noProof/>
-        </w:rPr>
-        <w:drawing>
-          <wp:inline distT="0" distB="0" distL="0" distR="0" wp14:anchorId="52823F87" wp14:editId="7BAB0879">
-            <wp:extent cx="5448300" cy="5613400"/>
-            <wp:effectExtent l="0" t="0" r="0" b="6350"/>
-            <wp:docPr id="1119100588" name="Picture 1119100588"/>
-            <wp:cNvGraphicFramePr>
-              <a:graphicFrameLocks xmlns:a="http://schemas.openxmlformats.org/drawingml/2006/main" noChangeAspect="1"/>
-            </wp:cNvGraphicFramePr>
-            <a:graphic xmlns:a="http://schemas.openxmlformats.org/drawingml/2006/main">
-              <a:graphicData uri="http://schemas.openxmlformats.org/drawingml/2006/picture">
-                <pic:pic xmlns:pic="http://schemas.openxmlformats.org/drawingml/2006/picture">
-                  <pic:nvPicPr>
-                    <pic:cNvPr id="0" name=""/>
-                    <pic:cNvPicPr>
-                      <a:picLocks noChangeAspect="1" noChangeArrowheads="1"/>
-                    </pic:cNvPicPr>
-                  </pic:nvPicPr>
-                  <pic:blipFill>
-                    <a:blip r:embed="rId7"/>
-                    <a:srcRect/>
-                    <a:stretch>
-                      <a:fillRect/>
-                    </a:stretch>
-                  </pic:blipFill>
-                  <pic:spPr bwMode="auto">
-                    <a:xfrm>
-                      <a:off x="0" y="0"/>
-                      <a:ext cx="5448300" cy="5613400"/>
-                    </a:xfrm>
-                    <a:prstGeom prst="rect">
-                      <a:avLst/>
-                    </a:prstGeom>
-                  </pic:spPr>
-                </pic:pic>
-              </a:graphicData>
-            </a:graphic>
-          </wp:inline>
-        </w:drawing>
-      </w:r>
-    </w:p>
-    <w:p>
-      <w:pPr>
-        <w:pStyle w:val="Caption"/>
-        <w:jc w:val="both"/>
-        <w:rPr>
-          <w:sz w:val="20"/>
-          <w:szCs w:val="20"/>
-        </w:rPr>
-      </w:pPr>
-      <w:r>
-        <w:rPr>
-          <w:sz w:val="20"/>
-          <w:szCs w:val="20"/>
-        </w:rPr>
-        <w:t xml:space="preserve">Figure </w:t>
-      </w:r>
-      <w:r>
-        <w:rPr>
-          <w:sz w:val="20"/>
-          <w:szCs w:val="20"/>
-        </w:rPr>
-        <w:fldChar w:fldCharType="begin"/>
-      </w:r>
-      <w:r>
-        <w:rPr>
-          <w:sz w:val="20"/>
-          <w:szCs w:val="20"/>
-        </w:rPr>
-        <w:instrText xml:space="preserve"> SEQ Figure \* ARABIC </w:instrText>
-      </w:r>
-      <w:r>
-        <w:rPr>
-          <w:sz w:val="20"/>
-          <w:szCs w:val="20"/>
-        </w:rPr>
-        <w:fldChar w:fldCharType="separate"/>
-      </w:r>
-      <w:r>
-        <w:rPr>
-          <w:noProof/>
-          <w:sz w:val="20"/>
-          <w:szCs w:val="20"/>
-        </w:rPr>
-        <w:t>2</w:t>
-      </w:r>
-      <w:r>
-        <w:rPr>
-          <w:sz w:val="20"/>
-          <w:szCs w:val="20"/>
-        </w:rPr>
-        <w:fldChar w:fldCharType="end"/>
-      </w:r>
-      <w:r>
-        <w:rPr>
-          <w:sz w:val="20"/>
-          <w:szCs w:val="20"/>
-        </w:rPr>
-        <w:t>: About page wireframe — Paw Haven Animal Rescue. [Personal drawing].</w:t>
-      </w:r>
-    </w:p>
-    <w:p>
-      <w:pPr>
-        <w:jc w:val="both"/>
-      </w:pPr>
-      <w:r>
-        <w:br w:type="page"/>
-      </w:r>
-    </w:p>
-    <w:p>
-      <w:pPr>
-        <w:spacing w:line="360" w:lineRule="auto"/>
-        <w:jc w:val="both"/>
-      </w:pPr>
-      <w:r>
-        <w:rPr>
-          <w:rFonts w:ascii="Aptos" w:eastAsia="Aptos" w:hAnsi="Aptos" w:cs="Aptos"/>
-          <w:b/>
-          <w:bCs/>
-          <w:sz w:val="22"/>
-          <w:szCs w:val="22"/>
-        </w:rPr>
-        <w:lastRenderedPageBreak/>
-        <w:t>Adopt page</w:t>
-      </w:r>
-    </w:p>
-    <w:p>
-      <w:pPr>
-        <w:keepNext/>
-        <w:spacing w:line="360" w:lineRule="auto"/>
-        <w:jc w:val="both"/>
-      </w:pPr>
-      <w:r>
-        <w:rPr>
-          <w:noProof/>
-        </w:rPr>
-        <w:drawing>
-          <wp:inline distT="0" distB="0" distL="0" distR="0" wp14:anchorId="37714DD6" wp14:editId="2CAA2B9D">
-            <wp:extent cx="5270500" cy="6429375"/>
-            <wp:effectExtent l="0" t="0" r="6350" b="9525"/>
-            <wp:docPr id="206511752" name="Picture 206511752"/>
             <wp:cNvGraphicFramePr>
               <a:graphicFrameLocks xmlns:a="http://schemas.openxmlformats.org/drawingml/2006/main" noChangeAspect="1"/>
             </wp:cNvGraphicFramePr>
@@ -3090,7 +2726,7 @@
                   <pic:spPr bwMode="auto">
                     <a:xfrm>
                       <a:off x="0" y="0"/>
-                      <a:ext cx="5270500" cy="6429375"/>
+                      <a:ext cx="5321297" cy="5936564"/>
                     </a:xfrm>
                     <a:prstGeom prst="rect">
                       <a:avLst/>
@@ -3146,7 +2782,7 @@
           <w:sz w:val="20"/>
           <w:szCs w:val="20"/>
         </w:rPr>
-        <w:t>3</w:t>
+        <w:t>1</w:t>
       </w:r>
       <w:r>
         <w:rPr>
@@ -3160,23 +2796,13 @@
           <w:sz w:val="20"/>
           <w:szCs w:val="20"/>
         </w:rPr>
-        <w:t>: Adopt page wireframe — Paw Haven Animal Rescue. [Personal drawing].</w:t>
-      </w:r>
-    </w:p>
-    <w:p>
-      <w:pPr>
-        <w:jc w:val="both"/>
-      </w:pPr>
-      <w:r>
-        <w:br w:type="page"/>
+        <w:t>: Home page wireframe — Paw Haven Animal Rescue. [Personal drawing].</w:t>
       </w:r>
     </w:p>
     <w:p>
       <w:pPr>
         <w:spacing w:line="360" w:lineRule="auto"/>
         <w:jc w:val="both"/>
-      </w:pPr>
-      <w:r>
         <w:rPr>
           <w:rFonts w:ascii="Aptos" w:eastAsia="Aptos" w:hAnsi="Aptos" w:cs="Aptos"/>
           <w:b/>
@@ -3184,8 +2810,85 @@
           <w:sz w:val="22"/>
           <w:szCs w:val="22"/>
         </w:rPr>
+      </w:pPr>
+    </w:p>
+    <w:p>
+      <w:pPr>
+        <w:spacing w:line="360" w:lineRule="auto"/>
+        <w:jc w:val="both"/>
+        <w:rPr>
+          <w:rFonts w:ascii="Aptos" w:eastAsia="Aptos" w:hAnsi="Aptos" w:cs="Aptos"/>
+          <w:b/>
+          <w:bCs/>
+          <w:sz w:val="22"/>
+          <w:szCs w:val="22"/>
+        </w:rPr>
+      </w:pPr>
+    </w:p>
+    <w:p>
+      <w:pPr>
+        <w:spacing w:line="360" w:lineRule="auto"/>
+        <w:jc w:val="both"/>
+        <w:rPr>
+          <w:rFonts w:ascii="Aptos" w:eastAsia="Aptos" w:hAnsi="Aptos" w:cs="Aptos"/>
+          <w:b/>
+          <w:bCs/>
+          <w:sz w:val="22"/>
+          <w:szCs w:val="22"/>
+        </w:rPr>
+      </w:pPr>
+    </w:p>
+    <w:p>
+      <w:pPr>
+        <w:spacing w:line="360" w:lineRule="auto"/>
+        <w:jc w:val="both"/>
+        <w:rPr>
+          <w:rFonts w:ascii="Aptos" w:eastAsia="Aptos" w:hAnsi="Aptos" w:cs="Aptos"/>
+          <w:b/>
+          <w:bCs/>
+          <w:sz w:val="22"/>
+          <w:szCs w:val="22"/>
+        </w:rPr>
+      </w:pPr>
+    </w:p>
+    <w:p>
+      <w:pPr>
+        <w:spacing w:line="360" w:lineRule="auto"/>
+        <w:jc w:val="both"/>
+        <w:rPr>
+          <w:rFonts w:ascii="Aptos" w:eastAsia="Aptos" w:hAnsi="Aptos" w:cs="Aptos"/>
+          <w:b/>
+          <w:bCs/>
+          <w:sz w:val="22"/>
+          <w:szCs w:val="22"/>
+        </w:rPr>
+      </w:pPr>
+    </w:p>
+    <w:p>
+      <w:pPr>
+        <w:spacing w:line="360" w:lineRule="auto"/>
+        <w:jc w:val="both"/>
+        <w:rPr>
+          <w:rFonts w:ascii="Aptos" w:eastAsia="Aptos" w:hAnsi="Aptos" w:cs="Aptos"/>
+          <w:b/>
+          <w:bCs/>
+          <w:sz w:val="22"/>
+          <w:szCs w:val="22"/>
+        </w:rPr>
+      </w:pPr>
+    </w:p>
+    <w:p>
+      <w:pPr>
+        <w:spacing w:line="360" w:lineRule="auto"/>
+        <w:jc w:val="both"/>
+      </w:pPr>
+      <w:r>
+        <w:rPr>
+          <w:b/>
+          <w:bCs/>
+        </w:rPr>
         <w:lastRenderedPageBreak/>
-        <w:t>Enquiry page</w:t>
+        <w:t>About page</w:t>
       </w:r>
     </w:p>
     <w:p>
@@ -3198,10 +2901,10 @@
           <w:noProof/>
         </w:rPr>
         <w:drawing>
-          <wp:inline distT="0" distB="0" distL="0" distR="0" wp14:anchorId="0AC7156D" wp14:editId="28A2C819">
-            <wp:extent cx="5245100" cy="7048500"/>
-            <wp:effectExtent l="0" t="0" r="0" b="0"/>
-            <wp:docPr id="500522745" name="Picture 500522745"/>
+          <wp:inline distT="0" distB="0" distL="0" distR="0" wp14:anchorId="52823F87" wp14:editId="7BAB0879">
+            <wp:extent cx="5448300" cy="5613400"/>
+            <wp:effectExtent l="0" t="0" r="0" b="6350"/>
+            <wp:docPr id="1119100588" name="Picture 1119100588"/>
             <wp:cNvGraphicFramePr>
               <a:graphicFrameLocks xmlns:a="http://schemas.openxmlformats.org/drawingml/2006/main" noChangeAspect="1"/>
             </wp:cNvGraphicFramePr>
@@ -3224,7 +2927,7 @@
                   <pic:spPr bwMode="auto">
                     <a:xfrm>
                       <a:off x="0" y="0"/>
-                      <a:ext cx="5245100" cy="7048500"/>
+                      <a:ext cx="5448300" cy="5613400"/>
                     </a:xfrm>
                     <a:prstGeom prst="rect">
                       <a:avLst/>
@@ -3280,7 +2983,7 @@
           <w:sz w:val="20"/>
           <w:szCs w:val="20"/>
         </w:rPr>
-        <w:t>4</w:t>
+        <w:t>2</w:t>
       </w:r>
       <w:r>
         <w:rPr>
@@ -3294,7 +2997,7 @@
           <w:sz w:val="20"/>
           <w:szCs w:val="20"/>
         </w:rPr>
-        <w:t>: Enquiry page wireframe — Paw Haven Animal Rescue. [Personal drawing].</w:t>
+        <w:t>: About page wireframe — Paw Haven Animal Rescue. [Personal drawing].</w:t>
       </w:r>
     </w:p>
     <w:p>
@@ -3319,12 +3022,13 @@
           <w:szCs w:val="22"/>
         </w:rPr>
         <w:lastRenderedPageBreak/>
-        <w:t>Contact page</w:t>
+        <w:t>Adopt page</w:t>
       </w:r>
     </w:p>
     <w:p>
       <w:pPr>
         <w:keepNext/>
+        <w:spacing w:line="360" w:lineRule="auto"/>
         <w:jc w:val="both"/>
       </w:pPr>
       <w:r>
@@ -3332,10 +3036,10 @@
           <w:noProof/>
         </w:rPr>
         <w:drawing>
-          <wp:inline distT="0" distB="0" distL="0" distR="0" wp14:anchorId="14E75C29" wp14:editId="0AC74D5E">
-            <wp:extent cx="4572000" cy="6429375"/>
-            <wp:effectExtent l="0" t="0" r="0" b="0"/>
-            <wp:docPr id="1151776030" name="Picture 1151776030"/>
+          <wp:inline distT="0" distB="0" distL="0" distR="0" wp14:anchorId="37714DD6" wp14:editId="2CAA2B9D">
+            <wp:extent cx="5270500" cy="6429375"/>
+            <wp:effectExtent l="0" t="0" r="6350" b="9525"/>
+            <wp:docPr id="206511752" name="Picture 206511752"/>
             <wp:cNvGraphicFramePr>
               <a:graphicFrameLocks xmlns:a="http://schemas.openxmlformats.org/drawingml/2006/main" noChangeAspect="1"/>
             </wp:cNvGraphicFramePr>
@@ -3358,6 +3062,274 @@
                   <pic:spPr bwMode="auto">
                     <a:xfrm>
                       <a:off x="0" y="0"/>
+                      <a:ext cx="5270500" cy="6429375"/>
+                    </a:xfrm>
+                    <a:prstGeom prst="rect">
+                      <a:avLst/>
+                    </a:prstGeom>
+                  </pic:spPr>
+                </pic:pic>
+              </a:graphicData>
+            </a:graphic>
+          </wp:inline>
+        </w:drawing>
+      </w:r>
+    </w:p>
+    <w:p>
+      <w:pPr>
+        <w:pStyle w:val="Caption"/>
+        <w:jc w:val="both"/>
+        <w:rPr>
+          <w:sz w:val="20"/>
+          <w:szCs w:val="20"/>
+        </w:rPr>
+      </w:pPr>
+      <w:r>
+        <w:rPr>
+          <w:sz w:val="20"/>
+          <w:szCs w:val="20"/>
+        </w:rPr>
+        <w:t xml:space="preserve">Figure </w:t>
+      </w:r>
+      <w:r>
+        <w:rPr>
+          <w:sz w:val="20"/>
+          <w:szCs w:val="20"/>
+        </w:rPr>
+        <w:fldChar w:fldCharType="begin"/>
+      </w:r>
+      <w:r>
+        <w:rPr>
+          <w:sz w:val="20"/>
+          <w:szCs w:val="20"/>
+        </w:rPr>
+        <w:instrText xml:space="preserve"> SEQ Figure \* ARABIC </w:instrText>
+      </w:r>
+      <w:r>
+        <w:rPr>
+          <w:sz w:val="20"/>
+          <w:szCs w:val="20"/>
+        </w:rPr>
+        <w:fldChar w:fldCharType="separate"/>
+      </w:r>
+      <w:r>
+        <w:rPr>
+          <w:noProof/>
+          <w:sz w:val="20"/>
+          <w:szCs w:val="20"/>
+        </w:rPr>
+        <w:t>3</w:t>
+      </w:r>
+      <w:r>
+        <w:rPr>
+          <w:sz w:val="20"/>
+          <w:szCs w:val="20"/>
+        </w:rPr>
+        <w:fldChar w:fldCharType="end"/>
+      </w:r>
+      <w:r>
+        <w:rPr>
+          <w:sz w:val="20"/>
+          <w:szCs w:val="20"/>
+        </w:rPr>
+        <w:t>: Adopt page wireframe — Paw Haven Animal Rescue. [Personal drawing].</w:t>
+      </w:r>
+    </w:p>
+    <w:p>
+      <w:pPr>
+        <w:jc w:val="both"/>
+      </w:pPr>
+      <w:r>
+        <w:br w:type="page"/>
+      </w:r>
+    </w:p>
+    <w:p>
+      <w:pPr>
+        <w:spacing w:line="360" w:lineRule="auto"/>
+        <w:jc w:val="both"/>
+      </w:pPr>
+      <w:r>
+        <w:rPr>
+          <w:rFonts w:ascii="Aptos" w:eastAsia="Aptos" w:hAnsi="Aptos" w:cs="Aptos"/>
+          <w:b/>
+          <w:bCs/>
+          <w:sz w:val="22"/>
+          <w:szCs w:val="22"/>
+        </w:rPr>
+        <w:lastRenderedPageBreak/>
+        <w:t>Enquiry page</w:t>
+      </w:r>
+    </w:p>
+    <w:p>
+      <w:pPr>
+        <w:keepNext/>
+        <w:jc w:val="both"/>
+      </w:pPr>
+      <w:r>
+        <w:rPr>
+          <w:noProof/>
+        </w:rPr>
+        <w:drawing>
+          <wp:inline distT="0" distB="0" distL="0" distR="0" wp14:anchorId="0AC7156D" wp14:editId="28A2C819">
+            <wp:extent cx="5245100" cy="7048500"/>
+            <wp:effectExtent l="0" t="0" r="0" b="0"/>
+            <wp:docPr id="500522745" name="Picture 500522745"/>
+            <wp:cNvGraphicFramePr>
+              <a:graphicFrameLocks xmlns:a="http://schemas.openxmlformats.org/drawingml/2006/main" noChangeAspect="1"/>
+            </wp:cNvGraphicFramePr>
+            <a:graphic xmlns:a="http://schemas.openxmlformats.org/drawingml/2006/main">
+              <a:graphicData uri="http://schemas.openxmlformats.org/drawingml/2006/picture">
+                <pic:pic xmlns:pic="http://schemas.openxmlformats.org/drawingml/2006/picture">
+                  <pic:nvPicPr>
+                    <pic:cNvPr id="0" name=""/>
+                    <pic:cNvPicPr>
+                      <a:picLocks noChangeAspect="1" noChangeArrowheads="1"/>
+                    </pic:cNvPicPr>
+                  </pic:nvPicPr>
+                  <pic:blipFill>
+                    <a:blip r:embed="rId11"/>
+                    <a:srcRect/>
+                    <a:stretch>
+                      <a:fillRect/>
+                    </a:stretch>
+                  </pic:blipFill>
+                  <pic:spPr bwMode="auto">
+                    <a:xfrm>
+                      <a:off x="0" y="0"/>
+                      <a:ext cx="5245100" cy="7048500"/>
+                    </a:xfrm>
+                    <a:prstGeom prst="rect">
+                      <a:avLst/>
+                    </a:prstGeom>
+                  </pic:spPr>
+                </pic:pic>
+              </a:graphicData>
+            </a:graphic>
+          </wp:inline>
+        </w:drawing>
+      </w:r>
+    </w:p>
+    <w:p>
+      <w:pPr>
+        <w:pStyle w:val="Caption"/>
+        <w:jc w:val="both"/>
+        <w:rPr>
+          <w:sz w:val="20"/>
+          <w:szCs w:val="20"/>
+        </w:rPr>
+      </w:pPr>
+      <w:r>
+        <w:rPr>
+          <w:sz w:val="20"/>
+          <w:szCs w:val="20"/>
+        </w:rPr>
+        <w:t xml:space="preserve">Figure </w:t>
+      </w:r>
+      <w:r>
+        <w:rPr>
+          <w:sz w:val="20"/>
+          <w:szCs w:val="20"/>
+        </w:rPr>
+        <w:fldChar w:fldCharType="begin"/>
+      </w:r>
+      <w:r>
+        <w:rPr>
+          <w:sz w:val="20"/>
+          <w:szCs w:val="20"/>
+        </w:rPr>
+        <w:instrText xml:space="preserve"> SEQ Figure \* ARABIC </w:instrText>
+      </w:r>
+      <w:r>
+        <w:rPr>
+          <w:sz w:val="20"/>
+          <w:szCs w:val="20"/>
+        </w:rPr>
+        <w:fldChar w:fldCharType="separate"/>
+      </w:r>
+      <w:r>
+        <w:rPr>
+          <w:noProof/>
+          <w:sz w:val="20"/>
+          <w:szCs w:val="20"/>
+        </w:rPr>
+        <w:t>4</w:t>
+      </w:r>
+      <w:r>
+        <w:rPr>
+          <w:sz w:val="20"/>
+          <w:szCs w:val="20"/>
+        </w:rPr>
+        <w:fldChar w:fldCharType="end"/>
+      </w:r>
+      <w:r>
+        <w:rPr>
+          <w:sz w:val="20"/>
+          <w:szCs w:val="20"/>
+        </w:rPr>
+        <w:t>: Enquiry page wireframe — Paw Haven Animal Rescue. [Personal drawing].</w:t>
+      </w:r>
+    </w:p>
+    <w:p>
+      <w:pPr>
+        <w:jc w:val="both"/>
+      </w:pPr>
+      <w:r>
+        <w:br w:type="page"/>
+      </w:r>
+    </w:p>
+    <w:p>
+      <w:pPr>
+        <w:spacing w:line="360" w:lineRule="auto"/>
+        <w:jc w:val="both"/>
+      </w:pPr>
+      <w:r>
+        <w:rPr>
+          <w:rFonts w:ascii="Aptos" w:eastAsia="Aptos" w:hAnsi="Aptos" w:cs="Aptos"/>
+          <w:b/>
+          <w:bCs/>
+          <w:sz w:val="22"/>
+          <w:szCs w:val="22"/>
+        </w:rPr>
+        <w:lastRenderedPageBreak/>
+        <w:t>Contact page</w:t>
+      </w:r>
+    </w:p>
+    <w:p>
+      <w:pPr>
+        <w:keepNext/>
+        <w:jc w:val="both"/>
+      </w:pPr>
+      <w:r>
+        <w:rPr>
+          <w:noProof/>
+        </w:rPr>
+        <w:drawing>
+          <wp:inline distT="0" distB="0" distL="0" distR="0" wp14:anchorId="14E75C29" wp14:editId="0AC74D5E">
+            <wp:extent cx="4572000" cy="6429375"/>
+            <wp:effectExtent l="0" t="0" r="0" b="0"/>
+            <wp:docPr id="1151776030" name="Picture 1151776030"/>
+            <wp:cNvGraphicFramePr>
+              <a:graphicFrameLocks xmlns:a="http://schemas.openxmlformats.org/drawingml/2006/main" noChangeAspect="1"/>
+            </wp:cNvGraphicFramePr>
+            <a:graphic xmlns:a="http://schemas.openxmlformats.org/drawingml/2006/main">
+              <a:graphicData uri="http://schemas.openxmlformats.org/drawingml/2006/picture">
+                <pic:pic xmlns:pic="http://schemas.openxmlformats.org/drawingml/2006/picture">
+                  <pic:nvPicPr>
+                    <pic:cNvPr id="0" name=""/>
+                    <pic:cNvPicPr>
+                      <a:picLocks noChangeAspect="1" noChangeArrowheads="1"/>
+                    </pic:cNvPicPr>
+                  </pic:nvPicPr>
+                  <pic:blipFill>
+                    <a:blip r:embed="rId12"/>
+                    <a:srcRect/>
+                    <a:stretch>
+                      <a:fillRect/>
+                    </a:stretch>
+                  </pic:blipFill>
+                  <pic:spPr bwMode="auto">
+                    <a:xfrm>
+                      <a:off x="0" y="0"/>
                       <a:ext cx="4572000" cy="6429375"/>
                     </a:xfrm>
                     <a:prstGeom prst="rect">
@@ -3632,25 +3604,7 @@
           <w:sz w:val="22"/>
           <w:szCs w:val="22"/>
         </w:rPr>
-        <w:t xml:space="preserve"> on real market rates. Domain registration R105/year (</w:t>
-      </w:r>
-      <w:proofErr w:type="spellStart"/>
-      <w:r>
-        <w:rPr>
-          <w:rFonts w:ascii="Aptos" w:eastAsia="Aptos" w:hAnsi="Aptos" w:cs="Aptos"/>
-          <w:sz w:val="22"/>
-          <w:szCs w:val="22"/>
-        </w:rPr>
-        <w:t>xneelo</w:t>
-      </w:r>
-      <w:proofErr w:type="spellEnd"/>
-      <w:r>
-        <w:rPr>
-          <w:rFonts w:ascii="Aptos" w:eastAsia="Aptos" w:hAnsi="Aptos" w:cs="Aptos"/>
-          <w:sz w:val="22"/>
-          <w:szCs w:val="22"/>
-        </w:rPr>
-        <w:t>, 2026). Free-tier hosting via Netlify: R0. Stock/CC imagery: R0. Estimated notional total: under R150.</w:t>
+        <w:t xml:space="preserve"> on real market rates. Domain registration R105/year (xneelo, 2026). Free-tier hosting via Netlify: R0. Stock/CC imagery: R0. Estimated notional total: under R150.</w:t>
       </w:r>
     </w:p>
     <w:p>
@@ -3680,7 +3634,7 @@
           <w:szCs w:val="22"/>
         </w:rPr>
       </w:pPr>
-      <w:hyperlink r:id="rId11" w:history="1">
+      <w:hyperlink r:id="rId13" w:history="1">
         <w:r>
           <w:rPr>
             <w:rStyle w:val="Hyperlink"/>
@@ -3749,7 +3703,7 @@
       <w:r>
         <w:t xml:space="preserve"> </w:t>
       </w:r>
-      <w:hyperlink r:id="rId12" w:history="1">
+      <w:hyperlink r:id="rId14" w:history="1">
         <w:r>
           <w:rPr>
             <w:rStyle w:val="Hyperlink"/>
@@ -4137,25 +4091,7 @@
           <w:sz w:val="22"/>
           <w:szCs w:val="22"/>
         </w:rPr>
-        <w:t xml:space="preserve">Kelder &amp; Vine is proposed as a new business with no existing website; this project establishes its first web presence rather than redesigning an existing one. The gap </w:t>
-      </w:r>
-      <w:proofErr w:type="gramStart"/>
-      <w:r>
-        <w:rPr>
-          <w:rFonts w:ascii="Aptos" w:eastAsia="Aptos" w:hAnsi="Aptos" w:cs="Aptos"/>
-          <w:sz w:val="22"/>
-          <w:szCs w:val="22"/>
-        </w:rPr>
-        <w:t>this fills</w:t>
-      </w:r>
-      <w:proofErr w:type="gramEnd"/>
-      <w:r>
-        <w:rPr>
-          <w:rFonts w:ascii="Aptos" w:eastAsia="Aptos" w:hAnsi="Aptos" w:cs="Aptos"/>
-          <w:sz w:val="22"/>
-          <w:szCs w:val="22"/>
-        </w:rPr>
-        <w:t xml:space="preserve"> is specific: independent Stellenbosch wine-and-deli sellers without a site rely on passing foot traffic alone, missing tourists who plan visits online before arriving — a dedicated site captures that pre-visit search.</w:t>
+        <w:t>Kelder &amp; Vine is proposed as a new business with no existing website; this project establishes its first web presence rather than redesigning an existing one. The gap this fills is specific: independent Stellenbosch wine-and-deli sellers without a site rely on passing foot traffic alone, missing tourists who plan visits online before arriving — a dedicated site captures that pre-visit search.</w:t>
       </w:r>
     </w:p>
     <w:p>
@@ -4215,6 +4151,7 @@
           <w:sz w:val="22"/>
           <w:szCs w:val="22"/>
         </w:rPr>
+        <w:lastRenderedPageBreak/>
         <w:t>About page covering the owner's story and sourcing philosophy.</w:t>
       </w:r>
     </w:p>
@@ -4234,7 +4171,6 @@
           <w:sz w:val="22"/>
           <w:szCs w:val="22"/>
         </w:rPr>
-        <w:lastRenderedPageBreak/>
         <w:t>Products page listing wine and deli categories.</w:t>
       </w:r>
     </w:p>
@@ -4416,262 +4352,12 @@
         <w:rPr>
           <w:noProof/>
         </w:rPr>
+        <w:lastRenderedPageBreak/>
         <w:drawing>
           <wp:inline distT="0" distB="0" distL="0" distR="0" wp14:anchorId="5920FF13" wp14:editId="5CD1BF25">
             <wp:extent cx="5105400" cy="3822700"/>
             <wp:effectExtent l="0" t="0" r="0" b="6350"/>
             <wp:docPr id="76964292" name="Picture 76964292"/>
-            <wp:cNvGraphicFramePr>
-              <a:graphicFrameLocks xmlns:a="http://schemas.openxmlformats.org/drawingml/2006/main" noChangeAspect="1"/>
-            </wp:cNvGraphicFramePr>
-            <a:graphic xmlns:a="http://schemas.openxmlformats.org/drawingml/2006/main">
-              <a:graphicData uri="http://schemas.openxmlformats.org/drawingml/2006/picture">
-                <pic:pic xmlns:pic="http://schemas.openxmlformats.org/drawingml/2006/picture">
-                  <pic:nvPicPr>
-                    <pic:cNvPr id="0" name=""/>
-                    <pic:cNvPicPr>
-                      <a:picLocks noChangeAspect="1" noChangeArrowheads="1"/>
-                    </pic:cNvPicPr>
-                  </pic:nvPicPr>
-                  <pic:blipFill>
-                    <a:blip r:embed="rId13"/>
-                    <a:srcRect/>
-                    <a:stretch>
-                      <a:fillRect/>
-                    </a:stretch>
-                  </pic:blipFill>
-                  <pic:spPr bwMode="auto">
-                    <a:xfrm>
-                      <a:off x="0" y="0"/>
-                      <a:ext cx="5105400" cy="3822700"/>
-                    </a:xfrm>
-                    <a:prstGeom prst="rect">
-                      <a:avLst/>
-                    </a:prstGeom>
-                  </pic:spPr>
-                </pic:pic>
-              </a:graphicData>
-            </a:graphic>
-          </wp:inline>
-        </w:drawing>
-      </w:r>
-    </w:p>
-    <w:p>
-      <w:pPr>
-        <w:pStyle w:val="Caption"/>
-        <w:rPr>
-          <w:sz w:val="20"/>
-          <w:szCs w:val="20"/>
-        </w:rPr>
-      </w:pPr>
-      <w:r>
-        <w:rPr>
-          <w:sz w:val="20"/>
-          <w:szCs w:val="20"/>
-        </w:rPr>
-        <w:t xml:space="preserve">Figure </w:t>
-      </w:r>
-      <w:r>
-        <w:rPr>
-          <w:sz w:val="20"/>
-          <w:szCs w:val="20"/>
-        </w:rPr>
-        <w:fldChar w:fldCharType="begin"/>
-      </w:r>
-      <w:r>
-        <w:rPr>
-          <w:sz w:val="20"/>
-          <w:szCs w:val="20"/>
-        </w:rPr>
-        <w:instrText xml:space="preserve"> SEQ Figure \* ARABIC </w:instrText>
-      </w:r>
-      <w:r>
-        <w:rPr>
-          <w:sz w:val="20"/>
-          <w:szCs w:val="20"/>
-        </w:rPr>
-        <w:fldChar w:fldCharType="separate"/>
-      </w:r>
-      <w:r>
-        <w:rPr>
-          <w:noProof/>
-          <w:sz w:val="20"/>
-          <w:szCs w:val="20"/>
-        </w:rPr>
-        <w:t>6</w:t>
-      </w:r>
-      <w:r>
-        <w:rPr>
-          <w:sz w:val="20"/>
-          <w:szCs w:val="20"/>
-        </w:rPr>
-        <w:fldChar w:fldCharType="end"/>
-      </w:r>
-      <w:r>
-        <w:rPr>
-          <w:sz w:val="20"/>
-          <w:szCs w:val="20"/>
-        </w:rPr>
-        <w:t>: Home page wireframe — Kelder &amp; Vine. [Personal drawing].</w:t>
-      </w:r>
-    </w:p>
-    <w:p>
-      <w:pPr>
-        <w:spacing w:line="360" w:lineRule="auto"/>
-      </w:pPr>
-      <w:r>
-        <w:rPr>
-          <w:rFonts w:ascii="Aptos" w:eastAsia="Aptos" w:hAnsi="Aptos" w:cs="Aptos"/>
-          <w:b/>
-          <w:bCs/>
-          <w:sz w:val="22"/>
-          <w:szCs w:val="22"/>
-        </w:rPr>
-        <w:lastRenderedPageBreak/>
-        <w:t>About page</w:t>
-      </w:r>
-    </w:p>
-    <w:p>
-      <w:pPr>
-        <w:keepNext/>
-      </w:pPr>
-      <w:r>
-        <w:rPr>
-          <w:noProof/>
-        </w:rPr>
-        <w:drawing>
-          <wp:inline distT="0" distB="0" distL="0" distR="0" wp14:anchorId="47B10325" wp14:editId="61049098">
-            <wp:extent cx="5480050" cy="7727950"/>
-            <wp:effectExtent l="0" t="0" r="6350" b="6350"/>
-            <wp:docPr id="985062277" name="Picture 985062277"/>
-            <wp:cNvGraphicFramePr>
-              <a:graphicFrameLocks xmlns:a="http://schemas.openxmlformats.org/drawingml/2006/main" noChangeAspect="1"/>
-            </wp:cNvGraphicFramePr>
-            <a:graphic xmlns:a="http://schemas.openxmlformats.org/drawingml/2006/main">
-              <a:graphicData uri="http://schemas.openxmlformats.org/drawingml/2006/picture">
-                <pic:pic xmlns:pic="http://schemas.openxmlformats.org/drawingml/2006/picture">
-                  <pic:nvPicPr>
-                    <pic:cNvPr id="0" name=""/>
-                    <pic:cNvPicPr>
-                      <a:picLocks noChangeAspect="1" noChangeArrowheads="1"/>
-                    </pic:cNvPicPr>
-                  </pic:nvPicPr>
-                  <pic:blipFill>
-                    <a:blip r:embed="rId14"/>
-                    <a:srcRect/>
-                    <a:stretch>
-                      <a:fillRect/>
-                    </a:stretch>
-                  </pic:blipFill>
-                  <pic:spPr bwMode="auto">
-                    <a:xfrm>
-                      <a:off x="0" y="0"/>
-                      <a:ext cx="5480050" cy="7727950"/>
-                    </a:xfrm>
-                    <a:prstGeom prst="rect">
-                      <a:avLst/>
-                    </a:prstGeom>
-                  </pic:spPr>
-                </pic:pic>
-              </a:graphicData>
-            </a:graphic>
-          </wp:inline>
-        </w:drawing>
-      </w:r>
-    </w:p>
-    <w:p>
-      <w:pPr>
-        <w:pStyle w:val="Caption"/>
-        <w:rPr>
-          <w:sz w:val="20"/>
-          <w:szCs w:val="20"/>
-        </w:rPr>
-      </w:pPr>
-      <w:r>
-        <w:rPr>
-          <w:sz w:val="20"/>
-          <w:szCs w:val="20"/>
-        </w:rPr>
-        <w:t xml:space="preserve">Figure </w:t>
-      </w:r>
-      <w:r>
-        <w:rPr>
-          <w:sz w:val="20"/>
-          <w:szCs w:val="20"/>
-        </w:rPr>
-        <w:fldChar w:fldCharType="begin"/>
-      </w:r>
-      <w:r>
-        <w:rPr>
-          <w:sz w:val="20"/>
-          <w:szCs w:val="20"/>
-        </w:rPr>
-        <w:instrText xml:space="preserve"> SEQ Figure \* ARABIC </w:instrText>
-      </w:r>
-      <w:r>
-        <w:rPr>
-          <w:sz w:val="20"/>
-          <w:szCs w:val="20"/>
-        </w:rPr>
-        <w:fldChar w:fldCharType="separate"/>
-      </w:r>
-      <w:r>
-        <w:rPr>
-          <w:noProof/>
-          <w:sz w:val="20"/>
-          <w:szCs w:val="20"/>
-        </w:rPr>
-        <w:t>7</w:t>
-      </w:r>
-      <w:r>
-        <w:rPr>
-          <w:sz w:val="20"/>
-          <w:szCs w:val="20"/>
-        </w:rPr>
-        <w:fldChar w:fldCharType="end"/>
-      </w:r>
-      <w:r>
-        <w:rPr>
-          <w:sz w:val="20"/>
-          <w:szCs w:val="20"/>
-        </w:rPr>
-        <w:t>: About page wireframe — Kelder &amp; Vine. [Personal drawing].</w:t>
-      </w:r>
-    </w:p>
-    <w:p>
-      <w:r>
-        <w:br w:type="page"/>
-      </w:r>
-    </w:p>
-    <w:p>
-      <w:pPr>
-        <w:spacing w:line="360" w:lineRule="auto"/>
-      </w:pPr>
-      <w:r>
-        <w:rPr>
-          <w:rFonts w:ascii="Aptos" w:eastAsia="Aptos" w:hAnsi="Aptos" w:cs="Aptos"/>
-          <w:b/>
-          <w:bCs/>
-          <w:sz w:val="22"/>
-          <w:szCs w:val="22"/>
-        </w:rPr>
-        <w:lastRenderedPageBreak/>
-        <w:t>Products page</w:t>
-      </w:r>
-    </w:p>
-    <w:p>
-      <w:pPr>
-        <w:keepNext/>
-      </w:pPr>
-      <w:r>
-        <w:rPr>
-          <w:noProof/>
-        </w:rPr>
-        <w:drawing>
-          <wp:inline distT="0" distB="0" distL="0" distR="0" wp14:anchorId="560F1C77" wp14:editId="6553FFE0">
-            <wp:extent cx="5638800" cy="7607300"/>
-            <wp:effectExtent l="0" t="0" r="0" b="0"/>
-            <wp:docPr id="1298478895" name="Picture 1298478895"/>
             <wp:cNvGraphicFramePr>
               <a:graphicFrameLocks xmlns:a="http://schemas.openxmlformats.org/drawingml/2006/main" noChangeAspect="1"/>
             </wp:cNvGraphicFramePr>
@@ -4694,7 +4380,7 @@
                   <pic:spPr bwMode="auto">
                     <a:xfrm>
                       <a:off x="0" y="0"/>
-                      <a:ext cx="5638800" cy="7607300"/>
+                      <a:ext cx="5105400" cy="3822700"/>
                     </a:xfrm>
                     <a:prstGeom prst="rect">
                       <a:avLst/>
@@ -4749,7 +4435,7 @@
           <w:sz w:val="20"/>
           <w:szCs w:val="20"/>
         </w:rPr>
-        <w:t>8</w:t>
+        <w:t>6</w:t>
       </w:r>
       <w:r>
         <w:rPr>
@@ -4763,25 +4449,7 @@
           <w:sz w:val="20"/>
           <w:szCs w:val="20"/>
         </w:rPr>
-        <w:t>: Products page wireframe — Kelder &amp; Vine. [Personal drawing].</w:t>
-      </w:r>
-    </w:p>
-    <w:p>
-      <w:pPr>
-        <w:rPr>
-          <w:i/>
-          <w:iCs/>
-          <w:color w:val="44546A" w:themeColor="text2"/>
-          <w:sz w:val="20"/>
-          <w:szCs w:val="20"/>
-        </w:rPr>
-      </w:pPr>
-      <w:r>
-        <w:rPr>
-          <w:sz w:val="20"/>
-          <w:szCs w:val="20"/>
-        </w:rPr>
-        <w:br w:type="page"/>
+        <w:t>: Home page wireframe — Kelder &amp; Vine. [Personal drawing].</w:t>
       </w:r>
     </w:p>
     <w:p>
@@ -4796,24 +4464,23 @@
           <w:sz w:val="22"/>
           <w:szCs w:val="22"/>
         </w:rPr>
+        <w:t>About page</w:t>
+      </w:r>
+    </w:p>
+    <w:p>
+      <w:pPr>
+        <w:keepNext/>
+      </w:pPr>
+      <w:r>
+        <w:rPr>
+          <w:noProof/>
+        </w:rPr>
         <w:lastRenderedPageBreak/>
-        <w:t>Enquiry page</w:t>
-      </w:r>
-    </w:p>
-    <w:p>
-      <w:pPr>
-        <w:pStyle w:val="Caption"/>
-        <w:keepNext/>
-      </w:pPr>
-      <w:r>
-        <w:rPr>
-          <w:noProof/>
-        </w:rPr>
         <w:drawing>
-          <wp:inline distT="0" distB="0" distL="0" distR="0" wp14:anchorId="121001F5" wp14:editId="1CC252D6">
-            <wp:extent cx="5448300" cy="7423150"/>
-            <wp:effectExtent l="0" t="0" r="0" b="6350"/>
-            <wp:docPr id="1460658215" name="Picture 1460658215"/>
+          <wp:inline distT="0" distB="0" distL="0" distR="0" wp14:anchorId="47B10325" wp14:editId="61049098">
+            <wp:extent cx="5480050" cy="7727950"/>
+            <wp:effectExtent l="0" t="0" r="6350" b="6350"/>
+            <wp:docPr id="985062277" name="Picture 985062277"/>
             <wp:cNvGraphicFramePr>
               <a:graphicFrameLocks xmlns:a="http://schemas.openxmlformats.org/drawingml/2006/main" noChangeAspect="1"/>
             </wp:cNvGraphicFramePr>
@@ -4836,7 +4503,7 @@
                   <pic:spPr bwMode="auto">
                     <a:xfrm>
                       <a:off x="0" y="0"/>
-                      <a:ext cx="5448300" cy="7423150"/>
+                      <a:ext cx="5480050" cy="7727950"/>
                     </a:xfrm>
                     <a:prstGeom prst="rect">
                       <a:avLst/>
@@ -4891,7 +4558,7 @@
           <w:sz w:val="20"/>
           <w:szCs w:val="20"/>
         </w:rPr>
-        <w:t>9</w:t>
+        <w:t>7</w:t>
       </w:r>
       <w:r>
         <w:rPr>
@@ -4905,24 +4572,11 @@
           <w:sz w:val="20"/>
           <w:szCs w:val="20"/>
         </w:rPr>
-        <w:t>: Enquiry page wireframe — Kelder &amp; Vine. [Personal drawing].</w:t>
-      </w:r>
-    </w:p>
-    <w:p>
-      <w:pPr>
-        <w:rPr>
-          <w:i/>
-          <w:iCs/>
-          <w:color w:val="44546A" w:themeColor="text2"/>
-          <w:sz w:val="20"/>
-          <w:szCs w:val="20"/>
-        </w:rPr>
-      </w:pPr>
-      <w:r>
-        <w:rPr>
-          <w:sz w:val="20"/>
-          <w:szCs w:val="20"/>
-        </w:rPr>
+        <w:t>: About page wireframe — Kelder &amp; Vine. [Personal drawing].</w:t>
+      </w:r>
+    </w:p>
+    <w:p>
+      <w:r>
         <w:br w:type="page"/>
       </w:r>
     </w:p>
@@ -4939,28 +4593,22 @@
           <w:szCs w:val="22"/>
         </w:rPr>
         <w:lastRenderedPageBreak/>
-        <w:t>Contact page</w:t>
+        <w:t>Products page</w:t>
       </w:r>
     </w:p>
     <w:p>
       <w:pPr>
         <w:keepNext/>
-        <w:rPr>
-          <w:sz w:val="28"/>
-          <w:szCs w:val="28"/>
-        </w:rPr>
       </w:pPr>
       <w:r>
         <w:rPr>
           <w:noProof/>
-          <w:sz w:val="28"/>
-          <w:szCs w:val="28"/>
         </w:rPr>
         <w:drawing>
-          <wp:inline distT="0" distB="0" distL="0" distR="0" wp14:anchorId="2C88CDEF" wp14:editId="2462F53A">
-            <wp:extent cx="5200650" cy="8108950"/>
-            <wp:effectExtent l="0" t="0" r="0" b="6350"/>
-            <wp:docPr id="1919793741" name="Picture 1919793741"/>
+          <wp:inline distT="0" distB="0" distL="0" distR="0" wp14:anchorId="560F1C77" wp14:editId="6553FFE0">
+            <wp:extent cx="5638800" cy="7607300"/>
+            <wp:effectExtent l="0" t="0" r="0" b="0"/>
+            <wp:docPr id="1298478895" name="Picture 1298478895"/>
             <wp:cNvGraphicFramePr>
               <a:graphicFrameLocks xmlns:a="http://schemas.openxmlformats.org/drawingml/2006/main" noChangeAspect="1"/>
             </wp:cNvGraphicFramePr>
@@ -4983,6 +4631,295 @@
                   <pic:spPr bwMode="auto">
                     <a:xfrm>
                       <a:off x="0" y="0"/>
+                      <a:ext cx="5638800" cy="7607300"/>
+                    </a:xfrm>
+                    <a:prstGeom prst="rect">
+                      <a:avLst/>
+                    </a:prstGeom>
+                  </pic:spPr>
+                </pic:pic>
+              </a:graphicData>
+            </a:graphic>
+          </wp:inline>
+        </w:drawing>
+      </w:r>
+    </w:p>
+    <w:p>
+      <w:pPr>
+        <w:pStyle w:val="Caption"/>
+        <w:rPr>
+          <w:sz w:val="20"/>
+          <w:szCs w:val="20"/>
+        </w:rPr>
+      </w:pPr>
+      <w:r>
+        <w:rPr>
+          <w:sz w:val="20"/>
+          <w:szCs w:val="20"/>
+        </w:rPr>
+        <w:t xml:space="preserve">Figure </w:t>
+      </w:r>
+      <w:r>
+        <w:rPr>
+          <w:sz w:val="20"/>
+          <w:szCs w:val="20"/>
+        </w:rPr>
+        <w:fldChar w:fldCharType="begin"/>
+      </w:r>
+      <w:r>
+        <w:rPr>
+          <w:sz w:val="20"/>
+          <w:szCs w:val="20"/>
+        </w:rPr>
+        <w:instrText xml:space="preserve"> SEQ Figure \* ARABIC </w:instrText>
+      </w:r>
+      <w:r>
+        <w:rPr>
+          <w:sz w:val="20"/>
+          <w:szCs w:val="20"/>
+        </w:rPr>
+        <w:fldChar w:fldCharType="separate"/>
+      </w:r>
+      <w:r>
+        <w:rPr>
+          <w:noProof/>
+          <w:sz w:val="20"/>
+          <w:szCs w:val="20"/>
+        </w:rPr>
+        <w:t>8</w:t>
+      </w:r>
+      <w:r>
+        <w:rPr>
+          <w:sz w:val="20"/>
+          <w:szCs w:val="20"/>
+        </w:rPr>
+        <w:fldChar w:fldCharType="end"/>
+      </w:r>
+      <w:r>
+        <w:rPr>
+          <w:sz w:val="20"/>
+          <w:szCs w:val="20"/>
+        </w:rPr>
+        <w:t>: Products page wireframe — Kelder &amp; Vine. [Personal drawing].</w:t>
+      </w:r>
+    </w:p>
+    <w:p>
+      <w:pPr>
+        <w:rPr>
+          <w:i/>
+          <w:iCs/>
+          <w:color w:val="44546A" w:themeColor="text2"/>
+          <w:sz w:val="20"/>
+          <w:szCs w:val="20"/>
+        </w:rPr>
+      </w:pPr>
+      <w:r>
+        <w:rPr>
+          <w:sz w:val="20"/>
+          <w:szCs w:val="20"/>
+        </w:rPr>
+        <w:br w:type="page"/>
+      </w:r>
+    </w:p>
+    <w:p>
+      <w:pPr>
+        <w:spacing w:line="360" w:lineRule="auto"/>
+      </w:pPr>
+      <w:r>
+        <w:rPr>
+          <w:rFonts w:ascii="Aptos" w:eastAsia="Aptos" w:hAnsi="Aptos" w:cs="Aptos"/>
+          <w:b/>
+          <w:bCs/>
+          <w:sz w:val="22"/>
+          <w:szCs w:val="22"/>
+        </w:rPr>
+        <w:lastRenderedPageBreak/>
+        <w:t>Enquiry page</w:t>
+      </w:r>
+    </w:p>
+    <w:p>
+      <w:pPr>
+        <w:pStyle w:val="Caption"/>
+        <w:keepNext/>
+      </w:pPr>
+      <w:r>
+        <w:rPr>
+          <w:noProof/>
+        </w:rPr>
+        <w:drawing>
+          <wp:inline distT="0" distB="0" distL="0" distR="0" wp14:anchorId="121001F5" wp14:editId="1CC252D6">
+            <wp:extent cx="5448300" cy="7423150"/>
+            <wp:effectExtent l="0" t="0" r="0" b="6350"/>
+            <wp:docPr id="1460658215" name="Picture 1460658215"/>
+            <wp:cNvGraphicFramePr>
+              <a:graphicFrameLocks xmlns:a="http://schemas.openxmlformats.org/drawingml/2006/main" noChangeAspect="1"/>
+            </wp:cNvGraphicFramePr>
+            <a:graphic xmlns:a="http://schemas.openxmlformats.org/drawingml/2006/main">
+              <a:graphicData uri="http://schemas.openxmlformats.org/drawingml/2006/picture">
+                <pic:pic xmlns:pic="http://schemas.openxmlformats.org/drawingml/2006/picture">
+                  <pic:nvPicPr>
+                    <pic:cNvPr id="0" name=""/>
+                    <pic:cNvPicPr>
+                      <a:picLocks noChangeAspect="1" noChangeArrowheads="1"/>
+                    </pic:cNvPicPr>
+                  </pic:nvPicPr>
+                  <pic:blipFill>
+                    <a:blip r:embed="rId18"/>
+                    <a:srcRect/>
+                    <a:stretch>
+                      <a:fillRect/>
+                    </a:stretch>
+                  </pic:blipFill>
+                  <pic:spPr bwMode="auto">
+                    <a:xfrm>
+                      <a:off x="0" y="0"/>
+                      <a:ext cx="5448300" cy="7423150"/>
+                    </a:xfrm>
+                    <a:prstGeom prst="rect">
+                      <a:avLst/>
+                    </a:prstGeom>
+                  </pic:spPr>
+                </pic:pic>
+              </a:graphicData>
+            </a:graphic>
+          </wp:inline>
+        </w:drawing>
+      </w:r>
+    </w:p>
+    <w:p>
+      <w:pPr>
+        <w:pStyle w:val="Caption"/>
+        <w:rPr>
+          <w:sz w:val="20"/>
+          <w:szCs w:val="20"/>
+        </w:rPr>
+      </w:pPr>
+      <w:r>
+        <w:rPr>
+          <w:sz w:val="20"/>
+          <w:szCs w:val="20"/>
+        </w:rPr>
+        <w:t xml:space="preserve">Figure </w:t>
+      </w:r>
+      <w:r>
+        <w:rPr>
+          <w:sz w:val="20"/>
+          <w:szCs w:val="20"/>
+        </w:rPr>
+        <w:fldChar w:fldCharType="begin"/>
+      </w:r>
+      <w:r>
+        <w:rPr>
+          <w:sz w:val="20"/>
+          <w:szCs w:val="20"/>
+        </w:rPr>
+        <w:instrText xml:space="preserve"> SEQ Figure \* ARABIC </w:instrText>
+      </w:r>
+      <w:r>
+        <w:rPr>
+          <w:sz w:val="20"/>
+          <w:szCs w:val="20"/>
+        </w:rPr>
+        <w:fldChar w:fldCharType="separate"/>
+      </w:r>
+      <w:r>
+        <w:rPr>
+          <w:noProof/>
+          <w:sz w:val="20"/>
+          <w:szCs w:val="20"/>
+        </w:rPr>
+        <w:t>9</w:t>
+      </w:r>
+      <w:r>
+        <w:rPr>
+          <w:sz w:val="20"/>
+          <w:szCs w:val="20"/>
+        </w:rPr>
+        <w:fldChar w:fldCharType="end"/>
+      </w:r>
+      <w:r>
+        <w:rPr>
+          <w:sz w:val="20"/>
+          <w:szCs w:val="20"/>
+        </w:rPr>
+        <w:t>: Enquiry page wireframe — Kelder &amp; Vine. [Personal drawing].</w:t>
+      </w:r>
+    </w:p>
+    <w:p>
+      <w:pPr>
+        <w:rPr>
+          <w:i/>
+          <w:iCs/>
+          <w:color w:val="44546A" w:themeColor="text2"/>
+          <w:sz w:val="20"/>
+          <w:szCs w:val="20"/>
+        </w:rPr>
+      </w:pPr>
+      <w:r>
+        <w:rPr>
+          <w:sz w:val="20"/>
+          <w:szCs w:val="20"/>
+        </w:rPr>
+        <w:br w:type="page"/>
+      </w:r>
+    </w:p>
+    <w:p>
+      <w:pPr>
+        <w:spacing w:line="360" w:lineRule="auto"/>
+      </w:pPr>
+      <w:r>
+        <w:rPr>
+          <w:rFonts w:ascii="Aptos" w:eastAsia="Aptos" w:hAnsi="Aptos" w:cs="Aptos"/>
+          <w:b/>
+          <w:bCs/>
+          <w:sz w:val="22"/>
+          <w:szCs w:val="22"/>
+        </w:rPr>
+        <w:lastRenderedPageBreak/>
+        <w:t>Contact page</w:t>
+      </w:r>
+    </w:p>
+    <w:p>
+      <w:pPr>
+        <w:keepNext/>
+        <w:rPr>
+          <w:sz w:val="28"/>
+          <w:szCs w:val="28"/>
+        </w:rPr>
+      </w:pPr>
+      <w:r>
+        <w:rPr>
+          <w:noProof/>
+          <w:sz w:val="28"/>
+          <w:szCs w:val="28"/>
+        </w:rPr>
+        <w:drawing>
+          <wp:inline distT="0" distB="0" distL="0" distR="0" wp14:anchorId="2C88CDEF" wp14:editId="2462F53A">
+            <wp:extent cx="5200650" cy="8108950"/>
+            <wp:effectExtent l="0" t="0" r="0" b="6350"/>
+            <wp:docPr id="1919793741" name="Picture 1919793741"/>
+            <wp:cNvGraphicFramePr>
+              <a:graphicFrameLocks xmlns:a="http://schemas.openxmlformats.org/drawingml/2006/main" noChangeAspect="1"/>
+            </wp:cNvGraphicFramePr>
+            <a:graphic xmlns:a="http://schemas.openxmlformats.org/drawingml/2006/main">
+              <a:graphicData uri="http://schemas.openxmlformats.org/drawingml/2006/picture">
+                <pic:pic xmlns:pic="http://schemas.openxmlformats.org/drawingml/2006/picture">
+                  <pic:nvPicPr>
+                    <pic:cNvPr id="0" name=""/>
+                    <pic:cNvPicPr>
+                      <a:picLocks noChangeAspect="1" noChangeArrowheads="1"/>
+                    </pic:cNvPicPr>
+                  </pic:nvPicPr>
+                  <pic:blipFill>
+                    <a:blip r:embed="rId19"/>
+                    <a:srcRect/>
+                    <a:stretch>
+                      <a:fillRect/>
+                    </a:stretch>
+                  </pic:blipFill>
+                  <pic:spPr bwMode="auto">
+                    <a:xfrm>
+                      <a:off x="0" y="0"/>
                       <a:ext cx="5200650" cy="8108950"/>
                     </a:xfrm>
                     <a:prstGeom prst="rect">
@@ -5221,25 +5158,7 @@
           <w:sz w:val="22"/>
           <w:szCs w:val="22"/>
         </w:rPr>
-        <w:t>based on real market rates. Domain registration (keldervine.co.za): R105/year (</w:t>
-      </w:r>
-      <w:proofErr w:type="spellStart"/>
-      <w:r>
-        <w:rPr>
-          <w:rFonts w:ascii="Aptos" w:eastAsia="Aptos" w:hAnsi="Aptos" w:cs="Aptos"/>
-          <w:sz w:val="22"/>
-          <w:szCs w:val="22"/>
-        </w:rPr>
-        <w:t>xneelo</w:t>
-      </w:r>
-      <w:proofErr w:type="spellEnd"/>
-      <w:r>
-        <w:rPr>
-          <w:rFonts w:ascii="Aptos" w:eastAsia="Aptos" w:hAnsi="Aptos" w:cs="Aptos"/>
-          <w:sz w:val="22"/>
-          <w:szCs w:val="22"/>
-        </w:rPr>
-        <w:t>, 2026). Free-tier hosting: R0. CC-licensed imagery: R0. Estimated notional total: under R150.</w:t>
+        <w:t>based on real market rates. Domain registration (keldervine.co.za): R105/year (xneelo, 2026). Free-tier hosting: R0. CC-licensed imagery: R0. Estimated notional total: under R150.</w:t>
       </w:r>
     </w:p>
     <w:p>
@@ -5268,7 +5187,7 @@
       <w:pPr>
         <w:spacing w:line="360" w:lineRule="auto"/>
       </w:pPr>
-      <w:hyperlink r:id="rId18" w:history="1">
+      <w:hyperlink r:id="rId20" w:history="1">
         <w:r>
           <w:rPr>
             <w:rStyle w:val="Hyperlink"/>
@@ -5361,7 +5280,7 @@
       <w:r>
         <w:t xml:space="preserve"> </w:t>
       </w:r>
-      <w:hyperlink r:id="rId19" w:history="1">
+      <w:hyperlink r:id="rId21" w:history="1">
         <w:r>
           <w:rPr>
             <w:rStyle w:val="Hyperlink"/>
@@ -5507,13 +5426,8 @@
         <w:jc w:val="both"/>
       </w:pPr>
       <w:r>
-        <w:t xml:space="preserve">All text is original content written for this fictional organisation. No citation </w:t>
-      </w:r>
-      <w:proofErr w:type="gramStart"/>
-      <w:r>
-        <w:t>required..</w:t>
-      </w:r>
-      <w:proofErr w:type="gramEnd"/>
+        <w:t>All text is original content written for this fictional organisation. No citation required..</w:t>
+      </w:r>
     </w:p>
     <w:p>
       <w:pPr>
@@ -5720,20 +5634,15 @@
       <w:pPr>
         <w:jc w:val="both"/>
       </w:pPr>
-      <w:proofErr w:type="spellStart"/>
-      <w:r>
-        <w:t>xneelo</w:t>
-      </w:r>
-      <w:proofErr w:type="spellEnd"/>
-      <w:r>
-        <w:t>. 2026. Domain Name Search and Registration. [Online]. Available at:</w:t>
-      </w:r>
-    </w:p>
-    <w:p>
-      <w:pPr>
-        <w:jc w:val="both"/>
-      </w:pPr>
-      <w:hyperlink r:id="rId20" w:history="1">
+      <w:r>
+        <w:t>xneelo. 2026. Domain Name Search and Registration. [Online]. Available at:</w:t>
+      </w:r>
+    </w:p>
+    <w:p>
+      <w:pPr>
+        <w:jc w:val="both"/>
+      </w:pPr>
+      <w:hyperlink r:id="rId22" w:history="1">
         <w:r>
           <w:rPr>
             <w:rStyle w:val="Hyperlink"/>
@@ -5749,7 +5658,7 @@
       </w:r>
     </w:p>
     <w:p>
-      <w:hyperlink r:id="rId21" w:history="1">
+      <w:hyperlink r:id="rId23" w:history="1">
         <w:r>
           <w:rPr>
             <w:rStyle w:val="Hyperlink"/>
@@ -5788,7 +5697,7 @@
       <w:r>
         <w:t xml:space="preserve">created the wireframes) &amp; </w:t>
       </w:r>
-      <w:hyperlink r:id="rId22" w:history="1">
+      <w:hyperlink r:id="rId24" w:history="1">
         <w:r>
           <w:rPr>
             <w:rStyle w:val="Hyperlink"/>
@@ -5869,6 +5778,7 @@
     <w:p>
       <w:pPr>
         <w:rPr>
+          <w:noProof/>
           <w:lang w:eastAsia="en-ZA"/>
         </w:rPr>
       </w:pPr>
@@ -5893,7 +5803,7 @@
                     <pic:cNvPicPr/>
                   </pic:nvPicPr>
                   <pic:blipFill>
-                    <a:blip r:embed="rId23">
+                    <a:blip r:embed="rId25">
                       <a:extLst>
                         <a:ext uri="{28A0092B-C50C-407E-A947-70E740481C1C}">
                           <a14:useLocalDpi xmlns:a14="http://schemas.microsoft.com/office/drawing/2010/main" val="0"/>
@@ -5920,7 +5830,40 @@
         </w:drawing>
       </w:r>
     </w:p>
+    <w:p>
+      <w:pPr>
+        <w:pStyle w:val="Header"/>
+      </w:pPr>
+      <w:r>
+        <w:t xml:space="preserve">GIT HUB LINK </w:t>
+      </w:r>
+    </w:p>
+    <w:p>
+      <w:pPr>
+        <w:pStyle w:val="Header"/>
+      </w:pPr>
+      <w:hyperlink r:id="rId26" w:history="1">
+        <w:r>
+          <w:rPr>
+            <w:rStyle w:val="Hyperlink"/>
+          </w:rPr>
+          <w:t>https://github.com/mudzani/ST10512213-WEDE51112-POE.git</w:t>
+        </w:r>
+      </w:hyperlink>
+      <w:r>
+        <w:t xml:space="preserve"> </w:t>
+      </w:r>
+    </w:p>
+    <w:p>
+      <w:pPr>
+        <w:rPr>
+          <w:lang w:eastAsia="en-ZA"/>
+        </w:rPr>
+      </w:pPr>
+    </w:p>
     <w:sectPr>
+      <w:headerReference w:type="default" r:id="rId27"/>
+      <w:footerReference w:type="default" r:id="rId28"/>
       <w:pgSz w:w="11906" w:h="16838"/>
       <w:pgMar w:top="1440" w:right="1440" w:bottom="1440" w:left="1440" w:header="708" w:footer="708" w:gutter="0"/>
       <w:cols w:space="708"/>
@@ -5928,6 +5871,119 @@
     </w:sectPr>
   </w:body>
 </w:document>
+</file>
+
+<file path=word/endnotes.xml><?xml version="1.0" encoding="utf-8"?>
+<w:endnotes xmlns:wpc="http://schemas.microsoft.com/office/word/2010/wordprocessingCanvas" xmlns:cx="http://schemas.microsoft.com/office/drawing/2014/chartex" xmlns:cx1="http://schemas.microsoft.com/office/drawing/2015/9/8/chartex" xmlns:cx2="http://schemas.microsoft.com/office/drawing/2015/10/21/chartex" xmlns:cx3="http://schemas.microsoft.com/office/drawing/2016/5/9/chartex" xmlns:cx4="http://schemas.microsoft.com/office/drawing/2016/5/10/chartex" xmlns:cx5="http://schemas.microsoft.com/office/drawing/2016/5/11/chartex" xmlns:cx6="http://schemas.microsoft.com/office/drawing/2016/5/12/chartex" xmlns:cx7="http://schemas.microsoft.com/office/drawing/2016/5/13/chartex" xmlns:cx8="http://schemas.microsoft.com/office/drawing/2016/5/14/chartex" xmlns:mc="http://schemas.openxmlformats.org/markup-compatibility/2006" xmlns:aink="http://schemas.microsoft.com/office/drawing/2016/ink" xmlns:am3d="http://schemas.microsoft.com/office/drawing/2017/model3d" xmlns:o="urn:schemas-microsoft-com:office:office" xmlns:oel="http://schemas.microsoft.com/office/2019/extlst" xmlns:r="http://schemas.openxmlformats.org/officeDocument/2006/relationships" xmlns:m="http://schemas.openxmlformats.org/officeDocument/2006/math" xmlns:v="urn:schemas-microsoft-com:vml" xmlns:wp14="http://schemas.microsoft.com/office/word/2010/wordprocessingDrawing" xmlns:wp="http://schemas.openxmlformats.org/drawingml/2006/wordprocessingDrawing" xmlns:w10="urn:schemas-microsoft-com:office:word" xmlns:w="http://schemas.openxmlformats.org/wordprocessingml/2006/main" xmlns:w14="http://schemas.microsoft.com/office/word/2010/wordml" xmlns:w15="http://schemas.microsoft.com/office/word/2012/wordml" xmlns:w16cex="http://schemas.microsoft.com/office/word/2018/wordml/cex" xmlns:w16cid="http://schemas.microsoft.com/office/word/2016/wordml/cid" xmlns:w16="http://schemas.microsoft.com/office/word/2018/wordml" xmlns:w16du="http://schemas.microsoft.com/office/word/2023/wordml/word16du" xmlns:w16sdtdh="http://schemas.microsoft.com/office/word/2020/wordml/sdtdatahash" xmlns:w16sdtfl="http://schemas.microsoft.com/office/word/2024/wordml/sdtformatlock" xmlns:w16se="http://schemas.microsoft.com/office/word/2015/wordml/symex" xmlns:wpg="http://schemas.microsoft.com/office/word/2010/wordprocessingGroup" xmlns:wpi="http://schemas.microsoft.com/office/word/2010/wordprocessingInk" xmlns:wne="http://schemas.microsoft.com/office/word/2006/wordml" xmlns:wps="http://schemas.microsoft.com/office/word/2010/wordprocessingShape" mc:Ignorable="w14 w15 w16se w16cid w16 w16cex w16sdtdh w16sdtfl w16du wp14">
+  <w:endnote w:type="separator" w:id="-1">
+    <w:p>
+      <w:pPr>
+        <w:spacing w:after="0" w:line="240" w:lineRule="auto"/>
+      </w:pPr>
+      <w:r>
+        <w:separator/>
+      </w:r>
+    </w:p>
+  </w:endnote>
+  <w:endnote w:type="continuationSeparator" w:id="0">
+    <w:p>
+      <w:pPr>
+        <w:spacing w:after="0" w:line="240" w:lineRule="auto"/>
+      </w:pPr>
+      <w:r>
+        <w:continuationSeparator/>
+      </w:r>
+    </w:p>
+  </w:endnote>
+</w:endnotes>
+</file>
+
+<file path=word/footer1.xml><?xml version="1.0" encoding="utf-8"?>
+<w:ftr xmlns:wpc="http://schemas.microsoft.com/office/word/2010/wordprocessingCanvas" xmlns:cx="http://schemas.microsoft.com/office/drawing/2014/chartex" xmlns:cx1="http://schemas.microsoft.com/office/drawing/2015/9/8/chartex" xmlns:cx2="http://schemas.microsoft.com/office/drawing/2015/10/21/chartex" xmlns:cx3="http://schemas.microsoft.com/office/drawing/2016/5/9/chartex" xmlns:cx4="http://schemas.microsoft.com/office/drawing/2016/5/10/chartex" xmlns:cx5="http://schemas.microsoft.com/office/drawing/2016/5/11/chartex" xmlns:cx6="http://schemas.microsoft.com/office/drawing/2016/5/12/chartex" xmlns:cx7="http://schemas.microsoft.com/office/drawing/2016/5/13/chartex" xmlns:cx8="http://schemas.microsoft.com/office/drawing/2016/5/14/chartex" xmlns:mc="http://schemas.openxmlformats.org/markup-compatibility/2006" xmlns:aink="http://schemas.microsoft.com/office/drawing/2016/ink" xmlns:am3d="http://schemas.microsoft.com/office/drawing/2017/model3d" xmlns:o="urn:schemas-microsoft-com:office:office" xmlns:oel="http://schemas.microsoft.com/office/2019/extlst" xmlns:r="http://schemas.openxmlformats.org/officeDocument/2006/relationships" xmlns:m="http://schemas.openxmlformats.org/officeDocument/2006/math" xmlns:v="urn:schemas-microsoft-com:vml" xmlns:wp14="http://schemas.microsoft.com/office/word/2010/wordprocessingDrawing" xmlns:wp="http://schemas.openxmlformats.org/drawingml/2006/wordprocessingDrawing" xmlns:w10="urn:schemas-microsoft-com:office:word" xmlns:w="http://schemas.openxmlformats.org/wordprocessingml/2006/main" xmlns:w14="http://schemas.microsoft.com/office/word/2010/wordml" xmlns:w15="http://schemas.microsoft.com/office/word/2012/wordml" xmlns:w16cex="http://schemas.microsoft.com/office/word/2018/wordml/cex" xmlns:w16cid="http://schemas.microsoft.com/office/word/2016/wordml/cid" xmlns:w16="http://schemas.microsoft.com/office/word/2018/wordml" xmlns:w16du="http://schemas.microsoft.com/office/word/2023/wordml/word16du" xmlns:w16sdtdh="http://schemas.microsoft.com/office/word/2020/wordml/sdtdatahash" xmlns:w16sdtfl="http://schemas.microsoft.com/office/word/2024/wordml/sdtformatlock" xmlns:w16se="http://schemas.microsoft.com/office/word/2015/wordml/symex" xmlns:wpg="http://schemas.microsoft.com/office/word/2010/wordprocessingGroup" xmlns:wpi="http://schemas.microsoft.com/office/word/2010/wordprocessingInk" xmlns:wne="http://schemas.microsoft.com/office/word/2006/wordml" xmlns:wps="http://schemas.microsoft.com/office/word/2010/wordprocessingShape" mc:Ignorable="w14 w15 w16se w16cid w16 w16cex w16sdtdh w16sdtfl w16du wp14">
+  <w:p>
+    <w:pPr>
+      <w:pStyle w:val="Header"/>
+    </w:pPr>
+    <w:r>
+      <w:t xml:space="preserve">GIT HUB LINK </w:t>
+    </w:r>
+  </w:p>
+  <w:p>
+    <w:pPr>
+      <w:pStyle w:val="Header"/>
+    </w:pPr>
+    <w:hyperlink r:id="rId1" w:history="1">
+      <w:r>
+        <w:rPr>
+          <w:rStyle w:val="Hyperlink"/>
+        </w:rPr>
+        <w:t>https://github.com/mudzani/ST10512213-WEDE51112-POE.git</w:t>
+      </w:r>
+    </w:hyperlink>
+    <w:r>
+      <w:t xml:space="preserve"> </w:t>
+    </w:r>
+  </w:p>
+  <w:p>
+    <w:pPr>
+      <w:pStyle w:val="Footer"/>
+    </w:pPr>
+  </w:p>
+</w:ftr>
+</file>
+
+<file path=word/footnotes.xml><?xml version="1.0" encoding="utf-8"?>
+<w:footnotes xmlns:wpc="http://schemas.microsoft.com/office/word/2010/wordprocessingCanvas" xmlns:cx="http://schemas.microsoft.com/office/drawing/2014/chartex" xmlns:cx1="http://schemas.microsoft.com/office/drawing/2015/9/8/chartex" xmlns:cx2="http://schemas.microsoft.com/office/drawing/2015/10/21/chartex" xmlns:cx3="http://schemas.microsoft.com/office/drawing/2016/5/9/chartex" xmlns:cx4="http://schemas.microsoft.com/office/drawing/2016/5/10/chartex" xmlns:cx5="http://schemas.microsoft.com/office/drawing/2016/5/11/chartex" xmlns:cx6="http://schemas.microsoft.com/office/drawing/2016/5/12/chartex" xmlns:cx7="http://schemas.microsoft.com/office/drawing/2016/5/13/chartex" xmlns:cx8="http://schemas.microsoft.com/office/drawing/2016/5/14/chartex" xmlns:mc="http://schemas.openxmlformats.org/markup-compatibility/2006" xmlns:aink="http://schemas.microsoft.com/office/drawing/2016/ink" xmlns:am3d="http://schemas.microsoft.com/office/drawing/2017/model3d" xmlns:o="urn:schemas-microsoft-com:office:office" xmlns:oel="http://schemas.microsoft.com/office/2019/extlst" xmlns:r="http://schemas.openxmlformats.org/officeDocument/2006/relationships" xmlns:m="http://schemas.openxmlformats.org/officeDocument/2006/math" xmlns:v="urn:schemas-microsoft-com:vml" xmlns:wp14="http://schemas.microsoft.com/office/word/2010/wordprocessingDrawing" xmlns:wp="http://schemas.openxmlformats.org/drawingml/2006/wordprocessingDrawing" xmlns:w10="urn:schemas-microsoft-com:office:word" xmlns:w="http://schemas.openxmlformats.org/wordprocessingml/2006/main" xmlns:w14="http://schemas.microsoft.com/office/word/2010/wordml" xmlns:w15="http://schemas.microsoft.com/office/word/2012/wordml" xmlns:w16cex="http://schemas.microsoft.com/office/word/2018/wordml/cex" xmlns:w16cid="http://schemas.microsoft.com/office/word/2016/wordml/cid" xmlns:w16="http://schemas.microsoft.com/office/word/2018/wordml" xmlns:w16du="http://schemas.microsoft.com/office/word/2023/wordml/word16du" xmlns:w16sdtdh="http://schemas.microsoft.com/office/word/2020/wordml/sdtdatahash" xmlns:w16sdtfl="http://schemas.microsoft.com/office/word/2024/wordml/sdtformatlock" xmlns:w16se="http://schemas.microsoft.com/office/word/2015/wordml/symex" xmlns:wpg="http://schemas.microsoft.com/office/word/2010/wordprocessingGroup" xmlns:wpi="http://schemas.microsoft.com/office/word/2010/wordprocessingInk" xmlns:wne="http://schemas.microsoft.com/office/word/2006/wordml" xmlns:wps="http://schemas.microsoft.com/office/word/2010/wordprocessingShape" mc:Ignorable="w14 w15 w16se w16cid w16 w16cex w16sdtdh w16sdtfl w16du wp14">
+  <w:footnote w:type="separator" w:id="-1">
+    <w:p>
+      <w:pPr>
+        <w:spacing w:after="0" w:line="240" w:lineRule="auto"/>
+      </w:pPr>
+      <w:r>
+        <w:separator/>
+      </w:r>
+    </w:p>
+  </w:footnote>
+  <w:footnote w:type="continuationSeparator" w:id="0">
+    <w:p>
+      <w:pPr>
+        <w:spacing w:after="0" w:line="240" w:lineRule="auto"/>
+      </w:pPr>
+      <w:r>
+        <w:continuationSeparator/>
+      </w:r>
+    </w:p>
+  </w:footnote>
+</w:footnotes>
+</file>
+
+<file path=word/header1.xml><?xml version="1.0" encoding="utf-8"?>
+<w:hdr xmlns:wpc="http://schemas.microsoft.com/office/word/2010/wordprocessingCanvas" xmlns:cx="http://schemas.microsoft.com/office/drawing/2014/chartex" xmlns:cx1="http://schemas.microsoft.com/office/drawing/2015/9/8/chartex" xmlns:cx2="http://schemas.microsoft.com/office/drawing/2015/10/21/chartex" xmlns:cx3="http://schemas.microsoft.com/office/drawing/2016/5/9/chartex" xmlns:cx4="http://schemas.microsoft.com/office/drawing/2016/5/10/chartex" xmlns:cx5="http://schemas.microsoft.com/office/drawing/2016/5/11/chartex" xmlns:cx6="http://schemas.microsoft.com/office/drawing/2016/5/12/chartex" xmlns:cx7="http://schemas.microsoft.com/office/drawing/2016/5/13/chartex" xmlns:cx8="http://schemas.microsoft.com/office/drawing/2016/5/14/chartex" xmlns:mc="http://schemas.openxmlformats.org/markup-compatibility/2006" xmlns:aink="http://schemas.microsoft.com/office/drawing/2016/ink" xmlns:am3d="http://schemas.microsoft.com/office/drawing/2017/model3d" xmlns:o="urn:schemas-microsoft-com:office:office" xmlns:oel="http://schemas.microsoft.com/office/2019/extlst" xmlns:r="http://schemas.openxmlformats.org/officeDocument/2006/relationships" xmlns:m="http://schemas.openxmlformats.org/officeDocument/2006/math" xmlns:v="urn:schemas-microsoft-com:vml" xmlns:wp14="http://schemas.microsoft.com/office/word/2010/wordprocessingDrawing" xmlns:wp="http://schemas.openxmlformats.org/drawingml/2006/wordprocessingDrawing" xmlns:w10="urn:schemas-microsoft-com:office:word" xmlns:w="http://schemas.openxmlformats.org/wordprocessingml/2006/main" xmlns:w14="http://schemas.microsoft.com/office/word/2010/wordml" xmlns:w15="http://schemas.microsoft.com/office/word/2012/wordml" xmlns:w16cex="http://schemas.microsoft.com/office/word/2018/wordml/cex" xmlns:w16cid="http://schemas.microsoft.com/office/word/2016/wordml/cid" xmlns:w16="http://schemas.microsoft.com/office/word/2018/wordml" xmlns:w16du="http://schemas.microsoft.com/office/word/2023/wordml/word16du" xmlns:w16sdtdh="http://schemas.microsoft.com/office/word/2020/wordml/sdtdatahash" xmlns:w16sdtfl="http://schemas.microsoft.com/office/word/2024/wordml/sdtformatlock" xmlns:w16se="http://schemas.microsoft.com/office/word/2015/wordml/symex" xmlns:wpg="http://schemas.microsoft.com/office/word/2010/wordprocessingGroup" xmlns:wpi="http://schemas.microsoft.com/office/word/2010/wordprocessingInk" xmlns:wne="http://schemas.microsoft.com/office/word/2006/wordml" xmlns:wps="http://schemas.microsoft.com/office/word/2010/wordprocessingShape" mc:Ignorable="w14 w15 w16se w16cid w16 w16cex w16sdtdh w16sdtfl w16du wp14">
+  <w:p>
+    <w:pPr>
+      <w:pStyle w:val="Header"/>
+    </w:pPr>
+    <w:r>
+      <w:t xml:space="preserve">GIT HUB LINK </w:t>
+    </w:r>
+  </w:p>
+  <w:p>
+    <w:pPr>
+      <w:pStyle w:val="Header"/>
+    </w:pPr>
+    <w:hyperlink r:id="rId1" w:history="1">
+      <w:r>
+        <w:rPr>
+          <w:rStyle w:val="Hyperlink"/>
+        </w:rPr>
+        <w:t>https://github.com/mudzani/ST10512213-WEDE51112-POE.git</w:t>
+      </w:r>
+    </w:hyperlink>
+    <w:r>
+      <w:t xml:space="preserve"> </w:t>
+    </w:r>
+  </w:p>
+</w:hdr>
 </file>
 
 <file path=word/numbering.xml><?xml version="1.0" encoding="utf-8"?>
@@ -7300,6 +7356,50 @@
       <w:ind w:left="240"/>
     </w:pPr>
   </w:style>
+  <w:style w:type="paragraph" w:styleId="Header">
+    <w:name w:val="header"/>
+    <w:basedOn w:val="Normal"/>
+    <w:link w:val="HeaderChar"/>
+    <w:uiPriority w:val="99"/>
+    <w:unhideWhenUsed/>
+    <w:rsid w:val="00F15809"/>
+    <w:pPr>
+      <w:tabs>
+        <w:tab w:val="center" w:pos="4513"/>
+        <w:tab w:val="right" w:pos="9026"/>
+      </w:tabs>
+      <w:spacing w:after="0" w:line="240" w:lineRule="auto"/>
+    </w:pPr>
+  </w:style>
+  <w:style w:type="character" w:customStyle="1" w:styleId="HeaderChar">
+    <w:name w:val="Header Char"/>
+    <w:basedOn w:val="DefaultParagraphFont"/>
+    <w:link w:val="Header"/>
+    <w:uiPriority w:val="99"/>
+    <w:rsid w:val="00F15809"/>
+  </w:style>
+  <w:style w:type="paragraph" w:styleId="Footer">
+    <w:name w:val="footer"/>
+    <w:basedOn w:val="Normal"/>
+    <w:link w:val="FooterChar"/>
+    <w:uiPriority w:val="99"/>
+    <w:unhideWhenUsed/>
+    <w:rsid w:val="00F15809"/>
+    <w:pPr>
+      <w:tabs>
+        <w:tab w:val="center" w:pos="4513"/>
+        <w:tab w:val="right" w:pos="9026"/>
+      </w:tabs>
+      <w:spacing w:after="0" w:line="240" w:lineRule="auto"/>
+    </w:pPr>
+  </w:style>
+  <w:style w:type="character" w:customStyle="1" w:styleId="FooterChar">
+    <w:name w:val="Footer Char"/>
+    <w:basedOn w:val="DefaultParagraphFont"/>
+    <w:link w:val="Footer"/>
+    <w:uiPriority w:val="99"/>
+    <w:rsid w:val="00F15809"/>
+  </w:style>
 </w:styles>
 </file>
 

</xml_diff>

<commit_message>
Remove redundant text and clarify citation details in proposal document
</commit_message>
<xml_diff>
--- a/Web Development (WEDE5112) POE.docx
+++ b/Web Development (WEDE5112) POE.docx
@@ -55,21 +55,23 @@
         <w:spacing w:before="1200"/>
         <w:jc w:val="center"/>
       </w:pPr>
-      <w:r>
-        <w:rPr>
-          <w:rFonts w:ascii="Aptos" w:eastAsia="Aptos" w:hAnsi="Aptos" w:cs="Aptos"/>
-          <w:sz w:val="22"/>
-          <w:szCs w:val="22"/>
-        </w:rPr>
-        <w:t>Donald</w:t>
-      </w:r>
-      <w:r>
-        <w:rPr>
-          <w:rFonts w:ascii="Aptos" w:eastAsia="Aptos" w:hAnsi="Aptos" w:cs="Aptos"/>
-          <w:sz w:val="22"/>
-          <w:szCs w:val="22"/>
-        </w:rPr>
-        <w:t>n Mduzani</w:t>
+      <w:proofErr w:type="spellStart"/>
+      <w:r>
+        <w:rPr>
+          <w:rFonts w:ascii="Aptos" w:eastAsia="Aptos" w:hAnsi="Aptos" w:cs="Aptos"/>
+          <w:sz w:val="22"/>
+          <w:szCs w:val="22"/>
+        </w:rPr>
+        <w:t>Donaldn</w:t>
+      </w:r>
+      <w:proofErr w:type="spellEnd"/>
+      <w:r>
+        <w:rPr>
+          <w:rFonts w:ascii="Aptos" w:eastAsia="Aptos" w:hAnsi="Aptos" w:cs="Aptos"/>
+          <w:sz w:val="22"/>
+          <w:szCs w:val="22"/>
+        </w:rPr>
+        <w:t xml:space="preserve"> Mduzani</w:t>
       </w:r>
     </w:p>
     <w:p>
@@ -2290,7 +2292,25 @@
           <w:sz w:val="22"/>
           <w:szCs w:val="22"/>
         </w:rPr>
-        <w:t>As a newly proposed organisation, Paw Haven has no existing website; there are no legacy strengths or weaknesses to analyse. This is treated as a greenfield build. The gap this fills is specific: smaller NPO shelters in the area typically rely only on a Facebook page, which cannot support a structured adoption enquiry with volunteer/sponsor options</w:t>
+        <w:t xml:space="preserve">As a newly proposed organisation, Paw Haven has no existing website; there are no legacy strengths or weaknesses to analyse. This is treated as a greenfield build. The gap </w:t>
+      </w:r>
+      <w:proofErr w:type="gramStart"/>
+      <w:r>
+        <w:rPr>
+          <w:rFonts w:ascii="Aptos" w:eastAsia="Aptos" w:hAnsi="Aptos" w:cs="Aptos"/>
+          <w:sz w:val="22"/>
+          <w:szCs w:val="22"/>
+        </w:rPr>
+        <w:t>this fills</w:t>
+      </w:r>
+      <w:proofErr w:type="gramEnd"/>
+      <w:r>
+        <w:rPr>
+          <w:rFonts w:ascii="Aptos" w:eastAsia="Aptos" w:hAnsi="Aptos" w:cs="Aptos"/>
+          <w:sz w:val="22"/>
+          <w:szCs w:val="22"/>
+        </w:rPr>
+        <w:t xml:space="preserve"> is specific: smaller NPO shelters in the area typically rely only on a Facebook page, which cannot support a structured adoption enquiry with volunteer/sponsor options</w:t>
       </w:r>
       <w:r>
         <w:rPr>
@@ -3604,7 +3624,25 @@
           <w:sz w:val="22"/>
           <w:szCs w:val="22"/>
         </w:rPr>
-        <w:t xml:space="preserve"> on real market rates. Domain registration R105/year (xneelo, 2026). Free-tier hosting via Netlify: R0. Stock/CC imagery: R0. Estimated notional total: under R150.</w:t>
+        <w:t xml:space="preserve"> on real market rates. Domain registration R105/year (</w:t>
+      </w:r>
+      <w:proofErr w:type="spellStart"/>
+      <w:r>
+        <w:rPr>
+          <w:rFonts w:ascii="Aptos" w:eastAsia="Aptos" w:hAnsi="Aptos" w:cs="Aptos"/>
+          <w:sz w:val="22"/>
+          <w:szCs w:val="22"/>
+        </w:rPr>
+        <w:t>xneelo</w:t>
+      </w:r>
+      <w:proofErr w:type="spellEnd"/>
+      <w:r>
+        <w:rPr>
+          <w:rFonts w:ascii="Aptos" w:eastAsia="Aptos" w:hAnsi="Aptos" w:cs="Aptos"/>
+          <w:sz w:val="22"/>
+          <w:szCs w:val="22"/>
+        </w:rPr>
+        <w:t>, 2026). Free-tier hosting via Netlify: R0. Stock/CC imagery: R0. Estimated notional total: under R150.</w:t>
       </w:r>
     </w:p>
     <w:p>
@@ -3711,25 +3749,7 @@
             <w:sz w:val="22"/>
             <w:szCs w:val="22"/>
           </w:rPr>
-          <w:t>https://ww</w:t>
-        </w:r>
-        <w:r>
-          <w:rPr>
-            <w:rStyle w:val="Hyperlink"/>
-            <w:rFonts w:ascii="Aptos" w:eastAsia="Aptos" w:hAnsi="Aptos" w:cs="Aptos"/>
-            <w:sz w:val="22"/>
-            <w:szCs w:val="22"/>
-          </w:rPr>
-          <w:t>w</w:t>
-        </w:r>
-        <w:r>
-          <w:rPr>
-            <w:rStyle w:val="Hyperlink"/>
-            <w:rFonts w:ascii="Aptos" w:eastAsia="Aptos" w:hAnsi="Aptos" w:cs="Aptos"/>
-            <w:sz w:val="22"/>
-            <w:szCs w:val="22"/>
-          </w:rPr>
-          <w:t>.drawio.com/</w:t>
+          <w:t>https://www.drawio.com/</w:t>
         </w:r>
       </w:hyperlink>
     </w:p>
@@ -4091,7 +4111,25 @@
           <w:sz w:val="22"/>
           <w:szCs w:val="22"/>
         </w:rPr>
-        <w:t>Kelder &amp; Vine is proposed as a new business with no existing website; this project establishes its first web presence rather than redesigning an existing one. The gap this fills is specific: independent Stellenbosch wine-and-deli sellers without a site rely on passing foot traffic alone, missing tourists who plan visits online before arriving — a dedicated site captures that pre-visit search.</w:t>
+        <w:t xml:space="preserve">Kelder &amp; Vine is proposed as a new business with no existing website; this project establishes its first web presence rather than redesigning an existing one. The gap </w:t>
+      </w:r>
+      <w:proofErr w:type="gramStart"/>
+      <w:r>
+        <w:rPr>
+          <w:rFonts w:ascii="Aptos" w:eastAsia="Aptos" w:hAnsi="Aptos" w:cs="Aptos"/>
+          <w:sz w:val="22"/>
+          <w:szCs w:val="22"/>
+        </w:rPr>
+        <w:t>this fills</w:t>
+      </w:r>
+      <w:proofErr w:type="gramEnd"/>
+      <w:r>
+        <w:rPr>
+          <w:rFonts w:ascii="Aptos" w:eastAsia="Aptos" w:hAnsi="Aptos" w:cs="Aptos"/>
+          <w:sz w:val="22"/>
+          <w:szCs w:val="22"/>
+        </w:rPr>
+        <w:t xml:space="preserve"> is specific: independent Stellenbosch wine-and-deli sellers without a site rely on passing foot traffic alone, missing tourists who plan visits online before arriving — a dedicated site captures that pre-visit search.</w:t>
       </w:r>
     </w:p>
     <w:p>
@@ -5158,7 +5196,25 @@
           <w:sz w:val="22"/>
           <w:szCs w:val="22"/>
         </w:rPr>
-        <w:t>based on real market rates. Domain registration (keldervine.co.za): R105/year (xneelo, 2026). Free-tier hosting: R0. CC-licensed imagery: R0. Estimated notional total: under R150.</w:t>
+        <w:t>based on real market rates. Domain registration (keldervine.co.za): R105/year (</w:t>
+      </w:r>
+      <w:proofErr w:type="spellStart"/>
+      <w:r>
+        <w:rPr>
+          <w:rFonts w:ascii="Aptos" w:eastAsia="Aptos" w:hAnsi="Aptos" w:cs="Aptos"/>
+          <w:sz w:val="22"/>
+          <w:szCs w:val="22"/>
+        </w:rPr>
+        <w:t>xneelo</w:t>
+      </w:r>
+      <w:proofErr w:type="spellEnd"/>
+      <w:r>
+        <w:rPr>
+          <w:rFonts w:ascii="Aptos" w:eastAsia="Aptos" w:hAnsi="Aptos" w:cs="Aptos"/>
+          <w:sz w:val="22"/>
+          <w:szCs w:val="22"/>
+        </w:rPr>
+        <w:t>, 2026). Free-tier hosting: R0. CC-licensed imagery: R0. Estimated notional total: under R150.</w:t>
       </w:r>
     </w:p>
     <w:p>
@@ -5426,8 +5482,13 @@
         <w:jc w:val="both"/>
       </w:pPr>
       <w:r>
-        <w:t>All text is original content written for this fictional organisation. No citation required..</w:t>
-      </w:r>
+        <w:t xml:space="preserve">All text is original content written for this fictional organisation. No citation </w:t>
+      </w:r>
+      <w:proofErr w:type="gramStart"/>
+      <w:r>
+        <w:t>required..</w:t>
+      </w:r>
+      <w:proofErr w:type="gramEnd"/>
     </w:p>
     <w:p>
       <w:pPr>
@@ -5634,8 +5695,13 @@
       <w:pPr>
         <w:jc w:val="both"/>
       </w:pPr>
-      <w:r>
-        <w:t>xneelo. 2026. Domain Name Search and Registration. [Online]. Available at:</w:t>
+      <w:proofErr w:type="spellStart"/>
+      <w:r>
+        <w:t>xneelo</w:t>
+      </w:r>
+      <w:proofErr w:type="spellEnd"/>
+      <w:r>
+        <w:t>. 2026. Domain Name Search and Registration. [Online]. Available at:</w:t>
       </w:r>
     </w:p>
     <w:p>
@@ -5663,19 +5729,7 @@
           <w:rPr>
             <w:rStyle w:val="Hyperlink"/>
           </w:rPr>
-          <w:t>https://www.w3schools.com/html/ht</w:t>
-        </w:r>
-        <w:r>
-          <w:rPr>
-            <w:rStyle w:val="Hyperlink"/>
-          </w:rPr>
-          <w:t>m</w:t>
-        </w:r>
-        <w:r>
-          <w:rPr>
-            <w:rStyle w:val="Hyperlink"/>
-          </w:rPr>
-          <w:t>l_formatting.asp</w:t>
+          <w:t>https://www.w3schools.com/html/html_formatting.asp</w:t>
         </w:r>
       </w:hyperlink>
       <w:r>
@@ -5710,8 +5764,6 @@
       </w:r>
     </w:p>
     <w:p/>
-    <w:p/>
-    <w:p/>
     <w:p>
       <w:r>
         <w:t>This is cited in-text in the proposal document and listed in full here and in the README,</w:t>
@@ -5725,17 +5777,6 @@
     <w:p>
       <w:r>
         <w:t>README.md.</w:t>
-      </w:r>
-    </w:p>
-    <w:p/>
-    <w:p>
-      <w:r>
-        <w:t>No other external text, statistics, or claims have been used anywhere in the Part 1</w:t>
-      </w:r>
-    </w:p>
-    <w:p>
-      <w:r>
-        <w:t>content. Nothing has been copied from any website, textbook, or other student's work.</w:t>
       </w:r>
     </w:p>
     <w:p/>
@@ -6946,6 +6987,7 @@
   <w:style w:type="character" w:default="1" w:styleId="DefaultParagraphFont">
     <w:name w:val="Default Paragraph Font"/>
     <w:uiPriority w:val="1"/>
+    <w:semiHidden/>
     <w:unhideWhenUsed/>
   </w:style>
   <w:style w:type="table" w:default="1" w:styleId="TableNormal">

</xml_diff>

<commit_message>
Update README and documentation for clarity and accuracy
</commit_message>
<xml_diff>
--- a/Web Development (WEDE5112) POE.docx
+++ b/Web Development (WEDE5112) POE.docx
@@ -15,7 +15,7 @@
           <w:sz w:val="32"/>
           <w:szCs w:val="32"/>
         </w:rPr>
-        <w:t>WEB DEVELOPMENT (INTRODUCTION)</w:t>
+        <w:t xml:space="preserve">WEB DEVELOPMENT </w:t>
       </w:r>
     </w:p>
     <w:p>
@@ -55,23 +55,29 @@
         <w:spacing w:before="1200"/>
         <w:jc w:val="center"/>
       </w:pPr>
-      <w:proofErr w:type="spellStart"/>
-      <w:r>
-        <w:rPr>
-          <w:rFonts w:ascii="Aptos" w:eastAsia="Aptos" w:hAnsi="Aptos" w:cs="Aptos"/>
-          <w:sz w:val="22"/>
-          <w:szCs w:val="22"/>
-        </w:rPr>
-        <w:t>Donaldn</w:t>
-      </w:r>
-      <w:proofErr w:type="spellEnd"/>
-      <w:r>
-        <w:rPr>
-          <w:rFonts w:ascii="Aptos" w:eastAsia="Aptos" w:hAnsi="Aptos" w:cs="Aptos"/>
-          <w:sz w:val="22"/>
-          <w:szCs w:val="22"/>
-        </w:rPr>
-        <w:t xml:space="preserve"> Mduzani</w:t>
+      <w:r>
+        <w:rPr>
+          <w:rFonts w:ascii="Aptos" w:eastAsia="Aptos" w:hAnsi="Aptos" w:cs="Aptos"/>
+          <w:sz w:val="22"/>
+          <w:szCs w:val="22"/>
+        </w:rPr>
+        <w:t>Donald</w:t>
+      </w:r>
+      <w:r>
+        <w:rPr>
+          <w:rFonts w:ascii="Aptos" w:eastAsia="Aptos" w:hAnsi="Aptos" w:cs="Aptos"/>
+          <w:sz w:val="22"/>
+          <w:szCs w:val="22"/>
+        </w:rPr>
+        <w:t xml:space="preserve"> </w:t>
+      </w:r>
+      <w:r>
+        <w:rPr>
+          <w:rFonts w:ascii="Aptos" w:eastAsia="Aptos" w:hAnsi="Aptos" w:cs="Aptos"/>
+          <w:sz w:val="22"/>
+          <w:szCs w:val="22"/>
+        </w:rPr>
+        <w:t>Mudzani</w:t>
       </w:r>
     </w:p>
     <w:p>
@@ -141,9 +147,9 @@
               <w:tab w:val="right" w:leader="dot" w:pos="9016"/>
             </w:tabs>
             <w:rPr>
+              <w:rFonts w:eastAsiaTheme="minorEastAsia"/>
               <w:noProof/>
-              <w:sz w:val="22"/>
-              <w:szCs w:val="22"/>
+              <w:lang w:eastAsia="en-ZA"/>
             </w:rPr>
           </w:pPr>
           <w:r>
@@ -167,14 +173,12 @@
             </w:rPr>
             <w:fldChar w:fldCharType="separate"/>
           </w:r>
-          <w:hyperlink w:anchor="_Toc237564297" w:history="1">
+          <w:hyperlink w:anchor="_Toc237788172" w:history="1">
             <w:r>
               <w:rPr>
                 <w:rStyle w:val="Hyperlink"/>
                 <w:rFonts w:ascii="Aptos" w:eastAsia="Aptos" w:hAnsi="Aptos" w:cs="Aptos"/>
                 <w:noProof/>
-                <w:sz w:val="22"/>
-                <w:szCs w:val="22"/>
               </w:rPr>
               <w:t>Proposal 1: Paw Haven Animal Rescue (Non-Profit Organisation) — SELECTED</w:t>
             </w:r>
@@ -182,8 +186,6 @@
               <w:rPr>
                 <w:noProof/>
                 <w:webHidden/>
-                <w:sz w:val="22"/>
-                <w:szCs w:val="22"/>
               </w:rPr>
               <w:tab/>
             </w:r>
@@ -191,8 +193,6 @@
               <w:rPr>
                 <w:noProof/>
                 <w:webHidden/>
-                <w:sz w:val="22"/>
-                <w:szCs w:val="22"/>
               </w:rPr>
               <w:fldChar w:fldCharType="begin"/>
             </w:r>
@@ -200,25 +200,19 @@
               <w:rPr>
                 <w:noProof/>
                 <w:webHidden/>
-                <w:sz w:val="22"/>
-                <w:szCs w:val="22"/>
-              </w:rPr>
-              <w:instrText xml:space="preserve"> PAGEREF _Toc237564297 \h </w:instrText>
-            </w:r>
-            <w:r>
-              <w:rPr>
-                <w:noProof/>
-                <w:webHidden/>
-                <w:sz w:val="22"/>
-                <w:szCs w:val="22"/>
-              </w:rPr>
-            </w:r>
-            <w:r>
-              <w:rPr>
-                <w:noProof/>
-                <w:webHidden/>
-                <w:sz w:val="22"/>
-                <w:szCs w:val="22"/>
+              </w:rPr>
+              <w:instrText xml:space="preserve"> PAGEREF _Toc237788172 \h </w:instrText>
+            </w:r>
+            <w:r>
+              <w:rPr>
+                <w:noProof/>
+                <w:webHidden/>
+              </w:rPr>
+            </w:r>
+            <w:r>
+              <w:rPr>
+                <w:noProof/>
+                <w:webHidden/>
               </w:rPr>
               <w:fldChar w:fldCharType="separate"/>
             </w:r>
@@ -226,8 +220,6 @@
               <w:rPr>
                 <w:noProof/>
                 <w:webHidden/>
-                <w:sz w:val="22"/>
-                <w:szCs w:val="22"/>
               </w:rPr>
               <w:t>3</w:t>
             </w:r>
@@ -235,8 +227,6 @@
               <w:rPr>
                 <w:noProof/>
                 <w:webHidden/>
-                <w:sz w:val="22"/>
-                <w:szCs w:val="22"/>
               </w:rPr>
               <w:fldChar w:fldCharType="end"/>
             </w:r>
@@ -249,19 +239,17 @@
               <w:tab w:val="right" w:leader="dot" w:pos="9016"/>
             </w:tabs>
             <w:rPr>
+              <w:rFonts w:eastAsiaTheme="minorEastAsia"/>
               <w:noProof/>
-              <w:sz w:val="22"/>
-              <w:szCs w:val="22"/>
+              <w:lang w:eastAsia="en-ZA"/>
             </w:rPr>
           </w:pPr>
-          <w:hyperlink w:anchor="_Toc237564298" w:history="1">
+          <w:hyperlink w:anchor="_Toc237788173" w:history="1">
             <w:r>
               <w:rPr>
                 <w:rStyle w:val="Hyperlink"/>
                 <w:rFonts w:ascii="Aptos" w:eastAsia="Aptos" w:hAnsi="Aptos" w:cs="Aptos"/>
                 <w:noProof/>
-                <w:sz w:val="22"/>
-                <w:szCs w:val="22"/>
               </w:rPr>
               <w:t>1. Organisation Overview</w:t>
             </w:r>
@@ -269,8 +257,6 @@
               <w:rPr>
                 <w:noProof/>
                 <w:webHidden/>
-                <w:sz w:val="22"/>
-                <w:szCs w:val="22"/>
               </w:rPr>
               <w:tab/>
             </w:r>
@@ -278,8 +264,6 @@
               <w:rPr>
                 <w:noProof/>
                 <w:webHidden/>
-                <w:sz w:val="22"/>
-                <w:szCs w:val="22"/>
               </w:rPr>
               <w:fldChar w:fldCharType="begin"/>
             </w:r>
@@ -287,25 +271,19 @@
               <w:rPr>
                 <w:noProof/>
                 <w:webHidden/>
-                <w:sz w:val="22"/>
-                <w:szCs w:val="22"/>
-              </w:rPr>
-              <w:instrText xml:space="preserve"> PAGEREF _Toc237564298 \h </w:instrText>
-            </w:r>
-            <w:r>
-              <w:rPr>
-                <w:noProof/>
-                <w:webHidden/>
-                <w:sz w:val="22"/>
-                <w:szCs w:val="22"/>
-              </w:rPr>
-            </w:r>
-            <w:r>
-              <w:rPr>
-                <w:noProof/>
-                <w:webHidden/>
-                <w:sz w:val="22"/>
-                <w:szCs w:val="22"/>
+              </w:rPr>
+              <w:instrText xml:space="preserve"> PAGEREF _Toc237788173 \h </w:instrText>
+            </w:r>
+            <w:r>
+              <w:rPr>
+                <w:noProof/>
+                <w:webHidden/>
+              </w:rPr>
+            </w:r>
+            <w:r>
+              <w:rPr>
+                <w:noProof/>
+                <w:webHidden/>
               </w:rPr>
               <w:fldChar w:fldCharType="separate"/>
             </w:r>
@@ -313,8 +291,6 @@
               <w:rPr>
                 <w:noProof/>
                 <w:webHidden/>
-                <w:sz w:val="22"/>
-                <w:szCs w:val="22"/>
               </w:rPr>
               <w:t>3</w:t>
             </w:r>
@@ -322,8 +298,6 @@
               <w:rPr>
                 <w:noProof/>
                 <w:webHidden/>
-                <w:sz w:val="22"/>
-                <w:szCs w:val="22"/>
               </w:rPr>
               <w:fldChar w:fldCharType="end"/>
             </w:r>
@@ -336,19 +310,17 @@
               <w:tab w:val="right" w:leader="dot" w:pos="9016"/>
             </w:tabs>
             <w:rPr>
+              <w:rFonts w:eastAsiaTheme="minorEastAsia"/>
               <w:noProof/>
-              <w:sz w:val="22"/>
-              <w:szCs w:val="22"/>
+              <w:lang w:eastAsia="en-ZA"/>
             </w:rPr>
           </w:pPr>
-          <w:hyperlink w:anchor="_Toc237564299" w:history="1">
+          <w:hyperlink w:anchor="_Toc237788174" w:history="1">
             <w:r>
               <w:rPr>
                 <w:rStyle w:val="Hyperlink"/>
                 <w:rFonts w:ascii="Aptos" w:eastAsia="Aptos" w:hAnsi="Aptos" w:cs="Aptos"/>
                 <w:noProof/>
-                <w:sz w:val="22"/>
-                <w:szCs w:val="22"/>
               </w:rPr>
               <w:t>2. Website Goals and Objectives</w:t>
             </w:r>
@@ -356,8 +328,6 @@
               <w:rPr>
                 <w:noProof/>
                 <w:webHidden/>
-                <w:sz w:val="22"/>
-                <w:szCs w:val="22"/>
               </w:rPr>
               <w:tab/>
             </w:r>
@@ -365,8 +335,6 @@
               <w:rPr>
                 <w:noProof/>
                 <w:webHidden/>
-                <w:sz w:val="22"/>
-                <w:szCs w:val="22"/>
               </w:rPr>
               <w:fldChar w:fldCharType="begin"/>
             </w:r>
@@ -374,25 +342,19 @@
               <w:rPr>
                 <w:noProof/>
                 <w:webHidden/>
-                <w:sz w:val="22"/>
-                <w:szCs w:val="22"/>
-              </w:rPr>
-              <w:instrText xml:space="preserve"> PAGEREF _Toc237564299 \h </w:instrText>
-            </w:r>
-            <w:r>
-              <w:rPr>
-                <w:noProof/>
-                <w:webHidden/>
-                <w:sz w:val="22"/>
-                <w:szCs w:val="22"/>
-              </w:rPr>
-            </w:r>
-            <w:r>
-              <w:rPr>
-                <w:noProof/>
-                <w:webHidden/>
-                <w:sz w:val="22"/>
-                <w:szCs w:val="22"/>
+              </w:rPr>
+              <w:instrText xml:space="preserve"> PAGEREF _Toc237788174 \h </w:instrText>
+            </w:r>
+            <w:r>
+              <w:rPr>
+                <w:noProof/>
+                <w:webHidden/>
+              </w:rPr>
+            </w:r>
+            <w:r>
+              <w:rPr>
+                <w:noProof/>
+                <w:webHidden/>
               </w:rPr>
               <w:fldChar w:fldCharType="separate"/>
             </w:r>
@@ -400,8 +362,6 @@
               <w:rPr>
                 <w:noProof/>
                 <w:webHidden/>
-                <w:sz w:val="22"/>
-                <w:szCs w:val="22"/>
               </w:rPr>
               <w:t>3</w:t>
             </w:r>
@@ -409,8 +369,6 @@
               <w:rPr>
                 <w:noProof/>
                 <w:webHidden/>
-                <w:sz w:val="22"/>
-                <w:szCs w:val="22"/>
               </w:rPr>
               <w:fldChar w:fldCharType="end"/>
             </w:r>
@@ -423,19 +381,17 @@
               <w:tab w:val="right" w:leader="dot" w:pos="9016"/>
             </w:tabs>
             <w:rPr>
+              <w:rFonts w:eastAsiaTheme="minorEastAsia"/>
               <w:noProof/>
-              <w:sz w:val="22"/>
-              <w:szCs w:val="22"/>
+              <w:lang w:eastAsia="en-ZA"/>
             </w:rPr>
           </w:pPr>
-          <w:hyperlink w:anchor="_Toc237564300" w:history="1">
+          <w:hyperlink w:anchor="_Toc237788175" w:history="1">
             <w:r>
               <w:rPr>
                 <w:rStyle w:val="Hyperlink"/>
                 <w:rFonts w:ascii="Aptos" w:eastAsia="Aptos" w:hAnsi="Aptos" w:cs="Aptos"/>
                 <w:noProof/>
-                <w:sz w:val="22"/>
-                <w:szCs w:val="22"/>
               </w:rPr>
               <w:t>3. Current Website Analysis</w:t>
             </w:r>
@@ -443,8 +399,6 @@
               <w:rPr>
                 <w:noProof/>
                 <w:webHidden/>
-                <w:sz w:val="22"/>
-                <w:szCs w:val="22"/>
               </w:rPr>
               <w:tab/>
             </w:r>
@@ -452,8 +406,6 @@
               <w:rPr>
                 <w:noProof/>
                 <w:webHidden/>
-                <w:sz w:val="22"/>
-                <w:szCs w:val="22"/>
               </w:rPr>
               <w:fldChar w:fldCharType="begin"/>
             </w:r>
@@ -461,25 +413,19 @@
               <w:rPr>
                 <w:noProof/>
                 <w:webHidden/>
-                <w:sz w:val="22"/>
-                <w:szCs w:val="22"/>
-              </w:rPr>
-              <w:instrText xml:space="preserve"> PAGEREF _Toc237564300 \h </w:instrText>
-            </w:r>
-            <w:r>
-              <w:rPr>
-                <w:noProof/>
-                <w:webHidden/>
-                <w:sz w:val="22"/>
-                <w:szCs w:val="22"/>
-              </w:rPr>
-            </w:r>
-            <w:r>
-              <w:rPr>
-                <w:noProof/>
-                <w:webHidden/>
-                <w:sz w:val="22"/>
-                <w:szCs w:val="22"/>
+              </w:rPr>
+              <w:instrText xml:space="preserve"> PAGEREF _Toc237788175 \h </w:instrText>
+            </w:r>
+            <w:r>
+              <w:rPr>
+                <w:noProof/>
+                <w:webHidden/>
+              </w:rPr>
+            </w:r>
+            <w:r>
+              <w:rPr>
+                <w:noProof/>
+                <w:webHidden/>
               </w:rPr>
               <w:fldChar w:fldCharType="separate"/>
             </w:r>
@@ -487,8 +433,6 @@
               <w:rPr>
                 <w:noProof/>
                 <w:webHidden/>
-                <w:sz w:val="22"/>
-                <w:szCs w:val="22"/>
               </w:rPr>
               <w:t>3</w:t>
             </w:r>
@@ -496,8 +440,6 @@
               <w:rPr>
                 <w:noProof/>
                 <w:webHidden/>
-                <w:sz w:val="22"/>
-                <w:szCs w:val="22"/>
               </w:rPr>
               <w:fldChar w:fldCharType="end"/>
             </w:r>
@@ -510,19 +452,17 @@
               <w:tab w:val="right" w:leader="dot" w:pos="9016"/>
             </w:tabs>
             <w:rPr>
+              <w:rFonts w:eastAsiaTheme="minorEastAsia"/>
               <w:noProof/>
-              <w:sz w:val="22"/>
-              <w:szCs w:val="22"/>
+              <w:lang w:eastAsia="en-ZA"/>
             </w:rPr>
           </w:pPr>
-          <w:hyperlink w:anchor="_Toc237564301" w:history="1">
+          <w:hyperlink w:anchor="_Toc237788176" w:history="1">
             <w:r>
               <w:rPr>
                 <w:rStyle w:val="Hyperlink"/>
                 <w:rFonts w:ascii="Aptos" w:eastAsia="Aptos" w:hAnsi="Aptos" w:cs="Aptos"/>
                 <w:noProof/>
-                <w:sz w:val="22"/>
-                <w:szCs w:val="22"/>
               </w:rPr>
               <w:t>4. Proposed Website Features and Functionality</w:t>
             </w:r>
@@ -530,8 +470,6 @@
               <w:rPr>
                 <w:noProof/>
                 <w:webHidden/>
-                <w:sz w:val="22"/>
-                <w:szCs w:val="22"/>
               </w:rPr>
               <w:tab/>
             </w:r>
@@ -539,8 +477,6 @@
               <w:rPr>
                 <w:noProof/>
                 <w:webHidden/>
-                <w:sz w:val="22"/>
-                <w:szCs w:val="22"/>
               </w:rPr>
               <w:fldChar w:fldCharType="begin"/>
             </w:r>
@@ -548,25 +484,19 @@
               <w:rPr>
                 <w:noProof/>
                 <w:webHidden/>
-                <w:sz w:val="22"/>
-                <w:szCs w:val="22"/>
-              </w:rPr>
-              <w:instrText xml:space="preserve"> PAGEREF _Toc237564301 \h </w:instrText>
-            </w:r>
-            <w:r>
-              <w:rPr>
-                <w:noProof/>
-                <w:webHidden/>
-                <w:sz w:val="22"/>
-                <w:szCs w:val="22"/>
-              </w:rPr>
-            </w:r>
-            <w:r>
-              <w:rPr>
-                <w:noProof/>
-                <w:webHidden/>
-                <w:sz w:val="22"/>
-                <w:szCs w:val="22"/>
+              </w:rPr>
+              <w:instrText xml:space="preserve"> PAGEREF _Toc237788176 \h </w:instrText>
+            </w:r>
+            <w:r>
+              <w:rPr>
+                <w:noProof/>
+                <w:webHidden/>
+              </w:rPr>
+            </w:r>
+            <w:r>
+              <w:rPr>
+                <w:noProof/>
+                <w:webHidden/>
               </w:rPr>
               <w:fldChar w:fldCharType="separate"/>
             </w:r>
@@ -574,8 +504,6 @@
               <w:rPr>
                 <w:noProof/>
                 <w:webHidden/>
-                <w:sz w:val="22"/>
-                <w:szCs w:val="22"/>
               </w:rPr>
               <w:t>4</w:t>
             </w:r>
@@ -583,8 +511,6 @@
               <w:rPr>
                 <w:noProof/>
                 <w:webHidden/>
-                <w:sz w:val="22"/>
-                <w:szCs w:val="22"/>
               </w:rPr>
               <w:fldChar w:fldCharType="end"/>
             </w:r>
@@ -597,19 +523,17 @@
               <w:tab w:val="right" w:leader="dot" w:pos="9016"/>
             </w:tabs>
             <w:rPr>
+              <w:rFonts w:eastAsiaTheme="minorEastAsia"/>
               <w:noProof/>
-              <w:sz w:val="22"/>
-              <w:szCs w:val="22"/>
+              <w:lang w:eastAsia="en-ZA"/>
             </w:rPr>
           </w:pPr>
-          <w:hyperlink w:anchor="_Toc237564302" w:history="1">
+          <w:hyperlink w:anchor="_Toc237788177" w:history="1">
             <w:r>
               <w:rPr>
                 <w:rStyle w:val="Hyperlink"/>
                 <w:rFonts w:ascii="Aptos" w:eastAsia="Aptos" w:hAnsi="Aptos" w:cs="Aptos"/>
                 <w:noProof/>
-                <w:sz w:val="22"/>
-                <w:szCs w:val="22"/>
               </w:rPr>
               <w:t>5. Design and User Experience</w:t>
             </w:r>
@@ -617,8 +541,6 @@
               <w:rPr>
                 <w:noProof/>
                 <w:webHidden/>
-                <w:sz w:val="22"/>
-                <w:szCs w:val="22"/>
               </w:rPr>
               <w:tab/>
             </w:r>
@@ -626,8 +548,6 @@
               <w:rPr>
                 <w:noProof/>
                 <w:webHidden/>
-                <w:sz w:val="22"/>
-                <w:szCs w:val="22"/>
               </w:rPr>
               <w:fldChar w:fldCharType="begin"/>
             </w:r>
@@ -635,25 +555,19 @@
               <w:rPr>
                 <w:noProof/>
                 <w:webHidden/>
-                <w:sz w:val="22"/>
-                <w:szCs w:val="22"/>
-              </w:rPr>
-              <w:instrText xml:space="preserve"> PAGEREF _Toc237564302 \h </w:instrText>
-            </w:r>
-            <w:r>
-              <w:rPr>
-                <w:noProof/>
-                <w:webHidden/>
-                <w:sz w:val="22"/>
-                <w:szCs w:val="22"/>
-              </w:rPr>
-            </w:r>
-            <w:r>
-              <w:rPr>
-                <w:noProof/>
-                <w:webHidden/>
-                <w:sz w:val="22"/>
-                <w:szCs w:val="22"/>
+              </w:rPr>
+              <w:instrText xml:space="preserve"> PAGEREF _Toc237788177 \h </w:instrText>
+            </w:r>
+            <w:r>
+              <w:rPr>
+                <w:noProof/>
+                <w:webHidden/>
+              </w:rPr>
+            </w:r>
+            <w:r>
+              <w:rPr>
+                <w:noProof/>
+                <w:webHidden/>
               </w:rPr>
               <w:fldChar w:fldCharType="separate"/>
             </w:r>
@@ -661,8 +575,6 @@
               <w:rPr>
                 <w:noProof/>
                 <w:webHidden/>
-                <w:sz w:val="22"/>
-                <w:szCs w:val="22"/>
               </w:rPr>
               <w:t>4</w:t>
             </w:r>
@@ -670,8 +582,6 @@
               <w:rPr>
                 <w:noProof/>
                 <w:webHidden/>
-                <w:sz w:val="22"/>
-                <w:szCs w:val="22"/>
               </w:rPr>
               <w:fldChar w:fldCharType="end"/>
             </w:r>
@@ -684,19 +594,17 @@
               <w:tab w:val="right" w:leader="dot" w:pos="9016"/>
             </w:tabs>
             <w:rPr>
+              <w:rFonts w:eastAsiaTheme="minorEastAsia"/>
               <w:noProof/>
-              <w:sz w:val="22"/>
-              <w:szCs w:val="22"/>
+              <w:lang w:eastAsia="en-ZA"/>
             </w:rPr>
           </w:pPr>
-          <w:hyperlink w:anchor="_Toc237564303" w:history="1">
+          <w:hyperlink w:anchor="_Toc237788178" w:history="1">
             <w:r>
               <w:rPr>
                 <w:rStyle w:val="Hyperlink"/>
                 <w:rFonts w:ascii="Aptos" w:eastAsia="Aptos" w:hAnsi="Aptos" w:cs="Aptos"/>
                 <w:noProof/>
-                <w:sz w:val="22"/>
-                <w:szCs w:val="22"/>
               </w:rPr>
               <w:t>6. Technical Requirements</w:t>
             </w:r>
@@ -704,8 +612,6 @@
               <w:rPr>
                 <w:noProof/>
                 <w:webHidden/>
-                <w:sz w:val="22"/>
-                <w:szCs w:val="22"/>
               </w:rPr>
               <w:tab/>
             </w:r>
@@ -713,8 +619,6 @@
               <w:rPr>
                 <w:noProof/>
                 <w:webHidden/>
-                <w:sz w:val="22"/>
-                <w:szCs w:val="22"/>
               </w:rPr>
               <w:fldChar w:fldCharType="begin"/>
             </w:r>
@@ -722,25 +626,19 @@
               <w:rPr>
                 <w:noProof/>
                 <w:webHidden/>
-                <w:sz w:val="22"/>
-                <w:szCs w:val="22"/>
-              </w:rPr>
-              <w:instrText xml:space="preserve"> PAGEREF _Toc237564303 \h </w:instrText>
-            </w:r>
-            <w:r>
-              <w:rPr>
-                <w:noProof/>
-                <w:webHidden/>
-                <w:sz w:val="22"/>
-                <w:szCs w:val="22"/>
-              </w:rPr>
-            </w:r>
-            <w:r>
-              <w:rPr>
-                <w:noProof/>
-                <w:webHidden/>
-                <w:sz w:val="22"/>
-                <w:szCs w:val="22"/>
+              </w:rPr>
+              <w:instrText xml:space="preserve"> PAGEREF _Toc237788178 \h </w:instrText>
+            </w:r>
+            <w:r>
+              <w:rPr>
+                <w:noProof/>
+                <w:webHidden/>
+              </w:rPr>
+            </w:r>
+            <w:r>
+              <w:rPr>
+                <w:noProof/>
+                <w:webHidden/>
               </w:rPr>
               <w:fldChar w:fldCharType="separate"/>
             </w:r>
@@ -748,8 +646,6 @@
               <w:rPr>
                 <w:noProof/>
                 <w:webHidden/>
-                <w:sz w:val="22"/>
-                <w:szCs w:val="22"/>
               </w:rPr>
               <w:t>10</w:t>
             </w:r>
@@ -757,8 +653,6 @@
               <w:rPr>
                 <w:noProof/>
                 <w:webHidden/>
-                <w:sz w:val="22"/>
-                <w:szCs w:val="22"/>
               </w:rPr>
               <w:fldChar w:fldCharType="end"/>
             </w:r>
@@ -771,19 +665,17 @@
               <w:tab w:val="right" w:leader="dot" w:pos="9016"/>
             </w:tabs>
             <w:rPr>
+              <w:rFonts w:eastAsiaTheme="minorEastAsia"/>
               <w:noProof/>
-              <w:sz w:val="22"/>
-              <w:szCs w:val="22"/>
+              <w:lang w:eastAsia="en-ZA"/>
             </w:rPr>
           </w:pPr>
-          <w:hyperlink w:anchor="_Toc237564304" w:history="1">
+          <w:hyperlink w:anchor="_Toc237788179" w:history="1">
             <w:r>
               <w:rPr>
                 <w:rStyle w:val="Hyperlink"/>
                 <w:rFonts w:ascii="Aptos" w:eastAsia="Aptos" w:hAnsi="Aptos" w:cs="Aptos"/>
                 <w:noProof/>
-                <w:sz w:val="22"/>
-                <w:szCs w:val="22"/>
               </w:rPr>
               <w:t>7. Timeline and Milestones</w:t>
             </w:r>
@@ -791,8 +683,6 @@
               <w:rPr>
                 <w:noProof/>
                 <w:webHidden/>
-                <w:sz w:val="22"/>
-                <w:szCs w:val="22"/>
               </w:rPr>
               <w:tab/>
             </w:r>
@@ -800,8 +690,6 @@
               <w:rPr>
                 <w:noProof/>
                 <w:webHidden/>
-                <w:sz w:val="22"/>
-                <w:szCs w:val="22"/>
               </w:rPr>
               <w:fldChar w:fldCharType="begin"/>
             </w:r>
@@ -809,25 +697,19 @@
               <w:rPr>
                 <w:noProof/>
                 <w:webHidden/>
-                <w:sz w:val="22"/>
-                <w:szCs w:val="22"/>
-              </w:rPr>
-              <w:instrText xml:space="preserve"> PAGEREF _Toc237564304 \h </w:instrText>
-            </w:r>
-            <w:r>
-              <w:rPr>
-                <w:noProof/>
-                <w:webHidden/>
-                <w:sz w:val="22"/>
-                <w:szCs w:val="22"/>
-              </w:rPr>
-            </w:r>
-            <w:r>
-              <w:rPr>
-                <w:noProof/>
-                <w:webHidden/>
-                <w:sz w:val="22"/>
-                <w:szCs w:val="22"/>
+              </w:rPr>
+              <w:instrText xml:space="preserve"> PAGEREF _Toc237788179 \h </w:instrText>
+            </w:r>
+            <w:r>
+              <w:rPr>
+                <w:noProof/>
+                <w:webHidden/>
+              </w:rPr>
+            </w:r>
+            <w:r>
+              <w:rPr>
+                <w:noProof/>
+                <w:webHidden/>
               </w:rPr>
               <w:fldChar w:fldCharType="separate"/>
             </w:r>
@@ -835,8 +717,6 @@
               <w:rPr>
                 <w:noProof/>
                 <w:webHidden/>
-                <w:sz w:val="22"/>
-                <w:szCs w:val="22"/>
               </w:rPr>
               <w:t>10</w:t>
             </w:r>
@@ -844,8 +724,6 @@
               <w:rPr>
                 <w:noProof/>
                 <w:webHidden/>
-                <w:sz w:val="22"/>
-                <w:szCs w:val="22"/>
               </w:rPr>
               <w:fldChar w:fldCharType="end"/>
             </w:r>
@@ -858,19 +736,17 @@
               <w:tab w:val="right" w:leader="dot" w:pos="9016"/>
             </w:tabs>
             <w:rPr>
+              <w:rFonts w:eastAsiaTheme="minorEastAsia"/>
               <w:noProof/>
-              <w:sz w:val="22"/>
-              <w:szCs w:val="22"/>
+              <w:lang w:eastAsia="en-ZA"/>
             </w:rPr>
           </w:pPr>
-          <w:hyperlink w:anchor="_Toc237564305" w:history="1">
+          <w:hyperlink w:anchor="_Toc237788180" w:history="1">
             <w:r>
               <w:rPr>
                 <w:rStyle w:val="Hyperlink"/>
                 <w:rFonts w:ascii="Aptos" w:eastAsia="Aptos" w:hAnsi="Aptos" w:cs="Aptos"/>
                 <w:noProof/>
-                <w:sz w:val="22"/>
-                <w:szCs w:val="22"/>
               </w:rPr>
               <w:t>8. Budget</w:t>
             </w:r>
@@ -878,8 +754,6 @@
               <w:rPr>
                 <w:noProof/>
                 <w:webHidden/>
-                <w:sz w:val="22"/>
-                <w:szCs w:val="22"/>
               </w:rPr>
               <w:tab/>
             </w:r>
@@ -887,8 +761,6 @@
               <w:rPr>
                 <w:noProof/>
                 <w:webHidden/>
-                <w:sz w:val="22"/>
-                <w:szCs w:val="22"/>
               </w:rPr>
               <w:fldChar w:fldCharType="begin"/>
             </w:r>
@@ -896,25 +768,19 @@
               <w:rPr>
                 <w:noProof/>
                 <w:webHidden/>
-                <w:sz w:val="22"/>
-                <w:szCs w:val="22"/>
-              </w:rPr>
-              <w:instrText xml:space="preserve"> PAGEREF _Toc237564305 \h </w:instrText>
-            </w:r>
-            <w:r>
-              <w:rPr>
-                <w:noProof/>
-                <w:webHidden/>
-                <w:sz w:val="22"/>
-                <w:szCs w:val="22"/>
-              </w:rPr>
-            </w:r>
-            <w:r>
-              <w:rPr>
-                <w:noProof/>
-                <w:webHidden/>
-                <w:sz w:val="22"/>
-                <w:szCs w:val="22"/>
+              </w:rPr>
+              <w:instrText xml:space="preserve"> PAGEREF _Toc237788180 \h </w:instrText>
+            </w:r>
+            <w:r>
+              <w:rPr>
+                <w:noProof/>
+                <w:webHidden/>
+              </w:rPr>
+            </w:r>
+            <w:r>
+              <w:rPr>
+                <w:noProof/>
+                <w:webHidden/>
               </w:rPr>
               <w:fldChar w:fldCharType="separate"/>
             </w:r>
@@ -922,8 +788,6 @@
               <w:rPr>
                 <w:noProof/>
                 <w:webHidden/>
-                <w:sz w:val="22"/>
-                <w:szCs w:val="22"/>
               </w:rPr>
               <w:t>10</w:t>
             </w:r>
@@ -931,8 +795,6 @@
               <w:rPr>
                 <w:noProof/>
                 <w:webHidden/>
-                <w:sz w:val="22"/>
-                <w:szCs w:val="22"/>
               </w:rPr>
               <w:fldChar w:fldCharType="end"/>
             </w:r>
@@ -945,19 +807,17 @@
               <w:tab w:val="right" w:leader="dot" w:pos="9016"/>
             </w:tabs>
             <w:rPr>
+              <w:rFonts w:eastAsiaTheme="minorEastAsia"/>
               <w:noProof/>
-              <w:sz w:val="22"/>
-              <w:szCs w:val="22"/>
+              <w:lang w:eastAsia="en-ZA"/>
             </w:rPr>
           </w:pPr>
-          <w:hyperlink w:anchor="_Toc237564306" w:history="1">
+          <w:hyperlink w:anchor="_Toc237788181" w:history="1">
             <w:r>
               <w:rPr>
                 <w:rStyle w:val="Hyperlink"/>
                 <w:rFonts w:ascii="Aptos" w:eastAsia="Aptos" w:hAnsi="Aptos" w:cs="Aptos"/>
                 <w:noProof/>
-                <w:sz w:val="22"/>
-                <w:szCs w:val="22"/>
               </w:rPr>
               <w:t>9. References</w:t>
             </w:r>
@@ -965,8 +825,6 @@
               <w:rPr>
                 <w:noProof/>
                 <w:webHidden/>
-                <w:sz w:val="22"/>
-                <w:szCs w:val="22"/>
               </w:rPr>
               <w:tab/>
             </w:r>
@@ -974,8 +832,6 @@
               <w:rPr>
                 <w:noProof/>
                 <w:webHidden/>
-                <w:sz w:val="22"/>
-                <w:szCs w:val="22"/>
               </w:rPr>
               <w:fldChar w:fldCharType="begin"/>
             </w:r>
@@ -983,25 +839,19 @@
               <w:rPr>
                 <w:noProof/>
                 <w:webHidden/>
-                <w:sz w:val="22"/>
-                <w:szCs w:val="22"/>
-              </w:rPr>
-              <w:instrText xml:space="preserve"> PAGEREF _Toc237564306 \h </w:instrText>
-            </w:r>
-            <w:r>
-              <w:rPr>
-                <w:noProof/>
-                <w:webHidden/>
-                <w:sz w:val="22"/>
-                <w:szCs w:val="22"/>
-              </w:rPr>
-            </w:r>
-            <w:r>
-              <w:rPr>
-                <w:noProof/>
-                <w:webHidden/>
-                <w:sz w:val="22"/>
-                <w:szCs w:val="22"/>
+              </w:rPr>
+              <w:instrText xml:space="preserve"> PAGEREF _Toc237788181 \h </w:instrText>
+            </w:r>
+            <w:r>
+              <w:rPr>
+                <w:noProof/>
+                <w:webHidden/>
+              </w:rPr>
+            </w:r>
+            <w:r>
+              <w:rPr>
+                <w:noProof/>
+                <w:webHidden/>
               </w:rPr>
               <w:fldChar w:fldCharType="separate"/>
             </w:r>
@@ -1009,8 +859,6 @@
               <w:rPr>
                 <w:noProof/>
                 <w:webHidden/>
-                <w:sz w:val="22"/>
-                <w:szCs w:val="22"/>
               </w:rPr>
               <w:t>10</w:t>
             </w:r>
@@ -1018,8 +866,6 @@
               <w:rPr>
                 <w:noProof/>
                 <w:webHidden/>
-                <w:sz w:val="22"/>
-                <w:szCs w:val="22"/>
               </w:rPr>
               <w:fldChar w:fldCharType="end"/>
             </w:r>
@@ -1032,19 +878,17 @@
               <w:tab w:val="right" w:leader="dot" w:pos="9016"/>
             </w:tabs>
             <w:rPr>
+              <w:rFonts w:eastAsiaTheme="minorEastAsia"/>
               <w:noProof/>
-              <w:sz w:val="22"/>
-              <w:szCs w:val="22"/>
+              <w:lang w:eastAsia="en-ZA"/>
             </w:rPr>
           </w:pPr>
-          <w:hyperlink w:anchor="_Toc237564307" w:history="1">
+          <w:hyperlink w:anchor="_Toc237788182" w:history="1">
             <w:r>
               <w:rPr>
                 <w:rStyle w:val="Hyperlink"/>
                 <w:rFonts w:ascii="Aptos" w:eastAsia="Aptos" w:hAnsi="Aptos" w:cs="Aptos"/>
                 <w:noProof/>
-                <w:sz w:val="22"/>
-                <w:szCs w:val="22"/>
               </w:rPr>
               <w:t>Proposal 2: Kelder &amp; Vine (Small Business — Boutique Wine &amp; Deli)</w:t>
             </w:r>
@@ -1052,8 +896,6 @@
               <w:rPr>
                 <w:noProof/>
                 <w:webHidden/>
-                <w:sz w:val="22"/>
-                <w:szCs w:val="22"/>
               </w:rPr>
               <w:tab/>
             </w:r>
@@ -1061,8 +903,6 @@
               <w:rPr>
                 <w:noProof/>
                 <w:webHidden/>
-                <w:sz w:val="22"/>
-                <w:szCs w:val="22"/>
               </w:rPr>
               <w:fldChar w:fldCharType="begin"/>
             </w:r>
@@ -1070,25 +910,19 @@
               <w:rPr>
                 <w:noProof/>
                 <w:webHidden/>
-                <w:sz w:val="22"/>
-                <w:szCs w:val="22"/>
-              </w:rPr>
-              <w:instrText xml:space="preserve"> PAGEREF _Toc237564307 \h </w:instrText>
-            </w:r>
-            <w:r>
-              <w:rPr>
-                <w:noProof/>
-                <w:webHidden/>
-                <w:sz w:val="22"/>
-                <w:szCs w:val="22"/>
-              </w:rPr>
-            </w:r>
-            <w:r>
-              <w:rPr>
-                <w:noProof/>
-                <w:webHidden/>
-                <w:sz w:val="22"/>
-                <w:szCs w:val="22"/>
+              </w:rPr>
+              <w:instrText xml:space="preserve"> PAGEREF _Toc237788182 \h </w:instrText>
+            </w:r>
+            <w:r>
+              <w:rPr>
+                <w:noProof/>
+                <w:webHidden/>
+              </w:rPr>
+            </w:r>
+            <w:r>
+              <w:rPr>
+                <w:noProof/>
+                <w:webHidden/>
               </w:rPr>
               <w:fldChar w:fldCharType="separate"/>
             </w:r>
@@ -1096,8 +930,6 @@
               <w:rPr>
                 <w:noProof/>
                 <w:webHidden/>
-                <w:sz w:val="22"/>
-                <w:szCs w:val="22"/>
               </w:rPr>
               <w:t>11</w:t>
             </w:r>
@@ -1105,8 +937,6 @@
               <w:rPr>
                 <w:noProof/>
                 <w:webHidden/>
-                <w:sz w:val="22"/>
-                <w:szCs w:val="22"/>
               </w:rPr>
               <w:fldChar w:fldCharType="end"/>
             </w:r>
@@ -1119,19 +949,17 @@
               <w:tab w:val="right" w:leader="dot" w:pos="9016"/>
             </w:tabs>
             <w:rPr>
+              <w:rFonts w:eastAsiaTheme="minorEastAsia"/>
               <w:noProof/>
-              <w:sz w:val="22"/>
-              <w:szCs w:val="22"/>
+              <w:lang w:eastAsia="en-ZA"/>
             </w:rPr>
           </w:pPr>
-          <w:hyperlink w:anchor="_Toc237564308" w:history="1">
+          <w:hyperlink w:anchor="_Toc237788183" w:history="1">
             <w:r>
               <w:rPr>
                 <w:rStyle w:val="Hyperlink"/>
                 <w:rFonts w:ascii="Aptos" w:eastAsia="Aptos" w:hAnsi="Aptos" w:cs="Aptos"/>
                 <w:noProof/>
-                <w:sz w:val="22"/>
-                <w:szCs w:val="22"/>
               </w:rPr>
               <w:t>1. Organisation Overview</w:t>
             </w:r>
@@ -1139,8 +967,6 @@
               <w:rPr>
                 <w:noProof/>
                 <w:webHidden/>
-                <w:sz w:val="22"/>
-                <w:szCs w:val="22"/>
               </w:rPr>
               <w:tab/>
             </w:r>
@@ -1148,8 +974,6 @@
               <w:rPr>
                 <w:noProof/>
                 <w:webHidden/>
-                <w:sz w:val="22"/>
-                <w:szCs w:val="22"/>
               </w:rPr>
               <w:fldChar w:fldCharType="begin"/>
             </w:r>
@@ -1157,25 +981,19 @@
               <w:rPr>
                 <w:noProof/>
                 <w:webHidden/>
-                <w:sz w:val="22"/>
-                <w:szCs w:val="22"/>
-              </w:rPr>
-              <w:instrText xml:space="preserve"> PAGEREF _Toc237564308 \h </w:instrText>
-            </w:r>
-            <w:r>
-              <w:rPr>
-                <w:noProof/>
-                <w:webHidden/>
-                <w:sz w:val="22"/>
-                <w:szCs w:val="22"/>
-              </w:rPr>
-            </w:r>
-            <w:r>
-              <w:rPr>
-                <w:noProof/>
-                <w:webHidden/>
-                <w:sz w:val="22"/>
-                <w:szCs w:val="22"/>
+              </w:rPr>
+              <w:instrText xml:space="preserve"> PAGEREF _Toc237788183 \h </w:instrText>
+            </w:r>
+            <w:r>
+              <w:rPr>
+                <w:noProof/>
+                <w:webHidden/>
+              </w:rPr>
+            </w:r>
+            <w:r>
+              <w:rPr>
+                <w:noProof/>
+                <w:webHidden/>
               </w:rPr>
               <w:fldChar w:fldCharType="separate"/>
             </w:r>
@@ -1183,8 +1001,6 @@
               <w:rPr>
                 <w:noProof/>
                 <w:webHidden/>
-                <w:sz w:val="22"/>
-                <w:szCs w:val="22"/>
               </w:rPr>
               <w:t>11</w:t>
             </w:r>
@@ -1192,8 +1008,6 @@
               <w:rPr>
                 <w:noProof/>
                 <w:webHidden/>
-                <w:sz w:val="22"/>
-                <w:szCs w:val="22"/>
               </w:rPr>
               <w:fldChar w:fldCharType="end"/>
             </w:r>
@@ -1206,19 +1020,17 @@
               <w:tab w:val="right" w:leader="dot" w:pos="9016"/>
             </w:tabs>
             <w:rPr>
+              <w:rFonts w:eastAsiaTheme="minorEastAsia"/>
               <w:noProof/>
-              <w:sz w:val="22"/>
-              <w:szCs w:val="22"/>
+              <w:lang w:eastAsia="en-ZA"/>
             </w:rPr>
           </w:pPr>
-          <w:hyperlink w:anchor="_Toc237564309" w:history="1">
+          <w:hyperlink w:anchor="_Toc237788184" w:history="1">
             <w:r>
               <w:rPr>
                 <w:rStyle w:val="Hyperlink"/>
                 <w:rFonts w:ascii="Aptos" w:eastAsia="Aptos" w:hAnsi="Aptos" w:cs="Aptos"/>
                 <w:noProof/>
-                <w:sz w:val="22"/>
-                <w:szCs w:val="22"/>
               </w:rPr>
               <w:t>2. Website Goals and Objectives</w:t>
             </w:r>
@@ -1226,8 +1038,6 @@
               <w:rPr>
                 <w:noProof/>
                 <w:webHidden/>
-                <w:sz w:val="22"/>
-                <w:szCs w:val="22"/>
               </w:rPr>
               <w:tab/>
             </w:r>
@@ -1235,8 +1045,6 @@
               <w:rPr>
                 <w:noProof/>
                 <w:webHidden/>
-                <w:sz w:val="22"/>
-                <w:szCs w:val="22"/>
               </w:rPr>
               <w:fldChar w:fldCharType="begin"/>
             </w:r>
@@ -1244,25 +1052,19 @@
               <w:rPr>
                 <w:noProof/>
                 <w:webHidden/>
-                <w:sz w:val="22"/>
-                <w:szCs w:val="22"/>
-              </w:rPr>
-              <w:instrText xml:space="preserve"> PAGEREF _Toc237564309 \h </w:instrText>
-            </w:r>
-            <w:r>
-              <w:rPr>
-                <w:noProof/>
-                <w:webHidden/>
-                <w:sz w:val="22"/>
-                <w:szCs w:val="22"/>
-              </w:rPr>
-            </w:r>
-            <w:r>
-              <w:rPr>
-                <w:noProof/>
-                <w:webHidden/>
-                <w:sz w:val="22"/>
-                <w:szCs w:val="22"/>
+              </w:rPr>
+              <w:instrText xml:space="preserve"> PAGEREF _Toc237788184 \h </w:instrText>
+            </w:r>
+            <w:r>
+              <w:rPr>
+                <w:noProof/>
+                <w:webHidden/>
+              </w:rPr>
+            </w:r>
+            <w:r>
+              <w:rPr>
+                <w:noProof/>
+                <w:webHidden/>
               </w:rPr>
               <w:fldChar w:fldCharType="separate"/>
             </w:r>
@@ -1270,8 +1072,6 @@
               <w:rPr>
                 <w:noProof/>
                 <w:webHidden/>
-                <w:sz w:val="22"/>
-                <w:szCs w:val="22"/>
               </w:rPr>
               <w:t>11</w:t>
             </w:r>
@@ -1279,8 +1079,6 @@
               <w:rPr>
                 <w:noProof/>
                 <w:webHidden/>
-                <w:sz w:val="22"/>
-                <w:szCs w:val="22"/>
               </w:rPr>
               <w:fldChar w:fldCharType="end"/>
             </w:r>
@@ -1293,19 +1091,17 @@
               <w:tab w:val="right" w:leader="dot" w:pos="9016"/>
             </w:tabs>
             <w:rPr>
+              <w:rFonts w:eastAsiaTheme="minorEastAsia"/>
               <w:noProof/>
-              <w:sz w:val="22"/>
-              <w:szCs w:val="22"/>
+              <w:lang w:eastAsia="en-ZA"/>
             </w:rPr>
           </w:pPr>
-          <w:hyperlink w:anchor="_Toc237564310" w:history="1">
+          <w:hyperlink w:anchor="_Toc237788185" w:history="1">
             <w:r>
               <w:rPr>
                 <w:rStyle w:val="Hyperlink"/>
                 <w:rFonts w:ascii="Aptos" w:eastAsia="Aptos" w:hAnsi="Aptos" w:cs="Aptos"/>
                 <w:noProof/>
-                <w:sz w:val="22"/>
-                <w:szCs w:val="22"/>
               </w:rPr>
               <w:t>3. Current Website Analysis</w:t>
             </w:r>
@@ -1313,8 +1109,6 @@
               <w:rPr>
                 <w:noProof/>
                 <w:webHidden/>
-                <w:sz w:val="22"/>
-                <w:szCs w:val="22"/>
               </w:rPr>
               <w:tab/>
             </w:r>
@@ -1322,8 +1116,6 @@
               <w:rPr>
                 <w:noProof/>
                 <w:webHidden/>
-                <w:sz w:val="22"/>
-                <w:szCs w:val="22"/>
               </w:rPr>
               <w:fldChar w:fldCharType="begin"/>
             </w:r>
@@ -1331,25 +1123,19 @@
               <w:rPr>
                 <w:noProof/>
                 <w:webHidden/>
-                <w:sz w:val="22"/>
-                <w:szCs w:val="22"/>
-              </w:rPr>
-              <w:instrText xml:space="preserve"> PAGEREF _Toc237564310 \h </w:instrText>
-            </w:r>
-            <w:r>
-              <w:rPr>
-                <w:noProof/>
-                <w:webHidden/>
-                <w:sz w:val="22"/>
-                <w:szCs w:val="22"/>
-              </w:rPr>
-            </w:r>
-            <w:r>
-              <w:rPr>
-                <w:noProof/>
-                <w:webHidden/>
-                <w:sz w:val="22"/>
-                <w:szCs w:val="22"/>
+              </w:rPr>
+              <w:instrText xml:space="preserve"> PAGEREF _Toc237788185 \h </w:instrText>
+            </w:r>
+            <w:r>
+              <w:rPr>
+                <w:noProof/>
+                <w:webHidden/>
+              </w:rPr>
+            </w:r>
+            <w:r>
+              <w:rPr>
+                <w:noProof/>
+                <w:webHidden/>
               </w:rPr>
               <w:fldChar w:fldCharType="separate"/>
             </w:r>
@@ -1357,8 +1143,6 @@
               <w:rPr>
                 <w:noProof/>
                 <w:webHidden/>
-                <w:sz w:val="22"/>
-                <w:szCs w:val="22"/>
               </w:rPr>
               <w:t>11</w:t>
             </w:r>
@@ -1366,8 +1150,6 @@
               <w:rPr>
                 <w:noProof/>
                 <w:webHidden/>
-                <w:sz w:val="22"/>
-                <w:szCs w:val="22"/>
               </w:rPr>
               <w:fldChar w:fldCharType="end"/>
             </w:r>
@@ -1380,19 +1162,17 @@
               <w:tab w:val="right" w:leader="dot" w:pos="9016"/>
             </w:tabs>
             <w:rPr>
+              <w:rFonts w:eastAsiaTheme="minorEastAsia"/>
               <w:noProof/>
-              <w:sz w:val="22"/>
-              <w:szCs w:val="22"/>
+              <w:lang w:eastAsia="en-ZA"/>
             </w:rPr>
           </w:pPr>
-          <w:hyperlink w:anchor="_Toc237564311" w:history="1">
+          <w:hyperlink w:anchor="_Toc237788186" w:history="1">
             <w:r>
               <w:rPr>
                 <w:rStyle w:val="Hyperlink"/>
                 <w:rFonts w:ascii="Aptos" w:eastAsia="Aptos" w:hAnsi="Aptos" w:cs="Aptos"/>
                 <w:noProof/>
-                <w:sz w:val="22"/>
-                <w:szCs w:val="22"/>
               </w:rPr>
               <w:t>4. Proposed Website Features and Functionality</w:t>
             </w:r>
@@ -1400,8 +1180,6 @@
               <w:rPr>
                 <w:noProof/>
                 <w:webHidden/>
-                <w:sz w:val="22"/>
-                <w:szCs w:val="22"/>
               </w:rPr>
               <w:tab/>
             </w:r>
@@ -1409,8 +1187,6 @@
               <w:rPr>
                 <w:noProof/>
                 <w:webHidden/>
-                <w:sz w:val="22"/>
-                <w:szCs w:val="22"/>
               </w:rPr>
               <w:fldChar w:fldCharType="begin"/>
             </w:r>
@@ -1418,25 +1194,19 @@
               <w:rPr>
                 <w:noProof/>
                 <w:webHidden/>
-                <w:sz w:val="22"/>
-                <w:szCs w:val="22"/>
-              </w:rPr>
-              <w:instrText xml:space="preserve"> PAGEREF _Toc237564311 \h </w:instrText>
-            </w:r>
-            <w:r>
-              <w:rPr>
-                <w:noProof/>
-                <w:webHidden/>
-                <w:sz w:val="22"/>
-                <w:szCs w:val="22"/>
-              </w:rPr>
-            </w:r>
-            <w:r>
-              <w:rPr>
-                <w:noProof/>
-                <w:webHidden/>
-                <w:sz w:val="22"/>
-                <w:szCs w:val="22"/>
+              </w:rPr>
+              <w:instrText xml:space="preserve"> PAGEREF _Toc237788186 \h </w:instrText>
+            </w:r>
+            <w:r>
+              <w:rPr>
+                <w:noProof/>
+                <w:webHidden/>
+              </w:rPr>
+            </w:r>
+            <w:r>
+              <w:rPr>
+                <w:noProof/>
+                <w:webHidden/>
               </w:rPr>
               <w:fldChar w:fldCharType="separate"/>
             </w:r>
@@ -1444,8 +1214,6 @@
               <w:rPr>
                 <w:noProof/>
                 <w:webHidden/>
-                <w:sz w:val="22"/>
-                <w:szCs w:val="22"/>
               </w:rPr>
               <w:t>11</w:t>
             </w:r>
@@ -1453,8 +1221,6 @@
               <w:rPr>
                 <w:noProof/>
                 <w:webHidden/>
-                <w:sz w:val="22"/>
-                <w:szCs w:val="22"/>
               </w:rPr>
               <w:fldChar w:fldCharType="end"/>
             </w:r>
@@ -1467,19 +1233,17 @@
               <w:tab w:val="right" w:leader="dot" w:pos="9016"/>
             </w:tabs>
             <w:rPr>
+              <w:rFonts w:eastAsiaTheme="minorEastAsia"/>
               <w:noProof/>
-              <w:sz w:val="22"/>
-              <w:szCs w:val="22"/>
+              <w:lang w:eastAsia="en-ZA"/>
             </w:rPr>
           </w:pPr>
-          <w:hyperlink w:anchor="_Toc237564312" w:history="1">
+          <w:hyperlink w:anchor="_Toc237788187" w:history="1">
             <w:r>
               <w:rPr>
                 <w:rStyle w:val="Hyperlink"/>
                 <w:rFonts w:ascii="Aptos" w:eastAsia="Aptos" w:hAnsi="Aptos" w:cs="Aptos"/>
                 <w:noProof/>
-                <w:sz w:val="22"/>
-                <w:szCs w:val="22"/>
               </w:rPr>
               <w:t>5. Design and User Experience</w:t>
             </w:r>
@@ -1487,8 +1251,6 @@
               <w:rPr>
                 <w:noProof/>
                 <w:webHidden/>
-                <w:sz w:val="22"/>
-                <w:szCs w:val="22"/>
               </w:rPr>
               <w:tab/>
             </w:r>
@@ -1496,8 +1258,6 @@
               <w:rPr>
                 <w:noProof/>
                 <w:webHidden/>
-                <w:sz w:val="22"/>
-                <w:szCs w:val="22"/>
               </w:rPr>
               <w:fldChar w:fldCharType="begin"/>
             </w:r>
@@ -1505,25 +1265,19 @@
               <w:rPr>
                 <w:noProof/>
                 <w:webHidden/>
-                <w:sz w:val="22"/>
-                <w:szCs w:val="22"/>
-              </w:rPr>
-              <w:instrText xml:space="preserve"> PAGEREF _Toc237564312 \h </w:instrText>
-            </w:r>
-            <w:r>
-              <w:rPr>
-                <w:noProof/>
-                <w:webHidden/>
-                <w:sz w:val="22"/>
-                <w:szCs w:val="22"/>
-              </w:rPr>
-            </w:r>
-            <w:r>
-              <w:rPr>
-                <w:noProof/>
-                <w:webHidden/>
-                <w:sz w:val="22"/>
-                <w:szCs w:val="22"/>
+              </w:rPr>
+              <w:instrText xml:space="preserve"> PAGEREF _Toc237788187 \h </w:instrText>
+            </w:r>
+            <w:r>
+              <w:rPr>
+                <w:noProof/>
+                <w:webHidden/>
+              </w:rPr>
+            </w:r>
+            <w:r>
+              <w:rPr>
+                <w:noProof/>
+                <w:webHidden/>
               </w:rPr>
               <w:fldChar w:fldCharType="separate"/>
             </w:r>
@@ -1531,8 +1285,6 @@
               <w:rPr>
                 <w:noProof/>
                 <w:webHidden/>
-                <w:sz w:val="22"/>
-                <w:szCs w:val="22"/>
               </w:rPr>
               <w:t>12</w:t>
             </w:r>
@@ -1540,8 +1292,6 @@
               <w:rPr>
                 <w:noProof/>
                 <w:webHidden/>
-                <w:sz w:val="22"/>
-                <w:szCs w:val="22"/>
               </w:rPr>
               <w:fldChar w:fldCharType="end"/>
             </w:r>
@@ -1554,19 +1304,17 @@
               <w:tab w:val="right" w:leader="dot" w:pos="9016"/>
             </w:tabs>
             <w:rPr>
+              <w:rFonts w:eastAsiaTheme="minorEastAsia"/>
               <w:noProof/>
-              <w:sz w:val="22"/>
-              <w:szCs w:val="22"/>
+              <w:lang w:eastAsia="en-ZA"/>
             </w:rPr>
           </w:pPr>
-          <w:hyperlink w:anchor="_Toc237564313" w:history="1">
+          <w:hyperlink w:anchor="_Toc237788188" w:history="1">
             <w:r>
               <w:rPr>
                 <w:rStyle w:val="Hyperlink"/>
                 <w:rFonts w:ascii="Aptos" w:eastAsia="Aptos" w:hAnsi="Aptos" w:cs="Aptos"/>
                 <w:noProof/>
-                <w:sz w:val="22"/>
-                <w:szCs w:val="22"/>
               </w:rPr>
               <w:t>6. Technical Requirements</w:t>
             </w:r>
@@ -1574,8 +1322,6 @@
               <w:rPr>
                 <w:noProof/>
                 <w:webHidden/>
-                <w:sz w:val="22"/>
-                <w:szCs w:val="22"/>
               </w:rPr>
               <w:tab/>
             </w:r>
@@ -1583,8 +1329,6 @@
               <w:rPr>
                 <w:noProof/>
                 <w:webHidden/>
-                <w:sz w:val="22"/>
-                <w:szCs w:val="22"/>
               </w:rPr>
               <w:fldChar w:fldCharType="begin"/>
             </w:r>
@@ -1592,25 +1336,19 @@
               <w:rPr>
                 <w:noProof/>
                 <w:webHidden/>
-                <w:sz w:val="22"/>
-                <w:szCs w:val="22"/>
-              </w:rPr>
-              <w:instrText xml:space="preserve"> PAGEREF _Toc237564313 \h </w:instrText>
-            </w:r>
-            <w:r>
-              <w:rPr>
-                <w:noProof/>
-                <w:webHidden/>
-                <w:sz w:val="22"/>
-                <w:szCs w:val="22"/>
-              </w:rPr>
-            </w:r>
-            <w:r>
-              <w:rPr>
-                <w:noProof/>
-                <w:webHidden/>
-                <w:sz w:val="22"/>
-                <w:szCs w:val="22"/>
+              </w:rPr>
+              <w:instrText xml:space="preserve"> PAGEREF _Toc237788188 \h </w:instrText>
+            </w:r>
+            <w:r>
+              <w:rPr>
+                <w:noProof/>
+                <w:webHidden/>
+              </w:rPr>
+            </w:r>
+            <w:r>
+              <w:rPr>
+                <w:noProof/>
+                <w:webHidden/>
               </w:rPr>
               <w:fldChar w:fldCharType="separate"/>
             </w:r>
@@ -1618,8 +1356,6 @@
               <w:rPr>
                 <w:noProof/>
                 <w:webHidden/>
-                <w:sz w:val="22"/>
-                <w:szCs w:val="22"/>
               </w:rPr>
               <w:t>17</w:t>
             </w:r>
@@ -1627,8 +1363,6 @@
               <w:rPr>
                 <w:noProof/>
                 <w:webHidden/>
-                <w:sz w:val="22"/>
-                <w:szCs w:val="22"/>
               </w:rPr>
               <w:fldChar w:fldCharType="end"/>
             </w:r>
@@ -1641,19 +1375,17 @@
               <w:tab w:val="right" w:leader="dot" w:pos="9016"/>
             </w:tabs>
             <w:rPr>
+              <w:rFonts w:eastAsiaTheme="minorEastAsia"/>
               <w:noProof/>
-              <w:sz w:val="22"/>
-              <w:szCs w:val="22"/>
+              <w:lang w:eastAsia="en-ZA"/>
             </w:rPr>
           </w:pPr>
-          <w:hyperlink w:anchor="_Toc237564314" w:history="1">
+          <w:hyperlink w:anchor="_Toc237788189" w:history="1">
             <w:r>
               <w:rPr>
                 <w:rStyle w:val="Hyperlink"/>
                 <w:rFonts w:ascii="Aptos" w:eastAsia="Aptos" w:hAnsi="Aptos" w:cs="Aptos"/>
                 <w:noProof/>
-                <w:sz w:val="22"/>
-                <w:szCs w:val="22"/>
               </w:rPr>
               <w:t>7. Timeline and Milestones</w:t>
             </w:r>
@@ -1661,8 +1393,6 @@
               <w:rPr>
                 <w:noProof/>
                 <w:webHidden/>
-                <w:sz w:val="22"/>
-                <w:szCs w:val="22"/>
               </w:rPr>
               <w:tab/>
             </w:r>
@@ -1670,8 +1400,6 @@
               <w:rPr>
                 <w:noProof/>
                 <w:webHidden/>
-                <w:sz w:val="22"/>
-                <w:szCs w:val="22"/>
               </w:rPr>
               <w:fldChar w:fldCharType="begin"/>
             </w:r>
@@ -1679,25 +1407,19 @@
               <w:rPr>
                 <w:noProof/>
                 <w:webHidden/>
-                <w:sz w:val="22"/>
-                <w:szCs w:val="22"/>
-              </w:rPr>
-              <w:instrText xml:space="preserve"> PAGEREF _Toc237564314 \h </w:instrText>
-            </w:r>
-            <w:r>
-              <w:rPr>
-                <w:noProof/>
-                <w:webHidden/>
-                <w:sz w:val="22"/>
-                <w:szCs w:val="22"/>
-              </w:rPr>
-            </w:r>
-            <w:r>
-              <w:rPr>
-                <w:noProof/>
-                <w:webHidden/>
-                <w:sz w:val="22"/>
-                <w:szCs w:val="22"/>
+              </w:rPr>
+              <w:instrText xml:space="preserve"> PAGEREF _Toc237788189 \h </w:instrText>
+            </w:r>
+            <w:r>
+              <w:rPr>
+                <w:noProof/>
+                <w:webHidden/>
+              </w:rPr>
+            </w:r>
+            <w:r>
+              <w:rPr>
+                <w:noProof/>
+                <w:webHidden/>
               </w:rPr>
               <w:fldChar w:fldCharType="separate"/>
             </w:r>
@@ -1705,8 +1427,6 @@
               <w:rPr>
                 <w:noProof/>
                 <w:webHidden/>
-                <w:sz w:val="22"/>
-                <w:szCs w:val="22"/>
               </w:rPr>
               <w:t>17</w:t>
             </w:r>
@@ -1714,8 +1434,6 @@
               <w:rPr>
                 <w:noProof/>
                 <w:webHidden/>
-                <w:sz w:val="22"/>
-                <w:szCs w:val="22"/>
               </w:rPr>
               <w:fldChar w:fldCharType="end"/>
             </w:r>
@@ -1728,19 +1446,17 @@
               <w:tab w:val="right" w:leader="dot" w:pos="9016"/>
             </w:tabs>
             <w:rPr>
+              <w:rFonts w:eastAsiaTheme="minorEastAsia"/>
               <w:noProof/>
-              <w:sz w:val="22"/>
-              <w:szCs w:val="22"/>
+              <w:lang w:eastAsia="en-ZA"/>
             </w:rPr>
           </w:pPr>
-          <w:hyperlink w:anchor="_Toc237564315" w:history="1">
+          <w:hyperlink w:anchor="_Toc237788190" w:history="1">
             <w:r>
               <w:rPr>
                 <w:rStyle w:val="Hyperlink"/>
                 <w:rFonts w:ascii="Aptos" w:eastAsia="Aptos" w:hAnsi="Aptos" w:cs="Aptos"/>
                 <w:noProof/>
-                <w:sz w:val="22"/>
-                <w:szCs w:val="22"/>
               </w:rPr>
               <w:t>8. Budget</w:t>
             </w:r>
@@ -1748,8 +1464,6 @@
               <w:rPr>
                 <w:noProof/>
                 <w:webHidden/>
-                <w:sz w:val="22"/>
-                <w:szCs w:val="22"/>
               </w:rPr>
               <w:tab/>
             </w:r>
@@ -1757,8 +1471,6 @@
               <w:rPr>
                 <w:noProof/>
                 <w:webHidden/>
-                <w:sz w:val="22"/>
-                <w:szCs w:val="22"/>
               </w:rPr>
               <w:fldChar w:fldCharType="begin"/>
             </w:r>
@@ -1766,25 +1478,19 @@
               <w:rPr>
                 <w:noProof/>
                 <w:webHidden/>
-                <w:sz w:val="22"/>
-                <w:szCs w:val="22"/>
-              </w:rPr>
-              <w:instrText xml:space="preserve"> PAGEREF _Toc237564315 \h </w:instrText>
-            </w:r>
-            <w:r>
-              <w:rPr>
-                <w:noProof/>
-                <w:webHidden/>
-                <w:sz w:val="22"/>
-                <w:szCs w:val="22"/>
-              </w:rPr>
-            </w:r>
-            <w:r>
-              <w:rPr>
-                <w:noProof/>
-                <w:webHidden/>
-                <w:sz w:val="22"/>
-                <w:szCs w:val="22"/>
+              </w:rPr>
+              <w:instrText xml:space="preserve"> PAGEREF _Toc237788190 \h </w:instrText>
+            </w:r>
+            <w:r>
+              <w:rPr>
+                <w:noProof/>
+                <w:webHidden/>
+              </w:rPr>
+            </w:r>
+            <w:r>
+              <w:rPr>
+                <w:noProof/>
+                <w:webHidden/>
               </w:rPr>
               <w:fldChar w:fldCharType="separate"/>
             </w:r>
@@ -1792,8 +1498,6 @@
               <w:rPr>
                 <w:noProof/>
                 <w:webHidden/>
-                <w:sz w:val="22"/>
-                <w:szCs w:val="22"/>
               </w:rPr>
               <w:t>17</w:t>
             </w:r>
@@ -1801,8 +1505,6 @@
               <w:rPr>
                 <w:noProof/>
                 <w:webHidden/>
-                <w:sz w:val="22"/>
-                <w:szCs w:val="22"/>
               </w:rPr>
               <w:fldChar w:fldCharType="end"/>
             </w:r>
@@ -1815,19 +1517,17 @@
               <w:tab w:val="right" w:leader="dot" w:pos="9016"/>
             </w:tabs>
             <w:rPr>
+              <w:rFonts w:eastAsiaTheme="minorEastAsia"/>
               <w:noProof/>
-              <w:sz w:val="22"/>
-              <w:szCs w:val="22"/>
+              <w:lang w:eastAsia="en-ZA"/>
             </w:rPr>
           </w:pPr>
-          <w:hyperlink w:anchor="_Toc237564316" w:history="1">
+          <w:hyperlink w:anchor="_Toc237788191" w:history="1">
             <w:r>
               <w:rPr>
                 <w:rStyle w:val="Hyperlink"/>
                 <w:rFonts w:ascii="Aptos" w:eastAsia="Aptos" w:hAnsi="Aptos" w:cs="Aptos"/>
                 <w:noProof/>
-                <w:sz w:val="22"/>
-                <w:szCs w:val="22"/>
               </w:rPr>
               <w:t>9. References</w:t>
             </w:r>
@@ -1835,8 +1535,6 @@
               <w:rPr>
                 <w:noProof/>
                 <w:webHidden/>
-                <w:sz w:val="22"/>
-                <w:szCs w:val="22"/>
               </w:rPr>
               <w:tab/>
             </w:r>
@@ -1844,8 +1542,6 @@
               <w:rPr>
                 <w:noProof/>
                 <w:webHidden/>
-                <w:sz w:val="22"/>
-                <w:szCs w:val="22"/>
               </w:rPr>
               <w:fldChar w:fldCharType="begin"/>
             </w:r>
@@ -1853,25 +1549,19 @@
               <w:rPr>
                 <w:noProof/>
                 <w:webHidden/>
-                <w:sz w:val="22"/>
-                <w:szCs w:val="22"/>
-              </w:rPr>
-              <w:instrText xml:space="preserve"> PAGEREF _Toc237564316 \h </w:instrText>
-            </w:r>
-            <w:r>
-              <w:rPr>
-                <w:noProof/>
-                <w:webHidden/>
-                <w:sz w:val="22"/>
-                <w:szCs w:val="22"/>
-              </w:rPr>
-            </w:r>
-            <w:r>
-              <w:rPr>
-                <w:noProof/>
-                <w:webHidden/>
-                <w:sz w:val="22"/>
-                <w:szCs w:val="22"/>
+              </w:rPr>
+              <w:instrText xml:space="preserve"> PAGEREF _Toc237788191 \h </w:instrText>
+            </w:r>
+            <w:r>
+              <w:rPr>
+                <w:noProof/>
+                <w:webHidden/>
+              </w:rPr>
+            </w:r>
+            <w:r>
+              <w:rPr>
+                <w:noProof/>
+                <w:webHidden/>
               </w:rPr>
               <w:fldChar w:fldCharType="separate"/>
             </w:r>
@@ -1879,8 +1569,6 @@
               <w:rPr>
                 <w:noProof/>
                 <w:webHidden/>
-                <w:sz w:val="22"/>
-                <w:szCs w:val="22"/>
               </w:rPr>
               <w:t>17</w:t>
             </w:r>
@@ -1888,8 +1576,221 @@
               <w:rPr>
                 <w:noProof/>
                 <w:webHidden/>
-                <w:sz w:val="22"/>
-                <w:szCs w:val="22"/>
+              </w:rPr>
+              <w:fldChar w:fldCharType="end"/>
+            </w:r>
+          </w:hyperlink>
+        </w:p>
+        <w:p>
+          <w:pPr>
+            <w:pStyle w:val="TOC2"/>
+            <w:tabs>
+              <w:tab w:val="right" w:leader="dot" w:pos="9016"/>
+            </w:tabs>
+            <w:rPr>
+              <w:rFonts w:eastAsiaTheme="minorEastAsia"/>
+              <w:noProof/>
+              <w:lang w:eastAsia="en-ZA"/>
+            </w:rPr>
+          </w:pPr>
+          <w:hyperlink w:anchor="_Toc237788192" w:history="1">
+            <w:r>
+              <w:rPr>
+                <w:rStyle w:val="Hyperlink"/>
+                <w:rFonts w:ascii="Aptos" w:hAnsi="Aptos"/>
+                <w:noProof/>
+              </w:rPr>
+              <w:t>3. Content Research and Sourcing — Paw Haven Animal Rescue</w:t>
+            </w:r>
+            <w:r>
+              <w:rPr>
+                <w:noProof/>
+                <w:webHidden/>
+              </w:rPr>
+              <w:tab/>
+            </w:r>
+            <w:r>
+              <w:rPr>
+                <w:noProof/>
+                <w:webHidden/>
+              </w:rPr>
+              <w:fldChar w:fldCharType="begin"/>
+            </w:r>
+            <w:r>
+              <w:rPr>
+                <w:noProof/>
+                <w:webHidden/>
+              </w:rPr>
+              <w:instrText xml:space="preserve"> PAGEREF _Toc237788192 \h </w:instrText>
+            </w:r>
+            <w:r>
+              <w:rPr>
+                <w:noProof/>
+                <w:webHidden/>
+              </w:rPr>
+            </w:r>
+            <w:r>
+              <w:rPr>
+                <w:noProof/>
+                <w:webHidden/>
+              </w:rPr>
+              <w:fldChar w:fldCharType="separate"/>
+            </w:r>
+            <w:r>
+              <w:rPr>
+                <w:noProof/>
+                <w:webHidden/>
+              </w:rPr>
+              <w:t>18</w:t>
+            </w:r>
+            <w:r>
+              <w:rPr>
+                <w:noProof/>
+                <w:webHidden/>
+              </w:rPr>
+              <w:fldChar w:fldCharType="end"/>
+            </w:r>
+          </w:hyperlink>
+        </w:p>
+        <w:p>
+          <w:pPr>
+            <w:pStyle w:val="TOC2"/>
+            <w:tabs>
+              <w:tab w:val="right" w:leader="dot" w:pos="9016"/>
+            </w:tabs>
+            <w:rPr>
+              <w:rFonts w:eastAsiaTheme="minorEastAsia"/>
+              <w:noProof/>
+              <w:lang w:eastAsia="en-ZA"/>
+            </w:rPr>
+          </w:pPr>
+          <w:hyperlink w:anchor="_Toc237788193" w:history="1">
+            <w:r>
+              <w:rPr>
+                <w:rStyle w:val="Hyperlink"/>
+                <w:rFonts w:ascii="Aptos" w:eastAsia="Times New Roman" w:hAnsi="Aptos"/>
+                <w:noProof/>
+                <w:bdr w:val="none" w:sz="0" w:space="0" w:color="auto" w:frame="1"/>
+                <w:lang w:eastAsia="en-ZA"/>
+              </w:rPr>
+              <w:t>Sitemap:</w:t>
+            </w:r>
+            <w:r>
+              <w:rPr>
+                <w:noProof/>
+                <w:webHidden/>
+              </w:rPr>
+              <w:tab/>
+            </w:r>
+            <w:r>
+              <w:rPr>
+                <w:noProof/>
+                <w:webHidden/>
+              </w:rPr>
+              <w:fldChar w:fldCharType="begin"/>
+            </w:r>
+            <w:r>
+              <w:rPr>
+                <w:noProof/>
+                <w:webHidden/>
+              </w:rPr>
+              <w:instrText xml:space="preserve"> PAGEREF _Toc237788193 \h </w:instrText>
+            </w:r>
+            <w:r>
+              <w:rPr>
+                <w:noProof/>
+                <w:webHidden/>
+              </w:rPr>
+            </w:r>
+            <w:r>
+              <w:rPr>
+                <w:noProof/>
+                <w:webHidden/>
+              </w:rPr>
+              <w:fldChar w:fldCharType="separate"/>
+            </w:r>
+            <w:r>
+              <w:rPr>
+                <w:noProof/>
+                <w:webHidden/>
+              </w:rPr>
+              <w:t>19</w:t>
+            </w:r>
+            <w:r>
+              <w:rPr>
+                <w:noProof/>
+                <w:webHidden/>
+              </w:rPr>
+              <w:fldChar w:fldCharType="end"/>
+            </w:r>
+          </w:hyperlink>
+        </w:p>
+        <w:p>
+          <w:pPr>
+            <w:pStyle w:val="TOC2"/>
+            <w:tabs>
+              <w:tab w:val="right" w:leader="dot" w:pos="9016"/>
+            </w:tabs>
+            <w:rPr>
+              <w:rFonts w:eastAsiaTheme="minorEastAsia"/>
+              <w:noProof/>
+              <w:lang w:eastAsia="en-ZA"/>
+            </w:rPr>
+          </w:pPr>
+          <w:hyperlink w:anchor="_Toc237788194" w:history="1">
+            <w:r>
+              <w:rPr>
+                <w:rStyle w:val="Hyperlink"/>
+                <w:rFonts w:ascii="Aptos" w:hAnsi="Aptos"/>
+                <w:noProof/>
+              </w:rPr>
+              <w:t>GIT HUB LINK</w:t>
+            </w:r>
+            <w:r>
+              <w:rPr>
+                <w:noProof/>
+                <w:webHidden/>
+              </w:rPr>
+              <w:tab/>
+            </w:r>
+            <w:r>
+              <w:rPr>
+                <w:noProof/>
+                <w:webHidden/>
+              </w:rPr>
+              <w:fldChar w:fldCharType="begin"/>
+            </w:r>
+            <w:r>
+              <w:rPr>
+                <w:noProof/>
+                <w:webHidden/>
+              </w:rPr>
+              <w:instrText xml:space="preserve"> PAGEREF _Toc237788194 \h </w:instrText>
+            </w:r>
+            <w:r>
+              <w:rPr>
+                <w:noProof/>
+                <w:webHidden/>
+              </w:rPr>
+            </w:r>
+            <w:r>
+              <w:rPr>
+                <w:noProof/>
+                <w:webHidden/>
+              </w:rPr>
+              <w:fldChar w:fldCharType="separate"/>
+            </w:r>
+            <w:r>
+              <w:rPr>
+                <w:noProof/>
+                <w:webHidden/>
+              </w:rPr>
+              <w:t>19</w:t>
+            </w:r>
+            <w:r>
+              <w:rPr>
+                <w:noProof/>
+                <w:webHidden/>
               </w:rPr>
               <w:fldChar w:fldCharType="end"/>
             </w:r>
@@ -1933,7 +1834,7 @@
         </w:rPr>
       </w:pPr>
       <w:bookmarkStart w:id="0" w:name="_Toc237557374"/>
-      <w:bookmarkStart w:id="1" w:name="_Toc237564297"/>
+      <w:bookmarkStart w:id="1" w:name="_Toc237788172"/>
       <w:r>
         <w:rPr>
           <w:rFonts w:ascii="Aptos" w:eastAsia="Aptos" w:hAnsi="Aptos" w:cs="Aptos"/>
@@ -1952,17 +1853,17 @@
         <w:spacing w:before="240" w:after="120" w:line="360" w:lineRule="auto"/>
         <w:jc w:val="both"/>
         <w:rPr>
-          <w:sz w:val="24"/>
-          <w:szCs w:val="24"/>
+          <w:sz w:val="26"/>
+          <w:szCs w:val="26"/>
         </w:rPr>
       </w:pPr>
       <w:bookmarkStart w:id="2" w:name="_Toc237557375"/>
-      <w:bookmarkStart w:id="3" w:name="_Toc237564298"/>
-      <w:r>
-        <w:rPr>
-          <w:rFonts w:ascii="Aptos" w:eastAsia="Aptos" w:hAnsi="Aptos" w:cs="Aptos"/>
-          <w:sz w:val="24"/>
-          <w:szCs w:val="24"/>
+      <w:bookmarkStart w:id="3" w:name="_Toc237788173"/>
+      <w:r>
+        <w:rPr>
+          <w:rFonts w:ascii="Aptos" w:eastAsia="Aptos" w:hAnsi="Aptos" w:cs="Aptos"/>
+          <w:sz w:val="26"/>
+          <w:szCs w:val="26"/>
         </w:rPr>
         <w:t>1. Organisation Overview</w:t>
       </w:r>
@@ -2085,17 +1986,17 @@
         <w:spacing w:before="240" w:after="120" w:line="360" w:lineRule="auto"/>
         <w:jc w:val="both"/>
         <w:rPr>
-          <w:sz w:val="24"/>
-          <w:szCs w:val="24"/>
+          <w:sz w:val="26"/>
+          <w:szCs w:val="26"/>
         </w:rPr>
       </w:pPr>
       <w:bookmarkStart w:id="4" w:name="_Toc237557376"/>
-      <w:bookmarkStart w:id="5" w:name="_Toc237564299"/>
-      <w:r>
-        <w:rPr>
-          <w:rFonts w:ascii="Aptos" w:eastAsia="Aptos" w:hAnsi="Aptos" w:cs="Aptos"/>
-          <w:sz w:val="24"/>
-          <w:szCs w:val="24"/>
+      <w:bookmarkStart w:id="5" w:name="_Toc237788174"/>
+      <w:r>
+        <w:rPr>
+          <w:rFonts w:ascii="Aptos" w:eastAsia="Aptos" w:hAnsi="Aptos" w:cs="Aptos"/>
+          <w:sz w:val="26"/>
+          <w:szCs w:val="26"/>
         </w:rPr>
         <w:t>2. Website Goals and Objectives</w:t>
       </w:r>
@@ -2264,17 +2165,17 @@
         <w:spacing w:before="240" w:after="120" w:line="360" w:lineRule="auto"/>
         <w:jc w:val="both"/>
         <w:rPr>
-          <w:sz w:val="24"/>
-          <w:szCs w:val="24"/>
+          <w:sz w:val="26"/>
+          <w:szCs w:val="26"/>
         </w:rPr>
       </w:pPr>
       <w:bookmarkStart w:id="6" w:name="_Toc237557377"/>
-      <w:bookmarkStart w:id="7" w:name="_Toc237564300"/>
-      <w:r>
-        <w:rPr>
-          <w:rFonts w:ascii="Aptos" w:eastAsia="Aptos" w:hAnsi="Aptos" w:cs="Aptos"/>
-          <w:sz w:val="24"/>
-          <w:szCs w:val="24"/>
+      <w:bookmarkStart w:id="7" w:name="_Toc237788175"/>
+      <w:r>
+        <w:rPr>
+          <w:rFonts w:ascii="Aptos" w:eastAsia="Aptos" w:hAnsi="Aptos" w:cs="Aptos"/>
+          <w:sz w:val="26"/>
+          <w:szCs w:val="26"/>
         </w:rPr>
         <w:t>3. Current Website Analysis</w:t>
       </w:r>
@@ -2335,17 +2236,17 @@
         <w:spacing w:before="240" w:after="120" w:line="360" w:lineRule="auto"/>
         <w:jc w:val="both"/>
         <w:rPr>
-          <w:sz w:val="28"/>
-          <w:szCs w:val="28"/>
+          <w:sz w:val="26"/>
+          <w:szCs w:val="26"/>
         </w:rPr>
       </w:pPr>
       <w:bookmarkStart w:id="8" w:name="_Toc237557378"/>
-      <w:bookmarkStart w:id="9" w:name="_Toc237564301"/>
-      <w:r>
-        <w:rPr>
-          <w:rFonts w:ascii="Aptos" w:eastAsia="Aptos" w:hAnsi="Aptos" w:cs="Aptos"/>
-          <w:sz w:val="24"/>
-          <w:szCs w:val="24"/>
+      <w:bookmarkStart w:id="9" w:name="_Toc237788176"/>
+      <w:r>
+        <w:rPr>
+          <w:rFonts w:ascii="Aptos" w:eastAsia="Aptos" w:hAnsi="Aptos" w:cs="Aptos"/>
+          <w:sz w:val="26"/>
+          <w:szCs w:val="26"/>
         </w:rPr>
         <w:lastRenderedPageBreak/>
         <w:t>4. Proposed Website Features and Functionality</w:t>
@@ -2459,17 +2360,17 @@
         <w:spacing w:before="240" w:after="120" w:line="360" w:lineRule="auto"/>
         <w:jc w:val="both"/>
         <w:rPr>
-          <w:sz w:val="24"/>
-          <w:szCs w:val="24"/>
+          <w:sz w:val="26"/>
+          <w:szCs w:val="26"/>
         </w:rPr>
       </w:pPr>
       <w:bookmarkStart w:id="10" w:name="_Toc237557379"/>
-      <w:bookmarkStart w:id="11" w:name="_Toc237564302"/>
-      <w:r>
-        <w:rPr>
-          <w:rFonts w:ascii="Aptos" w:eastAsia="Aptos" w:hAnsi="Aptos" w:cs="Aptos"/>
-          <w:sz w:val="24"/>
-          <w:szCs w:val="24"/>
+      <w:bookmarkStart w:id="11" w:name="_Toc237788177"/>
+      <w:r>
+        <w:rPr>
+          <w:rFonts w:ascii="Aptos" w:eastAsia="Aptos" w:hAnsi="Aptos" w:cs="Aptos"/>
+          <w:sz w:val="26"/>
+          <w:szCs w:val="26"/>
         </w:rPr>
         <w:t>5. Design and User Experience</w:t>
       </w:r>
@@ -3433,17 +3334,17 @@
         <w:spacing w:before="240" w:after="120" w:line="360" w:lineRule="auto"/>
         <w:jc w:val="both"/>
         <w:rPr>
-          <w:sz w:val="24"/>
-          <w:szCs w:val="24"/>
+          <w:sz w:val="26"/>
+          <w:szCs w:val="26"/>
         </w:rPr>
       </w:pPr>
       <w:bookmarkStart w:id="12" w:name="_Toc237557380"/>
-      <w:bookmarkStart w:id="13" w:name="_Toc237564303"/>
-      <w:r>
-        <w:rPr>
-          <w:rFonts w:ascii="Aptos" w:eastAsia="Aptos" w:hAnsi="Aptos" w:cs="Aptos"/>
-          <w:sz w:val="24"/>
-          <w:szCs w:val="24"/>
+      <w:bookmarkStart w:id="13" w:name="_Toc237788178"/>
+      <w:r>
+        <w:rPr>
+          <w:rFonts w:ascii="Aptos" w:eastAsia="Aptos" w:hAnsi="Aptos" w:cs="Aptos"/>
+          <w:sz w:val="26"/>
+          <w:szCs w:val="26"/>
         </w:rPr>
         <w:lastRenderedPageBreak/>
         <w:t>6. Technical Requirements</w:t>
@@ -3490,7 +3391,7 @@
         </w:rPr>
       </w:pPr>
       <w:bookmarkStart w:id="14" w:name="_Toc237557381"/>
-      <w:bookmarkStart w:id="15" w:name="_Toc237564304"/>
+      <w:bookmarkStart w:id="15" w:name="_Toc237788179"/>
       <w:r>
         <w:rPr>
           <w:rFonts w:ascii="Aptos" w:eastAsia="Aptos" w:hAnsi="Aptos" w:cs="Aptos"/>
@@ -3593,7 +3494,7 @@
         </w:rPr>
       </w:pPr>
       <w:bookmarkStart w:id="16" w:name="_Toc237557382"/>
-      <w:bookmarkStart w:id="17" w:name="_Toc237564305"/>
+      <w:bookmarkStart w:id="17" w:name="_Toc237788180"/>
       <w:r>
         <w:rPr>
           <w:rFonts w:ascii="Aptos" w:eastAsia="Aptos" w:hAnsi="Aptos" w:cs="Aptos"/>
@@ -3652,7 +3553,7 @@
         <w:jc w:val="both"/>
       </w:pPr>
       <w:bookmarkStart w:id="18" w:name="_Toc237557383"/>
-      <w:bookmarkStart w:id="19" w:name="_Toc237564306"/>
+      <w:bookmarkStart w:id="19" w:name="_Toc237788181"/>
       <w:r>
         <w:rPr>
           <w:rFonts w:ascii="Aptos" w:eastAsia="Aptos" w:hAnsi="Aptos" w:cs="Aptos"/>
@@ -3780,7 +3681,7 @@
         </w:rPr>
       </w:pPr>
       <w:bookmarkStart w:id="20" w:name="_Toc237557384"/>
-      <w:bookmarkStart w:id="21" w:name="_Toc237564307"/>
+      <w:bookmarkStart w:id="21" w:name="_Toc237788182"/>
       <w:r>
         <w:rPr>
           <w:rFonts w:ascii="Aptos" w:eastAsia="Aptos" w:hAnsi="Aptos" w:cs="Aptos"/>
@@ -3806,17 +3707,17 @@
         <w:pStyle w:val="Heading2"/>
         <w:spacing w:before="240" w:after="120" w:line="360" w:lineRule="auto"/>
         <w:rPr>
-          <w:sz w:val="24"/>
-          <w:szCs w:val="24"/>
+          <w:sz w:val="26"/>
+          <w:szCs w:val="26"/>
         </w:rPr>
       </w:pPr>
       <w:bookmarkStart w:id="22" w:name="_Toc237557385"/>
-      <w:bookmarkStart w:id="23" w:name="_Toc237564308"/>
-      <w:r>
-        <w:rPr>
-          <w:rFonts w:ascii="Aptos" w:eastAsia="Aptos" w:hAnsi="Aptos" w:cs="Aptos"/>
-          <w:sz w:val="24"/>
-          <w:szCs w:val="24"/>
+      <w:bookmarkStart w:id="23" w:name="_Toc237788183"/>
+      <w:r>
+        <w:rPr>
+          <w:rFonts w:ascii="Aptos" w:eastAsia="Aptos" w:hAnsi="Aptos" w:cs="Aptos"/>
+          <w:sz w:val="26"/>
+          <w:szCs w:val="26"/>
         </w:rPr>
         <w:t>1. Organisation Overview</w:t>
       </w:r>
@@ -3933,17 +3834,17 @@
         <w:pStyle w:val="Heading2"/>
         <w:spacing w:before="240" w:after="120" w:line="360" w:lineRule="auto"/>
         <w:rPr>
-          <w:sz w:val="24"/>
-          <w:szCs w:val="24"/>
+          <w:sz w:val="26"/>
+          <w:szCs w:val="26"/>
         </w:rPr>
       </w:pPr>
       <w:bookmarkStart w:id="24" w:name="_Toc237557386"/>
-      <w:bookmarkStart w:id="25" w:name="_Toc237564309"/>
-      <w:r>
-        <w:rPr>
-          <w:rFonts w:ascii="Aptos" w:eastAsia="Aptos" w:hAnsi="Aptos" w:cs="Aptos"/>
-          <w:sz w:val="24"/>
-          <w:szCs w:val="24"/>
+      <w:bookmarkStart w:id="25" w:name="_Toc237788184"/>
+      <w:r>
+        <w:rPr>
+          <w:rFonts w:ascii="Aptos" w:eastAsia="Aptos" w:hAnsi="Aptos" w:cs="Aptos"/>
+          <w:sz w:val="26"/>
+          <w:szCs w:val="26"/>
         </w:rPr>
         <w:t>2. Website Goals and Objectives</w:t>
       </w:r>
@@ -4084,17 +3985,17 @@
         <w:pStyle w:val="Heading2"/>
         <w:spacing w:before="240" w:after="120" w:line="360" w:lineRule="auto"/>
         <w:rPr>
-          <w:sz w:val="24"/>
-          <w:szCs w:val="24"/>
+          <w:sz w:val="26"/>
+          <w:szCs w:val="26"/>
         </w:rPr>
       </w:pPr>
       <w:bookmarkStart w:id="26" w:name="_Toc237557387"/>
-      <w:bookmarkStart w:id="27" w:name="_Toc237564310"/>
-      <w:r>
-        <w:rPr>
-          <w:rFonts w:ascii="Aptos" w:eastAsia="Aptos" w:hAnsi="Aptos" w:cs="Aptos"/>
-          <w:sz w:val="24"/>
-          <w:szCs w:val="24"/>
+      <w:bookmarkStart w:id="27" w:name="_Toc237788185"/>
+      <w:r>
+        <w:rPr>
+          <w:rFonts w:ascii="Aptos" w:eastAsia="Aptos" w:hAnsi="Aptos" w:cs="Aptos"/>
+          <w:sz w:val="26"/>
+          <w:szCs w:val="26"/>
         </w:rPr>
         <w:t>3. Current Website Analysis</w:t>
       </w:r>
@@ -4137,17 +4038,17 @@
         <w:pStyle w:val="Heading2"/>
         <w:spacing w:before="240" w:after="120" w:line="360" w:lineRule="auto"/>
         <w:rPr>
-          <w:sz w:val="24"/>
-          <w:szCs w:val="24"/>
+          <w:sz w:val="26"/>
+          <w:szCs w:val="26"/>
         </w:rPr>
       </w:pPr>
       <w:bookmarkStart w:id="28" w:name="_Toc237557388"/>
-      <w:bookmarkStart w:id="29" w:name="_Toc237564311"/>
-      <w:r>
-        <w:rPr>
-          <w:rFonts w:ascii="Aptos" w:eastAsia="Aptos" w:hAnsi="Aptos" w:cs="Aptos"/>
-          <w:sz w:val="24"/>
-          <w:szCs w:val="24"/>
+      <w:bookmarkStart w:id="29" w:name="_Toc237788186"/>
+      <w:r>
+        <w:rPr>
+          <w:rFonts w:ascii="Aptos" w:eastAsia="Aptos" w:hAnsi="Aptos" w:cs="Aptos"/>
+          <w:sz w:val="26"/>
+          <w:szCs w:val="26"/>
         </w:rPr>
         <w:t>4. Proposed Website Features and Functionality</w:t>
       </w:r>
@@ -4255,17 +4156,17 @@
         <w:pStyle w:val="Heading2"/>
         <w:spacing w:before="240" w:after="120" w:line="360" w:lineRule="auto"/>
         <w:rPr>
-          <w:sz w:val="24"/>
-          <w:szCs w:val="24"/>
+          <w:sz w:val="26"/>
+          <w:szCs w:val="26"/>
         </w:rPr>
       </w:pPr>
       <w:bookmarkStart w:id="30" w:name="_Toc237557389"/>
-      <w:bookmarkStart w:id="31" w:name="_Toc237564312"/>
-      <w:r>
-        <w:rPr>
-          <w:rFonts w:ascii="Aptos" w:eastAsia="Aptos" w:hAnsi="Aptos" w:cs="Aptos"/>
-          <w:sz w:val="24"/>
-          <w:szCs w:val="24"/>
+      <w:bookmarkStart w:id="31" w:name="_Toc237788187"/>
+      <w:r>
+        <w:rPr>
+          <w:rFonts w:ascii="Aptos" w:eastAsia="Aptos" w:hAnsi="Aptos" w:cs="Aptos"/>
+          <w:sz w:val="26"/>
+          <w:szCs w:val="26"/>
         </w:rPr>
         <w:t>5. Design and User Experience</w:t>
       </w:r>
@@ -4370,8 +4271,6 @@
     <w:p>
       <w:pPr>
         <w:spacing w:line="360" w:lineRule="auto"/>
-      </w:pPr>
-      <w:r>
         <w:rPr>
           <w:rFonts w:ascii="Aptos" w:eastAsia="Aptos" w:hAnsi="Aptos" w:cs="Aptos"/>
           <w:b/>
@@ -4379,6 +4278,153 @@
           <w:sz w:val="22"/>
           <w:szCs w:val="22"/>
         </w:rPr>
+      </w:pPr>
+    </w:p>
+    <w:p>
+      <w:pPr>
+        <w:spacing w:line="360" w:lineRule="auto"/>
+        <w:rPr>
+          <w:rFonts w:ascii="Aptos" w:eastAsia="Aptos" w:hAnsi="Aptos" w:cs="Aptos"/>
+          <w:b/>
+          <w:bCs/>
+          <w:sz w:val="22"/>
+          <w:szCs w:val="22"/>
+        </w:rPr>
+      </w:pPr>
+    </w:p>
+    <w:p>
+      <w:pPr>
+        <w:spacing w:line="360" w:lineRule="auto"/>
+        <w:rPr>
+          <w:rFonts w:ascii="Aptos" w:eastAsia="Aptos" w:hAnsi="Aptos" w:cs="Aptos"/>
+          <w:b/>
+          <w:bCs/>
+          <w:sz w:val="22"/>
+          <w:szCs w:val="22"/>
+        </w:rPr>
+      </w:pPr>
+    </w:p>
+    <w:p>
+      <w:pPr>
+        <w:spacing w:line="360" w:lineRule="auto"/>
+        <w:rPr>
+          <w:rFonts w:ascii="Aptos" w:eastAsia="Aptos" w:hAnsi="Aptos" w:cs="Aptos"/>
+          <w:b/>
+          <w:bCs/>
+          <w:sz w:val="22"/>
+          <w:szCs w:val="22"/>
+        </w:rPr>
+      </w:pPr>
+    </w:p>
+    <w:p>
+      <w:pPr>
+        <w:spacing w:line="360" w:lineRule="auto"/>
+        <w:rPr>
+          <w:rFonts w:ascii="Aptos" w:eastAsia="Aptos" w:hAnsi="Aptos" w:cs="Aptos"/>
+          <w:b/>
+          <w:bCs/>
+          <w:sz w:val="22"/>
+          <w:szCs w:val="22"/>
+        </w:rPr>
+      </w:pPr>
+    </w:p>
+    <w:p>
+      <w:pPr>
+        <w:spacing w:line="360" w:lineRule="auto"/>
+        <w:rPr>
+          <w:rFonts w:ascii="Aptos" w:eastAsia="Aptos" w:hAnsi="Aptos" w:cs="Aptos"/>
+          <w:b/>
+          <w:bCs/>
+          <w:sz w:val="22"/>
+          <w:szCs w:val="22"/>
+        </w:rPr>
+      </w:pPr>
+    </w:p>
+    <w:p>
+      <w:pPr>
+        <w:spacing w:line="360" w:lineRule="auto"/>
+        <w:rPr>
+          <w:rFonts w:ascii="Aptos" w:eastAsia="Aptos" w:hAnsi="Aptos" w:cs="Aptos"/>
+          <w:b/>
+          <w:bCs/>
+          <w:sz w:val="22"/>
+          <w:szCs w:val="22"/>
+        </w:rPr>
+      </w:pPr>
+    </w:p>
+    <w:p>
+      <w:pPr>
+        <w:spacing w:line="360" w:lineRule="auto"/>
+        <w:rPr>
+          <w:rFonts w:ascii="Aptos" w:eastAsia="Aptos" w:hAnsi="Aptos" w:cs="Aptos"/>
+          <w:b/>
+          <w:bCs/>
+          <w:sz w:val="22"/>
+          <w:szCs w:val="22"/>
+        </w:rPr>
+      </w:pPr>
+    </w:p>
+    <w:p>
+      <w:pPr>
+        <w:spacing w:line="360" w:lineRule="auto"/>
+        <w:rPr>
+          <w:rFonts w:ascii="Aptos" w:eastAsia="Aptos" w:hAnsi="Aptos" w:cs="Aptos"/>
+          <w:b/>
+          <w:bCs/>
+          <w:sz w:val="22"/>
+          <w:szCs w:val="22"/>
+        </w:rPr>
+      </w:pPr>
+    </w:p>
+    <w:p>
+      <w:pPr>
+        <w:spacing w:line="360" w:lineRule="auto"/>
+        <w:rPr>
+          <w:rFonts w:ascii="Aptos" w:eastAsia="Aptos" w:hAnsi="Aptos" w:cs="Aptos"/>
+          <w:b/>
+          <w:bCs/>
+          <w:sz w:val="22"/>
+          <w:szCs w:val="22"/>
+        </w:rPr>
+      </w:pPr>
+    </w:p>
+    <w:p>
+      <w:pPr>
+        <w:spacing w:line="360" w:lineRule="auto"/>
+        <w:rPr>
+          <w:rFonts w:ascii="Aptos" w:eastAsia="Aptos" w:hAnsi="Aptos" w:cs="Aptos"/>
+          <w:b/>
+          <w:bCs/>
+          <w:sz w:val="22"/>
+          <w:szCs w:val="22"/>
+        </w:rPr>
+      </w:pPr>
+    </w:p>
+    <w:p>
+      <w:pPr>
+        <w:spacing w:line="360" w:lineRule="auto"/>
+        <w:rPr>
+          <w:rFonts w:ascii="Aptos" w:eastAsia="Aptos" w:hAnsi="Aptos" w:cs="Aptos"/>
+          <w:b/>
+          <w:bCs/>
+          <w:sz w:val="22"/>
+          <w:szCs w:val="22"/>
+        </w:rPr>
+      </w:pPr>
+    </w:p>
+    <w:p>
+      <w:pPr>
+        <w:spacing w:line="360" w:lineRule="auto"/>
+      </w:pPr>
+      <w:r>
+        <w:rPr>
+          <w:rFonts w:ascii="Aptos" w:eastAsia="Aptos" w:hAnsi="Aptos" w:cs="Aptos"/>
+          <w:b/>
+          <w:bCs/>
+          <w:sz w:val="22"/>
+          <w:szCs w:val="22"/>
+        </w:rPr>
+        <w:lastRenderedPageBreak/>
         <w:t>Home page</w:t>
       </w:r>
     </w:p>
@@ -4390,7 +4436,6 @@
         <w:rPr>
           <w:noProof/>
         </w:rPr>
-        <w:lastRenderedPageBreak/>
         <w:drawing>
           <wp:inline distT="0" distB="0" distL="0" distR="0" wp14:anchorId="5920FF13" wp14:editId="5CD1BF25">
             <wp:extent cx="5105400" cy="3822700"/>
@@ -4493,8 +4538,6 @@
     <w:p>
       <w:pPr>
         <w:spacing w:line="360" w:lineRule="auto"/>
-      </w:pPr>
-      <w:r>
         <w:rPr>
           <w:rFonts w:ascii="Aptos" w:eastAsia="Aptos" w:hAnsi="Aptos" w:cs="Aptos"/>
           <w:b/>
@@ -4502,6 +4545,164 @@
           <w:sz w:val="22"/>
           <w:szCs w:val="22"/>
         </w:rPr>
+      </w:pPr>
+    </w:p>
+    <w:p>
+      <w:pPr>
+        <w:spacing w:line="360" w:lineRule="auto"/>
+        <w:rPr>
+          <w:rFonts w:ascii="Aptos" w:eastAsia="Aptos" w:hAnsi="Aptos" w:cs="Aptos"/>
+          <w:b/>
+          <w:bCs/>
+          <w:sz w:val="22"/>
+          <w:szCs w:val="22"/>
+        </w:rPr>
+      </w:pPr>
+    </w:p>
+    <w:p>
+      <w:pPr>
+        <w:spacing w:line="360" w:lineRule="auto"/>
+        <w:rPr>
+          <w:rFonts w:ascii="Aptos" w:eastAsia="Aptos" w:hAnsi="Aptos" w:cs="Aptos"/>
+          <w:b/>
+          <w:bCs/>
+          <w:sz w:val="22"/>
+          <w:szCs w:val="22"/>
+        </w:rPr>
+      </w:pPr>
+    </w:p>
+    <w:p>
+      <w:pPr>
+        <w:spacing w:line="360" w:lineRule="auto"/>
+        <w:rPr>
+          <w:rFonts w:ascii="Aptos" w:eastAsia="Aptos" w:hAnsi="Aptos" w:cs="Aptos"/>
+          <w:b/>
+          <w:bCs/>
+          <w:sz w:val="22"/>
+          <w:szCs w:val="22"/>
+        </w:rPr>
+      </w:pPr>
+    </w:p>
+    <w:p>
+      <w:pPr>
+        <w:spacing w:line="360" w:lineRule="auto"/>
+        <w:rPr>
+          <w:rFonts w:ascii="Aptos" w:eastAsia="Aptos" w:hAnsi="Aptos" w:cs="Aptos"/>
+          <w:b/>
+          <w:bCs/>
+          <w:sz w:val="22"/>
+          <w:szCs w:val="22"/>
+        </w:rPr>
+      </w:pPr>
+    </w:p>
+    <w:p>
+      <w:pPr>
+        <w:spacing w:line="360" w:lineRule="auto"/>
+        <w:rPr>
+          <w:rFonts w:ascii="Aptos" w:eastAsia="Aptos" w:hAnsi="Aptos" w:cs="Aptos"/>
+          <w:b/>
+          <w:bCs/>
+          <w:sz w:val="22"/>
+          <w:szCs w:val="22"/>
+        </w:rPr>
+      </w:pPr>
+    </w:p>
+    <w:p>
+      <w:pPr>
+        <w:spacing w:line="360" w:lineRule="auto"/>
+        <w:rPr>
+          <w:rFonts w:ascii="Aptos" w:eastAsia="Aptos" w:hAnsi="Aptos" w:cs="Aptos"/>
+          <w:b/>
+          <w:bCs/>
+          <w:sz w:val="22"/>
+          <w:szCs w:val="22"/>
+        </w:rPr>
+      </w:pPr>
+    </w:p>
+    <w:p>
+      <w:pPr>
+        <w:spacing w:line="360" w:lineRule="auto"/>
+        <w:rPr>
+          <w:rFonts w:ascii="Aptos" w:eastAsia="Aptos" w:hAnsi="Aptos" w:cs="Aptos"/>
+          <w:b/>
+          <w:bCs/>
+          <w:sz w:val="22"/>
+          <w:szCs w:val="22"/>
+        </w:rPr>
+      </w:pPr>
+    </w:p>
+    <w:p>
+      <w:pPr>
+        <w:spacing w:line="360" w:lineRule="auto"/>
+        <w:rPr>
+          <w:rFonts w:ascii="Aptos" w:eastAsia="Aptos" w:hAnsi="Aptos" w:cs="Aptos"/>
+          <w:b/>
+          <w:bCs/>
+          <w:sz w:val="22"/>
+          <w:szCs w:val="22"/>
+        </w:rPr>
+      </w:pPr>
+    </w:p>
+    <w:p>
+      <w:pPr>
+        <w:spacing w:line="360" w:lineRule="auto"/>
+        <w:rPr>
+          <w:rFonts w:ascii="Aptos" w:eastAsia="Aptos" w:hAnsi="Aptos" w:cs="Aptos"/>
+          <w:b/>
+          <w:bCs/>
+          <w:sz w:val="22"/>
+          <w:szCs w:val="22"/>
+        </w:rPr>
+      </w:pPr>
+    </w:p>
+    <w:p>
+      <w:pPr>
+        <w:spacing w:line="360" w:lineRule="auto"/>
+        <w:rPr>
+          <w:rFonts w:ascii="Aptos" w:eastAsia="Aptos" w:hAnsi="Aptos" w:cs="Aptos"/>
+          <w:b/>
+          <w:bCs/>
+          <w:sz w:val="22"/>
+          <w:szCs w:val="22"/>
+        </w:rPr>
+      </w:pPr>
+    </w:p>
+    <w:p>
+      <w:pPr>
+        <w:spacing w:line="360" w:lineRule="auto"/>
+        <w:rPr>
+          <w:rFonts w:ascii="Aptos" w:eastAsia="Aptos" w:hAnsi="Aptos" w:cs="Aptos"/>
+          <w:b/>
+          <w:bCs/>
+          <w:sz w:val="22"/>
+          <w:szCs w:val="22"/>
+        </w:rPr>
+      </w:pPr>
+    </w:p>
+    <w:p>
+      <w:pPr>
+        <w:spacing w:line="360" w:lineRule="auto"/>
+        <w:rPr>
+          <w:rFonts w:ascii="Aptos" w:eastAsia="Aptos" w:hAnsi="Aptos" w:cs="Aptos"/>
+          <w:b/>
+          <w:bCs/>
+          <w:sz w:val="22"/>
+          <w:szCs w:val="22"/>
+        </w:rPr>
+      </w:pPr>
+    </w:p>
+    <w:p>
+      <w:pPr>
+        <w:spacing w:line="360" w:lineRule="auto"/>
+      </w:pPr>
+      <w:r>
+        <w:rPr>
+          <w:rFonts w:ascii="Aptos" w:eastAsia="Aptos" w:hAnsi="Aptos" w:cs="Aptos"/>
+          <w:b/>
+          <w:bCs/>
+          <w:sz w:val="22"/>
+          <w:szCs w:val="22"/>
+        </w:rPr>
         <w:t>About page</w:t>
       </w:r>
     </w:p>
@@ -4513,7 +4714,6 @@
         <w:rPr>
           <w:noProof/>
         </w:rPr>
-        <w:lastRenderedPageBreak/>
         <w:drawing>
           <wp:inline distT="0" distB="0" distL="0" distR="0" wp14:anchorId="47B10325" wp14:editId="61049098">
             <wp:extent cx="5480050" cy="7727950"/>
@@ -4612,8 +4812,6 @@
         </w:rPr>
         <w:t>: About page wireframe — Kelder &amp; Vine. [Personal drawing].</w:t>
       </w:r>
-    </w:p>
-    <w:p>
       <w:r>
         <w:br w:type="page"/>
       </w:r>
@@ -5041,7 +5239,7 @@
         </w:rPr>
       </w:pPr>
       <w:bookmarkStart w:id="32" w:name="_Toc237557390"/>
-      <w:bookmarkStart w:id="33" w:name="_Toc237564313"/>
+      <w:bookmarkStart w:id="33" w:name="_Toc237788188"/>
       <w:r>
         <w:rPr>
           <w:rFonts w:ascii="Aptos" w:eastAsia="Aptos" w:hAnsi="Aptos" w:cs="Aptos"/>
@@ -5076,7 +5274,7 @@
         </w:rPr>
       </w:pPr>
       <w:bookmarkStart w:id="34" w:name="_Toc237557391"/>
-      <w:bookmarkStart w:id="35" w:name="_Toc237564314"/>
+      <w:bookmarkStart w:id="35" w:name="_Toc237788189"/>
       <w:r>
         <w:rPr>
           <w:rFonts w:ascii="Aptos" w:eastAsia="Aptos" w:hAnsi="Aptos" w:cs="Aptos"/>
@@ -5174,7 +5372,7 @@
         </w:rPr>
       </w:pPr>
       <w:bookmarkStart w:id="36" w:name="_Toc237557392"/>
-      <w:bookmarkStart w:id="37" w:name="_Toc237564315"/>
+      <w:bookmarkStart w:id="37" w:name="_Toc237788190"/>
       <w:r>
         <w:rPr>
           <w:rFonts w:ascii="Aptos" w:eastAsia="Aptos" w:hAnsi="Aptos" w:cs="Aptos"/>
@@ -5227,7 +5425,7 @@
         </w:rPr>
       </w:pPr>
       <w:bookmarkStart w:id="38" w:name="_Toc237557393"/>
-      <w:bookmarkStart w:id="39" w:name="_Toc237564316"/>
+      <w:bookmarkStart w:id="39" w:name="_Toc237788191"/>
       <w:r>
         <w:rPr>
           <w:rFonts w:ascii="Aptos" w:eastAsia="Aptos" w:hAnsi="Aptos" w:cs="Aptos"/>
@@ -5393,6 +5591,7 @@
         <w:lastRenderedPageBreak/>
         <w:t xml:space="preserve"> </w:t>
       </w:r>
+      <w:bookmarkStart w:id="40" w:name="_Toc237788192"/>
       <w:r>
         <w:rPr>
           <w:rFonts w:ascii="Aptos" w:hAnsi="Aptos"/>
@@ -5409,374 +5608,397 @@
         </w:rPr>
         <w:t>Content Research and Sourcing — Paw Haven Animal Rescue</w:t>
       </w:r>
-    </w:p>
-    <w:p>
-      <w:pPr>
-        <w:jc w:val="both"/>
-      </w:pPr>
-      <w:r>
-        <w:t>Organisational content (history, mission, vision, animal profiles) is original content</w:t>
-      </w:r>
-      <w:r>
-        <w:t xml:space="preserve"> </w:t>
-      </w:r>
-      <w:r>
-        <w:t>written for this fictional organisation and does not require citation.</w:t>
-      </w:r>
-      <w:r>
-        <w:rPr>
-          <w:rFonts w:ascii="Consolas" w:eastAsia="Times New Roman" w:hAnsi="Consolas" w:cs="Times New Roman"/>
-          <w:color w:val="BBBEBF"/>
-          <w:kern w:val="0"/>
-          <w:sz w:val="21"/>
-          <w:szCs w:val="21"/>
-          <w:lang w:eastAsia="en-ZA"/>
-          <w14:ligatures w14:val="none"/>
-        </w:rPr>
-        <w:t xml:space="preserve"> </w:t>
-      </w:r>
-      <w:r>
-        <w:t>No external text content has been copied from any source; all page copy is original.</w:t>
-      </w:r>
-    </w:p>
-    <w:p>
-      <w:pPr>
-        <w:jc w:val="both"/>
-        <w:rPr>
+      <w:bookmarkEnd w:id="40"/>
+    </w:p>
+    <w:p>
+      <w:pPr>
+        <w:rPr>
+          <w:rFonts w:ascii="Aptos" w:hAnsi="Aptos"/>
+          <w:sz w:val="22"/>
+          <w:szCs w:val="22"/>
+        </w:rPr>
+      </w:pPr>
+      <w:r>
+        <w:rPr>
+          <w:rFonts w:ascii="Aptos" w:hAnsi="Aptos"/>
+          <w:sz w:val="22"/>
+          <w:szCs w:val="22"/>
+        </w:rPr>
+        <w:t>Per Section 3.1 of the brief, this document records where each page's content came from.</w:t>
+      </w:r>
+    </w:p>
+    <w:p>
+      <w:pPr>
+        <w:rPr>
+          <w:rFonts w:ascii="Aptos" w:hAnsi="Aptos"/>
           <w:b/>
           <w:bCs/>
-          <w:u w:val="single"/>
-        </w:rPr>
-      </w:pPr>
-      <w:r>
-        <w:rPr>
+          <w:sz w:val="22"/>
+          <w:szCs w:val="22"/>
+        </w:rPr>
+      </w:pPr>
+      <w:r>
+        <w:rPr>
+          <w:rFonts w:ascii="Aptos" w:hAnsi="Aptos"/>
           <w:b/>
           <w:bCs/>
-          <w:u w:val="single"/>
-        </w:rPr>
-        <w:t>Per Section 3.1 of the brief, this document records where each page's content came from.</w:t>
-      </w:r>
-    </w:p>
-    <w:p>
-      <w:pPr>
-        <w:jc w:val="both"/>
-        <w:rPr>
-          <w:u w:val="single"/>
-        </w:rPr>
-      </w:pPr>
-      <w:r>
-        <w:rPr>
+          <w:sz w:val="22"/>
+          <w:szCs w:val="22"/>
+        </w:rPr>
+        <w:t>Home (index.html)</w:t>
+      </w:r>
+    </w:p>
+    <w:p>
+      <w:pPr>
+        <w:numPr>
+          <w:ilvl w:val="0"/>
+          <w:numId w:val="5"/>
+        </w:numPr>
+        <w:rPr>
+          <w:rFonts w:ascii="Aptos" w:hAnsi="Aptos"/>
+          <w:sz w:val="22"/>
+          <w:szCs w:val="22"/>
+        </w:rPr>
+      </w:pPr>
+      <w:r>
+        <w:rPr>
+          <w:rFonts w:ascii="Aptos" w:hAnsi="Aptos"/>
+          <w:sz w:val="22"/>
+          <w:szCs w:val="22"/>
+        </w:rPr>
+        <w:t>All text is original content written for this fictional organisation. No citation required.</w:t>
+      </w:r>
+    </w:p>
+    <w:p>
+      <w:pPr>
+        <w:rPr>
+          <w:rFonts w:ascii="Aptos" w:hAnsi="Aptos"/>
           <w:b/>
           <w:bCs/>
-        </w:rPr>
-        <w:t>Home (index.html)</w:t>
-      </w:r>
-    </w:p>
-    <w:p>
-      <w:pPr>
-        <w:pStyle w:val="ListParagraph"/>
+          <w:sz w:val="22"/>
+          <w:szCs w:val="22"/>
+        </w:rPr>
+      </w:pPr>
+      <w:r>
+        <w:rPr>
+          <w:rFonts w:ascii="Aptos" w:hAnsi="Aptos"/>
+          <w:b/>
+          <w:bCs/>
+          <w:sz w:val="22"/>
+          <w:szCs w:val="22"/>
+        </w:rPr>
+        <w:t>About (about.html)</w:t>
+      </w:r>
+    </w:p>
+    <w:p>
+      <w:pPr>
         <w:numPr>
           <w:ilvl w:val="0"/>
-          <w:numId w:val="3"/>
+          <w:numId w:val="6"/>
         </w:numPr>
-        <w:jc w:val="both"/>
-      </w:pPr>
-      <w:r>
-        <w:t xml:space="preserve">All text is original content written for this fictional organisation. No citation </w:t>
-      </w:r>
-      <w:proofErr w:type="gramStart"/>
-      <w:r>
-        <w:t>required..</w:t>
-      </w:r>
-      <w:proofErr w:type="gramEnd"/>
-    </w:p>
-    <w:p>
-      <w:pPr>
-        <w:jc w:val="both"/>
-      </w:pPr>
-      <w:r>
-        <w:rPr>
+        <w:rPr>
+          <w:rFonts w:ascii="Aptos" w:hAnsi="Aptos"/>
+          <w:sz w:val="22"/>
+          <w:szCs w:val="22"/>
+        </w:rPr>
+      </w:pPr>
+      <w:r>
+        <w:rPr>
+          <w:rFonts w:ascii="Aptos" w:hAnsi="Aptos"/>
+          <w:sz w:val="22"/>
+          <w:szCs w:val="22"/>
+        </w:rPr>
+        <w:t>History, mission, vision, and team descriptions are original content, developed from the organisation profile established in the Website Project Proposal document.</w:t>
+      </w:r>
+    </w:p>
+    <w:p>
+      <w:pPr>
+        <w:numPr>
+          <w:ilvl w:val="0"/>
+          <w:numId w:val="6"/>
+        </w:numPr>
+        <w:rPr>
+          <w:rFonts w:ascii="Aptos" w:hAnsi="Aptos"/>
+          <w:sz w:val="22"/>
+          <w:szCs w:val="22"/>
+        </w:rPr>
+      </w:pPr>
+      <w:r>
+        <w:rPr>
+          <w:rFonts w:ascii="Aptos" w:hAnsi="Aptos"/>
+          <w:sz w:val="22"/>
+          <w:szCs w:val="22"/>
+        </w:rPr>
+        <w:t>Team/shelter photo: AI-generated original illustration — see README References.</w:t>
+      </w:r>
+    </w:p>
+    <w:p>
+      <w:pPr>
+        <w:rPr>
+          <w:rFonts w:ascii="Aptos" w:hAnsi="Aptos"/>
           <w:b/>
           <w:bCs/>
-        </w:rPr>
-        <w:t>About (about.html)</w:t>
-      </w:r>
-    </w:p>
-    <w:p>
-      <w:pPr>
-        <w:pStyle w:val="ListParagraph"/>
+          <w:sz w:val="22"/>
+          <w:szCs w:val="22"/>
+        </w:rPr>
+      </w:pPr>
+      <w:r>
+        <w:rPr>
+          <w:rFonts w:ascii="Aptos" w:hAnsi="Aptos"/>
+          <w:b/>
+          <w:bCs/>
+          <w:sz w:val="22"/>
+          <w:szCs w:val="22"/>
+        </w:rPr>
+        <w:t>Adopt (adopt.html)</w:t>
+      </w:r>
+    </w:p>
+    <w:p>
+      <w:pPr>
         <w:numPr>
           <w:ilvl w:val="0"/>
-          <w:numId w:val="3"/>
+          <w:numId w:val="7"/>
         </w:numPr>
-        <w:jc w:val="both"/>
-      </w:pPr>
-      <w:r>
-        <w:t>History, mission, vision, and team descriptions are original content, developed from the</w:t>
-      </w:r>
-    </w:p>
-    <w:p>
-      <w:pPr>
-        <w:jc w:val="both"/>
-      </w:pPr>
-      <w:r>
-        <w:t>  organisation profile established in the Website Project Proposal document.</w:t>
-      </w:r>
-    </w:p>
-    <w:p>
-      <w:pPr>
-        <w:jc w:val="both"/>
-      </w:pPr>
-      <w:r>
-        <w:rPr>
+        <w:rPr>
+          <w:rFonts w:ascii="Aptos" w:hAnsi="Aptos"/>
+          <w:sz w:val="22"/>
+          <w:szCs w:val="22"/>
+        </w:rPr>
+      </w:pPr>
+      <w:r>
+        <w:rPr>
+          <w:rFonts w:ascii="Aptos" w:hAnsi="Aptos"/>
+          <w:sz w:val="22"/>
+          <w:szCs w:val="22"/>
+        </w:rPr>
+        <w:t>All four animal profiles (Buddy, Whiskers, Nala, Max) are original fictional content created for this project. No real animals, real shelters, or real people are represented.</w:t>
+      </w:r>
+      <w:r>
+        <w:rPr>
+          <w:rFonts w:ascii="Aptos" w:hAnsi="Aptos"/>
+          <w:sz w:val="22"/>
+          <w:szCs w:val="22"/>
+        </w:rPr>
+        <w:t xml:space="preserve"> </w:t>
+      </w:r>
+      <w:r>
+        <w:rPr>
+          <w:rFonts w:ascii="Aptos" w:hAnsi="Aptos"/>
+          <w:sz w:val="22"/>
+          <w:szCs w:val="22"/>
+        </w:rPr>
+        <w:t>See README References for final citations once chosen.</w:t>
+      </w:r>
+    </w:p>
+    <w:p>
+      <w:pPr>
+        <w:rPr>
+          <w:rFonts w:ascii="Aptos" w:hAnsi="Aptos"/>
           <w:b/>
           <w:bCs/>
-        </w:rPr>
-        <w:t>Adopt (adopt.html)</w:t>
-      </w:r>
-    </w:p>
-    <w:p>
-      <w:pPr>
-        <w:pStyle w:val="ListParagraph"/>
+          <w:sz w:val="22"/>
+          <w:szCs w:val="22"/>
+        </w:rPr>
+      </w:pPr>
+      <w:r>
+        <w:rPr>
+          <w:rFonts w:ascii="Aptos" w:hAnsi="Aptos"/>
+          <w:b/>
+          <w:bCs/>
+          <w:sz w:val="22"/>
+          <w:szCs w:val="22"/>
+        </w:rPr>
+        <w:t>Enquiry (enquiry.html)</w:t>
+      </w:r>
+    </w:p>
+    <w:p>
+      <w:pPr>
         <w:numPr>
           <w:ilvl w:val="0"/>
-          <w:numId w:val="3"/>
+          <w:numId w:val="8"/>
         </w:numPr>
-        <w:jc w:val="both"/>
-      </w:pPr>
-      <w:r>
-        <w:t>All four animal profiles (Buddy, Whiskers, Nala, Max) are original fictional content</w:t>
-      </w:r>
-    </w:p>
-    <w:p>
-      <w:pPr>
-        <w:jc w:val="both"/>
-      </w:pPr>
-      <w:r>
-        <w:t>  created for this project. No real animals, real shelters, or real people are represented.</w:t>
-      </w:r>
-    </w:p>
-    <w:p>
-      <w:pPr>
-        <w:pStyle w:val="ListParagraph"/>
+        <w:rPr>
+          <w:rFonts w:ascii="Aptos" w:hAnsi="Aptos"/>
+          <w:sz w:val="22"/>
+          <w:szCs w:val="22"/>
+        </w:rPr>
+      </w:pPr>
+      <w:r>
+        <w:rPr>
+          <w:rFonts w:ascii="Aptos" w:hAnsi="Aptos"/>
+          <w:sz w:val="22"/>
+          <w:szCs w:val="22"/>
+        </w:rPr>
+        <w:t>Form field structure (adopt/volunteer/sponsor enquiry types) is derived directly from the brief's explicit requirement that an NPO's enquiry page must support volunteer and sponsor enquiries, not from an external source.</w:t>
+      </w:r>
+    </w:p>
+    <w:p>
+      <w:pPr>
+        <w:rPr>
+          <w:rFonts w:ascii="Aptos" w:hAnsi="Aptos"/>
+          <w:b/>
+          <w:bCs/>
+          <w:sz w:val="22"/>
+          <w:szCs w:val="22"/>
+        </w:rPr>
+      </w:pPr>
+      <w:r>
+        <w:rPr>
+          <w:rFonts w:ascii="Aptos" w:hAnsi="Aptos"/>
+          <w:b/>
+          <w:bCs/>
+          <w:sz w:val="22"/>
+          <w:szCs w:val="22"/>
+        </w:rPr>
+        <w:t>Contact (contact.html)</w:t>
+      </w:r>
+    </w:p>
+    <w:p>
+      <w:pPr>
         <w:numPr>
           <w:ilvl w:val="0"/>
-          <w:numId w:val="3"/>
+          <w:numId w:val="9"/>
         </w:numPr>
-        <w:jc w:val="both"/>
-      </w:pPr>
-      <w:r>
-        <w:t xml:space="preserve">-Animal photos: </w:t>
-      </w:r>
-    </w:p>
-    <w:p>
-      <w:pPr>
-        <w:jc w:val="both"/>
-      </w:pPr>
-      <w:r>
-        <w:rPr>
+        <w:rPr>
+          <w:rFonts w:ascii="Aptos" w:hAnsi="Aptos"/>
+          <w:sz w:val="22"/>
+          <w:szCs w:val="22"/>
+        </w:rPr>
+      </w:pPr>
+      <w:r>
+        <w:rPr>
+          <w:rFonts w:ascii="Aptos" w:hAnsi="Aptos"/>
+          <w:sz w:val="22"/>
+          <w:szCs w:val="22"/>
+        </w:rPr>
+        <w:t>Both addresses are fictional, created to satisfy the brief's requirement for more than one mapped location. They do not correspond to real premises.</w:t>
+      </w:r>
+    </w:p>
+    <w:p>
+      <w:pPr>
+        <w:numPr>
+          <w:ilvl w:val="0"/>
+          <w:numId w:val="9"/>
+        </w:numPr>
+        <w:rPr>
+          <w:rFonts w:ascii="Aptos" w:hAnsi="Aptos"/>
+          <w:sz w:val="22"/>
+          <w:szCs w:val="22"/>
+        </w:rPr>
+      </w:pPr>
+      <w:r>
+        <w:rPr>
+          <w:rFonts w:ascii="Aptos" w:hAnsi="Aptos"/>
+          <w:sz w:val="22"/>
+          <w:szCs w:val="22"/>
+        </w:rPr>
+        <w:t xml:space="preserve">Map image: AI-generated illustration used as a structural placeholder — real map embeds are a Part 3 requirement </w:t>
+      </w:r>
+    </w:p>
+    <w:p>
+      <w:pPr>
+        <w:rPr>
+          <w:rFonts w:ascii="Aptos" w:hAnsi="Aptos"/>
           <w:b/>
           <w:bCs/>
-        </w:rPr>
-        <w:t xml:space="preserve"> Enquiry (enquiry.html)</w:t>
-      </w:r>
-    </w:p>
-    <w:p>
-      <w:pPr>
-        <w:pStyle w:val="ListParagraph"/>
+          <w:sz w:val="22"/>
+          <w:szCs w:val="22"/>
+        </w:rPr>
+      </w:pPr>
+      <w:r>
+        <w:rPr>
+          <w:rFonts w:ascii="Aptos" w:hAnsi="Aptos"/>
+          <w:b/>
+          <w:bCs/>
+          <w:sz w:val="22"/>
+          <w:szCs w:val="22"/>
+        </w:rPr>
+        <w:t>External sources used in Part 1</w:t>
+      </w:r>
+    </w:p>
+    <w:p>
+      <w:pPr>
         <w:numPr>
           <w:ilvl w:val="0"/>
-          <w:numId w:val="3"/>
+          <w:numId w:val="10"/>
         </w:numPr>
-        <w:jc w:val="both"/>
-      </w:pPr>
-      <w:r>
-        <w:t>-Form field structure (adopt/volunteer/sponsor enquiry types) is derived directly from the</w:t>
-      </w:r>
-    </w:p>
-    <w:p>
-      <w:pPr>
-        <w:pStyle w:val="ListParagraph"/>
+        <w:rPr>
+          <w:rFonts w:ascii="Aptos" w:hAnsi="Aptos"/>
+          <w:sz w:val="22"/>
+          <w:szCs w:val="22"/>
+        </w:rPr>
+      </w:pPr>
+      <w:proofErr w:type="spellStart"/>
+      <w:r>
+        <w:rPr>
+          <w:rFonts w:ascii="Aptos" w:hAnsi="Aptos"/>
+          <w:sz w:val="22"/>
+          <w:szCs w:val="22"/>
+        </w:rPr>
+        <w:t>xneelo</w:t>
+      </w:r>
+      <w:proofErr w:type="spellEnd"/>
+      <w:r>
+        <w:rPr>
+          <w:rFonts w:ascii="Aptos" w:hAnsi="Aptos"/>
+          <w:sz w:val="22"/>
+          <w:szCs w:val="22"/>
+        </w:rPr>
+        <w:t xml:space="preserve"> (2026) — domain-registration pricing figure, cited in the Budget section of the Website Project Proposal and in README.md.</w:t>
+      </w:r>
+    </w:p>
+    <w:p>
+      <w:pPr>
         <w:numPr>
           <w:ilvl w:val="0"/>
-          <w:numId w:val="3"/>
+          <w:numId w:val="10"/>
         </w:numPr>
-        <w:jc w:val="both"/>
-      </w:pPr>
-      <w:r>
-        <w:t xml:space="preserve">brief's explicit requirement that an NPO's enquiry page must support volunteer </w:t>
-      </w:r>
-      <w:r>
-        <w:t>and sponsor</w:t>
-      </w:r>
-      <w:r>
-        <w:t xml:space="preserve"> enquiries, not from an external source.</w:t>
-      </w:r>
-    </w:p>
-    <w:p>
-      <w:pPr>
-        <w:jc w:val="both"/>
-      </w:pPr>
-      <w:r>
-        <w:rPr>
-          <w:b/>
-          <w:bCs/>
-        </w:rPr>
-        <w:t>Contact (contact.html)</w:t>
-      </w:r>
-    </w:p>
-    <w:p>
-      <w:pPr>
-        <w:pStyle w:val="ListParagraph"/>
-        <w:numPr>
-          <w:ilvl w:val="0"/>
-          <w:numId w:val="4"/>
-        </w:numPr>
-        <w:jc w:val="both"/>
-      </w:pPr>
-      <w:r>
-        <w:t>Both addresses are fictional, created to satisfy the brief's requirement for more than</w:t>
-      </w:r>
-      <w:r>
+        <w:rPr>
+          <w:rFonts w:ascii="Aptos" w:hAnsi="Aptos"/>
+          <w:sz w:val="22"/>
+          <w:szCs w:val="22"/>
+        </w:rPr>
+      </w:pPr>
+      <w:r>
+        <w:rPr>
+          <w:rFonts w:ascii="Aptos" w:hAnsi="Aptos"/>
+          <w:sz w:val="22"/>
+          <w:szCs w:val="22"/>
+        </w:rPr>
+        <w:t>W3Schools (n.d. — used as a learning reference for standard HTML formatting syntax, not as a source of copied content. Cited in README.md.</w:t>
+      </w:r>
+    </w:p>
+    <w:p>
+      <w:pPr>
+        <w:rPr>
+          <w:rFonts w:ascii="Aptos" w:hAnsi="Aptos"/>
+          <w:sz w:val="22"/>
+          <w:szCs w:val="22"/>
+        </w:rPr>
+      </w:pPr>
+      <w:r>
+        <w:rPr>
+          <w:rFonts w:ascii="Aptos" w:hAnsi="Aptos"/>
+          <w:sz w:val="22"/>
+          <w:szCs w:val="22"/>
+        </w:rPr>
+        <w:t>No external text, statistic</w:t>
+      </w:r>
+      <w:r>
+        <w:rPr>
+          <w:rFonts w:ascii="Aptos" w:hAnsi="Aptos"/>
+          <w:sz w:val="22"/>
+          <w:szCs w:val="22"/>
+        </w:rPr>
         <w:t xml:space="preserve"> </w:t>
       </w:r>
       <w:r>
-        <w:t>one mapped location. They do not correspond to real premises.</w:t>
-      </w:r>
-    </w:p>
-    <w:p>
-      <w:pPr>
-        <w:pStyle w:val="ListParagraph"/>
-        <w:numPr>
-          <w:ilvl w:val="0"/>
-          <w:numId w:val="4"/>
-        </w:numPr>
-        <w:jc w:val="both"/>
-      </w:pPr>
-      <w:r>
-        <w:t>Map images:  real map embeds are a Part 3 requirement (Integrate External</w:t>
-      </w:r>
-      <w:r>
-        <w:t xml:space="preserve"> </w:t>
-      </w:r>
-      <w:r>
-        <w:t>Services)</w:t>
-      </w:r>
-    </w:p>
-    <w:p>
-      <w:pPr>
-        <w:jc w:val="both"/>
-      </w:pPr>
-      <w:r>
-        <w:rPr>
-          <w:b/>
-          <w:bCs/>
-        </w:rPr>
-        <w:t>External sources actually used in Part 1</w:t>
-      </w:r>
-    </w:p>
-    <w:p>
-      <w:pPr>
-        <w:jc w:val="both"/>
-      </w:pPr>
-      <w:r>
-        <w:t>Only one external source has been used so far — the domain-registration pricing figure</w:t>
-      </w:r>
-    </w:p>
-    <w:p>
-      <w:pPr>
-        <w:jc w:val="both"/>
-      </w:pPr>
-      <w:r>
-        <w:t>in the Website Project Proposal's Budget section:</w:t>
-      </w:r>
-    </w:p>
-    <w:p>
-      <w:pPr>
-        <w:jc w:val="both"/>
-      </w:pPr>
-      <w:proofErr w:type="spellStart"/>
-      <w:r>
-        <w:t>xneelo</w:t>
-      </w:r>
-      <w:proofErr w:type="spellEnd"/>
-      <w:r>
-        <w:t>. 2026. Domain Name Search and Registration. [Online]. Available at:</w:t>
-      </w:r>
-    </w:p>
-    <w:p>
-      <w:pPr>
-        <w:jc w:val="both"/>
-      </w:pPr>
-      <w:hyperlink r:id="rId22" w:history="1">
-        <w:r>
-          <w:rPr>
-            <w:rStyle w:val="Hyperlink"/>
-          </w:rPr>
-          <w:t>https://xneelo.co.za/domains/</w:t>
-        </w:r>
-      </w:hyperlink>
-      <w:r>
-        <w:t xml:space="preserve"> </w:t>
-      </w:r>
-      <w:r>
-        <w:t xml:space="preserve"> [Accessed 11 August 2026].</w:t>
-      </w:r>
-    </w:p>
-    <w:p>
-      <w:hyperlink r:id="rId23" w:history="1">
-        <w:r>
-          <w:rPr>
-            <w:rStyle w:val="Hyperlink"/>
-          </w:rPr>
-          <w:t>https://www.w3schools.com/html/html_formatting.asp</w:t>
-        </w:r>
-      </w:hyperlink>
-      <w:r>
-        <w:t xml:space="preserve"> (used for learning HTML) </w:t>
-      </w:r>
-    </w:p>
-    <w:p>
-      <w:r>
-        <w:lastRenderedPageBreak/>
-        <w:t xml:space="preserve">Microsoft, 2026. </w:t>
-      </w:r>
-      <w:r>
-        <w:rPr>
-          <w:i/>
-          <w:iCs/>
-        </w:rPr>
-        <w:t>Microsoft Word (</w:t>
-      </w:r>
-      <w:r>
-        <w:t xml:space="preserve">created the wireframes) &amp; </w:t>
-      </w:r>
-      <w:hyperlink r:id="rId24" w:history="1">
-        <w:r>
-          <w:rPr>
-            <w:rStyle w:val="Hyperlink"/>
-          </w:rPr>
-          <w:t>https://www.drawio.com/</w:t>
-        </w:r>
-      </w:hyperlink>
-      <w:r>
-        <w:t xml:space="preserve"> </w:t>
-      </w:r>
-    </w:p>
-    <w:p/>
-    <w:p>
-      <w:r>
-        <w:t>This is cited in-text in the proposal document and listed in full here and in the README,</w:t>
-      </w:r>
-    </w:p>
-    <w:p>
-      <w:r>
-        <w:t>per the brief's requirement that Part 1 references appear in both the proposal document and</w:t>
-      </w:r>
-    </w:p>
-    <w:p>
-      <w:r>
-        <w:t>README.md.</w:t>
+        <w:rPr>
+          <w:rFonts w:ascii="Aptos" w:hAnsi="Aptos"/>
+          <w:sz w:val="22"/>
+          <w:szCs w:val="22"/>
+        </w:rPr>
+        <w:t>s, or claims have been used anywhere in the Part 1 content beyond what is listed above. Nothing has been copied from any website, textbook, or other student's work.</w:t>
       </w:r>
     </w:p>
     <w:p/>
@@ -5798,7 +6020,10 @@
           <w14:ligatures w14:val="none"/>
         </w:rPr>
       </w:pPr>
-      <w:r>
+    </w:p>
+    <w:p>
+      <w:pPr>
+        <w:pStyle w:val="Caption"/>
         <w:rPr>
           <w:rFonts w:ascii="Aptos" w:eastAsia="Times New Roman" w:hAnsi="Aptos" w:cs="Arial"/>
           <w:b/>
@@ -5813,8 +6038,53 @@
           <w:lang w:eastAsia="en-ZA"/>
           <w14:ligatures w14:val="none"/>
         </w:rPr>
+      </w:pPr>
+    </w:p>
+    <w:p>
+      <w:pPr>
+        <w:pStyle w:val="Caption"/>
+        <w:rPr>
+          <w:rFonts w:ascii="Aptos" w:eastAsia="Times New Roman" w:hAnsi="Aptos" w:cs="Arial"/>
+          <w:b/>
+          <w:bCs/>
+          <w:i w:val="0"/>
+          <w:iCs w:val="0"/>
+          <w:color w:val="1F1F1F"/>
+          <w:kern w:val="0"/>
+          <w:sz w:val="22"/>
+          <w:szCs w:val="22"/>
+          <w:bdr w:val="none" w:sz="0" w:space="0" w:color="auto" w:frame="1"/>
+          <w:lang w:eastAsia="en-ZA"/>
+          <w14:ligatures w14:val="none"/>
+        </w:rPr>
+      </w:pPr>
+    </w:p>
+    <w:p>
+      <w:pPr>
+        <w:pStyle w:val="Heading2"/>
+        <w:rPr>
+          <w:rFonts w:ascii="Aptos" w:eastAsia="Times New Roman" w:hAnsi="Aptos"/>
+          <w:i/>
+          <w:iCs/>
+          <w:sz w:val="24"/>
+          <w:szCs w:val="24"/>
+          <w:bdr w:val="none" w:sz="0" w:space="0" w:color="auto" w:frame="1"/>
+          <w:lang w:eastAsia="en-ZA"/>
+        </w:rPr>
+      </w:pPr>
+      <w:bookmarkStart w:id="41" w:name="_Toc237788193"/>
+      <w:r>
+        <w:rPr>
+          <w:rFonts w:ascii="Aptos" w:eastAsia="Times New Roman" w:hAnsi="Aptos"/>
+          <w:sz w:val="24"/>
+          <w:szCs w:val="24"/>
+          <w:bdr w:val="none" w:sz="0" w:space="0" w:color="auto" w:frame="1"/>
+          <w:lang w:eastAsia="en-ZA"/>
+        </w:rPr>
+        <w:lastRenderedPageBreak/>
         <w:t>Sitemap:</w:t>
       </w:r>
+      <w:bookmarkEnd w:id="41"/>
     </w:p>
     <w:p>
       <w:pPr>
@@ -5844,7 +6114,7 @@
                     <pic:cNvPicPr/>
                   </pic:nvPicPr>
                   <pic:blipFill>
-                    <a:blip r:embed="rId25">
+                    <a:blip r:embed="rId22">
                       <a:extLst>
                         <a:ext uri="{28A0092B-C50C-407E-A947-70E740481C1C}">
                           <a14:useLocalDpi xmlns:a14="http://schemas.microsoft.com/office/drawing/2010/main" val="0"/>
@@ -5870,20 +6140,61 @@
           </wp:inline>
         </w:drawing>
       </w:r>
+      <w:r>
+        <w:t xml:space="preserve"> 4-page hierarchy under a Home page, matching the file structure below. All </w:t>
+      </w:r>
+      <w:proofErr w:type="gramStart"/>
+      <w:r>
+        <w:t>pages</w:t>
+      </w:r>
+      <w:proofErr w:type="gramEnd"/>
+      <w:r>
+        <w:t xml:space="preserve"> link to all other pages via a shared navigation menu.</w:t>
+      </w:r>
     </w:p>
     <w:p>
       <w:pPr>
         <w:pStyle w:val="Header"/>
       </w:pPr>
-      <w:r>
-        <w:t xml:space="preserve">GIT HUB LINK </w:t>
-      </w:r>
     </w:p>
     <w:p>
       <w:pPr>
         <w:pStyle w:val="Header"/>
       </w:pPr>
-      <w:hyperlink r:id="rId26" w:history="1">
+    </w:p>
+    <w:p>
+      <w:pPr>
+        <w:pStyle w:val="Heading2"/>
+        <w:rPr>
+          <w:rFonts w:ascii="Aptos" w:hAnsi="Aptos"/>
+          <w:sz w:val="24"/>
+          <w:szCs w:val="24"/>
+        </w:rPr>
+      </w:pPr>
+      <w:bookmarkStart w:id="42" w:name="_Toc237788194"/>
+      <w:r>
+        <w:rPr>
+          <w:rFonts w:ascii="Aptos" w:hAnsi="Aptos"/>
+          <w:sz w:val="24"/>
+          <w:szCs w:val="24"/>
+        </w:rPr>
+        <w:t>GIT HUB LINK</w:t>
+      </w:r>
+      <w:bookmarkEnd w:id="42"/>
+      <w:r>
+        <w:rPr>
+          <w:rFonts w:ascii="Aptos" w:hAnsi="Aptos"/>
+          <w:sz w:val="24"/>
+          <w:szCs w:val="24"/>
+        </w:rPr>
+        <w:t xml:space="preserve"> </w:t>
+      </w:r>
+    </w:p>
+    <w:p>
+      <w:pPr>
+        <w:pStyle w:val="Header"/>
+      </w:pPr>
+      <w:hyperlink r:id="rId23" w:history="1">
         <w:r>
           <w:rPr>
             <w:rStyle w:val="Hyperlink"/>
@@ -5903,8 +6214,7 @@
       </w:pPr>
     </w:p>
     <w:sectPr>
-      <w:headerReference w:type="default" r:id="rId27"/>
-      <w:footerReference w:type="default" r:id="rId28"/>
+      <w:headerReference w:type="default" r:id="rId24"/>
       <w:pgSz w:w="11906" w:h="16838"/>
       <w:pgMar w:top="1440" w:right="1440" w:bottom="1440" w:left="1440" w:header="708" w:footer="708" w:gutter="0"/>
       <w:cols w:space="708"/>
@@ -5939,40 +6249,6 @@
 </w:endnotes>
 </file>
 
-<file path=word/footer1.xml><?xml version="1.0" encoding="utf-8"?>
-<w:ftr xmlns:wpc="http://schemas.microsoft.com/office/word/2010/wordprocessingCanvas" xmlns:cx="http://schemas.microsoft.com/office/drawing/2014/chartex" xmlns:cx1="http://schemas.microsoft.com/office/drawing/2015/9/8/chartex" xmlns:cx2="http://schemas.microsoft.com/office/drawing/2015/10/21/chartex" xmlns:cx3="http://schemas.microsoft.com/office/drawing/2016/5/9/chartex" xmlns:cx4="http://schemas.microsoft.com/office/drawing/2016/5/10/chartex" xmlns:cx5="http://schemas.microsoft.com/office/drawing/2016/5/11/chartex" xmlns:cx6="http://schemas.microsoft.com/office/drawing/2016/5/12/chartex" xmlns:cx7="http://schemas.microsoft.com/office/drawing/2016/5/13/chartex" xmlns:cx8="http://schemas.microsoft.com/office/drawing/2016/5/14/chartex" xmlns:mc="http://schemas.openxmlformats.org/markup-compatibility/2006" xmlns:aink="http://schemas.microsoft.com/office/drawing/2016/ink" xmlns:am3d="http://schemas.microsoft.com/office/drawing/2017/model3d" xmlns:o="urn:schemas-microsoft-com:office:office" xmlns:oel="http://schemas.microsoft.com/office/2019/extlst" xmlns:r="http://schemas.openxmlformats.org/officeDocument/2006/relationships" xmlns:m="http://schemas.openxmlformats.org/officeDocument/2006/math" xmlns:v="urn:schemas-microsoft-com:vml" xmlns:wp14="http://schemas.microsoft.com/office/word/2010/wordprocessingDrawing" xmlns:wp="http://schemas.openxmlformats.org/drawingml/2006/wordprocessingDrawing" xmlns:w10="urn:schemas-microsoft-com:office:word" xmlns:w="http://schemas.openxmlformats.org/wordprocessingml/2006/main" xmlns:w14="http://schemas.microsoft.com/office/word/2010/wordml" xmlns:w15="http://schemas.microsoft.com/office/word/2012/wordml" xmlns:w16cex="http://schemas.microsoft.com/office/word/2018/wordml/cex" xmlns:w16cid="http://schemas.microsoft.com/office/word/2016/wordml/cid" xmlns:w16="http://schemas.microsoft.com/office/word/2018/wordml" xmlns:w16du="http://schemas.microsoft.com/office/word/2023/wordml/word16du" xmlns:w16sdtdh="http://schemas.microsoft.com/office/word/2020/wordml/sdtdatahash" xmlns:w16sdtfl="http://schemas.microsoft.com/office/word/2024/wordml/sdtformatlock" xmlns:w16se="http://schemas.microsoft.com/office/word/2015/wordml/symex" xmlns:wpg="http://schemas.microsoft.com/office/word/2010/wordprocessingGroup" xmlns:wpi="http://schemas.microsoft.com/office/word/2010/wordprocessingInk" xmlns:wne="http://schemas.microsoft.com/office/word/2006/wordml" xmlns:wps="http://schemas.microsoft.com/office/word/2010/wordprocessingShape" mc:Ignorable="w14 w15 w16se w16cid w16 w16cex w16sdtdh w16sdtfl w16du wp14">
-  <w:p>
-    <w:pPr>
-      <w:pStyle w:val="Header"/>
-    </w:pPr>
-    <w:r>
-      <w:t xml:space="preserve">GIT HUB LINK </w:t>
-    </w:r>
-  </w:p>
-  <w:p>
-    <w:pPr>
-      <w:pStyle w:val="Header"/>
-    </w:pPr>
-    <w:hyperlink r:id="rId1" w:history="1">
-      <w:r>
-        <w:rPr>
-          <w:rStyle w:val="Hyperlink"/>
-        </w:rPr>
-        <w:t>https://github.com/mudzani/ST10512213-WEDE51112-POE.git</w:t>
-      </w:r>
-    </w:hyperlink>
-    <w:r>
-      <w:t xml:space="preserve"> </w:t>
-    </w:r>
-  </w:p>
-  <w:p>
-    <w:pPr>
-      <w:pStyle w:val="Footer"/>
-    </w:pPr>
-  </w:p>
-</w:ftr>
-</file>
-
 <file path=word/footnotes.xml><?xml version="1.0" encoding="utf-8"?>
 <w:footnotes xmlns:wpc="http://schemas.microsoft.com/office/word/2010/wordprocessingCanvas" xmlns:cx="http://schemas.microsoft.com/office/drawing/2014/chartex" xmlns:cx1="http://schemas.microsoft.com/office/drawing/2015/9/8/chartex" xmlns:cx2="http://schemas.microsoft.com/office/drawing/2015/10/21/chartex" xmlns:cx3="http://schemas.microsoft.com/office/drawing/2016/5/9/chartex" xmlns:cx4="http://schemas.microsoft.com/office/drawing/2016/5/10/chartex" xmlns:cx5="http://schemas.microsoft.com/office/drawing/2016/5/11/chartex" xmlns:cx6="http://schemas.microsoft.com/office/drawing/2016/5/12/chartex" xmlns:cx7="http://schemas.microsoft.com/office/drawing/2016/5/13/chartex" xmlns:cx8="http://schemas.microsoft.com/office/drawing/2016/5/14/chartex" xmlns:mc="http://schemas.openxmlformats.org/markup-compatibility/2006" xmlns:aink="http://schemas.microsoft.com/office/drawing/2016/ink" xmlns:am3d="http://schemas.microsoft.com/office/drawing/2017/model3d" xmlns:o="urn:schemas-microsoft-com:office:office" xmlns:oel="http://schemas.microsoft.com/office/2019/extlst" xmlns:r="http://schemas.openxmlformats.org/officeDocument/2006/relationships" xmlns:m="http://schemas.openxmlformats.org/officeDocument/2006/math" xmlns:v="urn:schemas-microsoft-com:vml" xmlns:wp14="http://schemas.microsoft.com/office/word/2010/wordprocessingDrawing" xmlns:wp="http://schemas.openxmlformats.org/drawingml/2006/wordprocessingDrawing" xmlns:w10="urn:schemas-microsoft-com:office:word" xmlns:w="http://schemas.openxmlformats.org/wordprocessingml/2006/main" xmlns:w14="http://schemas.microsoft.com/office/word/2010/wordml" xmlns:w15="http://schemas.microsoft.com/office/word/2012/wordml" xmlns:w16cex="http://schemas.microsoft.com/office/word/2018/wordml/cex" xmlns:w16cid="http://schemas.microsoft.com/office/word/2016/wordml/cid" xmlns:w16="http://schemas.microsoft.com/office/word/2018/wordml" xmlns:w16du="http://schemas.microsoft.com/office/word/2023/wordml/word16du" xmlns:w16sdtdh="http://schemas.microsoft.com/office/word/2020/wordml/sdtdatahash" xmlns:w16sdtfl="http://schemas.microsoft.com/office/word/2024/wordml/sdtformatlock" xmlns:w16se="http://schemas.microsoft.com/office/word/2015/wordml/symex" xmlns:wpg="http://schemas.microsoft.com/office/word/2010/wordprocessingGroup" xmlns:wpi="http://schemas.microsoft.com/office/word/2010/wordprocessingInk" xmlns:wne="http://schemas.microsoft.com/office/word/2006/wordml" xmlns:wps="http://schemas.microsoft.com/office/word/2010/wordprocessingShape" mc:Ignorable="w14 w15 w16se w16cid w16 w16cex w16sdtdh w16sdtfl w16du wp14">
   <w:footnote w:type="separator" w:id="-1">
@@ -6005,22 +6281,6 @@
       <w:pStyle w:val="Header"/>
     </w:pPr>
     <w:r>
-      <w:t xml:space="preserve">GIT HUB LINK </w:t>
-    </w:r>
-  </w:p>
-  <w:p>
-    <w:pPr>
-      <w:pStyle w:val="Header"/>
-    </w:pPr>
-    <w:hyperlink r:id="rId1" w:history="1">
-      <w:r>
-        <w:rPr>
-          <w:rStyle w:val="Hyperlink"/>
-        </w:rPr>
-        <w:t>https://github.com/mudzani/ST10512213-WEDE51112-POE.git</w:t>
-      </w:r>
-    </w:hyperlink>
-    <w:r>
       <w:t xml:space="preserve"> </w:t>
     </w:r>
   </w:p>
@@ -6030,6 +6290,155 @@
 <file path=word/numbering.xml><?xml version="1.0" encoding="utf-8"?>
 <w:numbering xmlns:wpc="http://schemas.microsoft.com/office/word/2010/wordprocessingCanvas" xmlns:cx="http://schemas.microsoft.com/office/drawing/2014/chartex" xmlns:cx1="http://schemas.microsoft.com/office/drawing/2015/9/8/chartex" xmlns:cx2="http://schemas.microsoft.com/office/drawing/2015/10/21/chartex" xmlns:cx3="http://schemas.microsoft.com/office/drawing/2016/5/9/chartex" xmlns:cx4="http://schemas.microsoft.com/office/drawing/2016/5/10/chartex" xmlns:cx5="http://schemas.microsoft.com/office/drawing/2016/5/11/chartex" xmlns:cx6="http://schemas.microsoft.com/office/drawing/2016/5/12/chartex" xmlns:cx7="http://schemas.microsoft.com/office/drawing/2016/5/13/chartex" xmlns:cx8="http://schemas.microsoft.com/office/drawing/2016/5/14/chartex" xmlns:mc="http://schemas.openxmlformats.org/markup-compatibility/2006" xmlns:aink="http://schemas.microsoft.com/office/drawing/2016/ink" xmlns:am3d="http://schemas.microsoft.com/office/drawing/2017/model3d" xmlns:o="urn:schemas-microsoft-com:office:office" xmlns:oel="http://schemas.microsoft.com/office/2019/extlst" xmlns:r="http://schemas.openxmlformats.org/officeDocument/2006/relationships" xmlns:m="http://schemas.openxmlformats.org/officeDocument/2006/math" xmlns:v="urn:schemas-microsoft-com:vml" xmlns:wp14="http://schemas.microsoft.com/office/word/2010/wordprocessingDrawing" xmlns:wp="http://schemas.openxmlformats.org/drawingml/2006/wordprocessingDrawing" xmlns:w10="urn:schemas-microsoft-com:office:word" xmlns:w="http://schemas.openxmlformats.org/wordprocessingml/2006/main" xmlns:w14="http://schemas.microsoft.com/office/word/2010/wordml" xmlns:w15="http://schemas.microsoft.com/office/word/2012/wordml" xmlns:w16cex="http://schemas.microsoft.com/office/word/2018/wordml/cex" xmlns:w16cid="http://schemas.microsoft.com/office/word/2016/wordml/cid" xmlns:w16="http://schemas.microsoft.com/office/word/2018/wordml" xmlns:w16du="http://schemas.microsoft.com/office/word/2023/wordml/word16du" xmlns:w16sdtdh="http://schemas.microsoft.com/office/word/2020/wordml/sdtdatahash" xmlns:w16sdtfl="http://schemas.microsoft.com/office/word/2024/wordml/sdtformatlock" xmlns:w16se="http://schemas.microsoft.com/office/word/2015/wordml/symex" xmlns:wpg="http://schemas.microsoft.com/office/word/2010/wordprocessingGroup" xmlns:wpi="http://schemas.microsoft.com/office/word/2010/wordprocessingInk" xmlns:wne="http://schemas.microsoft.com/office/word/2006/wordml" xmlns:wps="http://schemas.microsoft.com/office/word/2010/wordprocessingShape" mc:Ignorable="w14 w15 w16se w16cid w16 w16cex w16sdtdh w16sdtfl w16du wp14">
   <w:abstractNum w:abstractNumId="0" w15:restartNumberingAfterBreak="0">
+    <w:nsid w:val="1B331BA0"/>
+    <w:multiLevelType w:val="multilevel"/>
+    <w:tmpl w:val="FDDECA20"/>
+    <w:lvl w:ilvl="0">
+      <w:start w:val="1"/>
+      <w:numFmt w:val="bullet"/>
+      <w:lvlText w:val=""/>
+      <w:lvlJc w:val="left"/>
+      <w:pPr>
+        <w:tabs>
+          <w:tab w:val="num" w:pos="720"/>
+        </w:tabs>
+        <w:ind w:left="720" w:hanging="360"/>
+      </w:pPr>
+      <w:rPr>
+        <w:rFonts w:ascii="Symbol" w:hAnsi="Symbol" w:hint="default"/>
+        <w:sz w:val="20"/>
+      </w:rPr>
+    </w:lvl>
+    <w:lvl w:ilvl="1" w:tentative="1">
+      <w:start w:val="1"/>
+      <w:numFmt w:val="bullet"/>
+      <w:lvlText w:val="o"/>
+      <w:lvlJc w:val="left"/>
+      <w:pPr>
+        <w:tabs>
+          <w:tab w:val="num" w:pos="1440"/>
+        </w:tabs>
+        <w:ind w:left="1440" w:hanging="360"/>
+      </w:pPr>
+      <w:rPr>
+        <w:rFonts w:ascii="Courier New" w:hAnsi="Courier New" w:hint="default"/>
+        <w:sz w:val="20"/>
+      </w:rPr>
+    </w:lvl>
+    <w:lvl w:ilvl="2" w:tentative="1">
+      <w:start w:val="1"/>
+      <w:numFmt w:val="bullet"/>
+      <w:lvlText w:val=""/>
+      <w:lvlJc w:val="left"/>
+      <w:pPr>
+        <w:tabs>
+          <w:tab w:val="num" w:pos="2160"/>
+        </w:tabs>
+        <w:ind w:left="2160" w:hanging="360"/>
+      </w:pPr>
+      <w:rPr>
+        <w:rFonts w:ascii="Wingdings" w:hAnsi="Wingdings" w:hint="default"/>
+        <w:sz w:val="20"/>
+      </w:rPr>
+    </w:lvl>
+    <w:lvl w:ilvl="3" w:tentative="1">
+      <w:start w:val="1"/>
+      <w:numFmt w:val="bullet"/>
+      <w:lvlText w:val=""/>
+      <w:lvlJc w:val="left"/>
+      <w:pPr>
+        <w:tabs>
+          <w:tab w:val="num" w:pos="2880"/>
+        </w:tabs>
+        <w:ind w:left="2880" w:hanging="360"/>
+      </w:pPr>
+      <w:rPr>
+        <w:rFonts w:ascii="Wingdings" w:hAnsi="Wingdings" w:hint="default"/>
+        <w:sz w:val="20"/>
+      </w:rPr>
+    </w:lvl>
+    <w:lvl w:ilvl="4" w:tentative="1">
+      <w:start w:val="1"/>
+      <w:numFmt w:val="bullet"/>
+      <w:lvlText w:val=""/>
+      <w:lvlJc w:val="left"/>
+      <w:pPr>
+        <w:tabs>
+          <w:tab w:val="num" w:pos="3600"/>
+        </w:tabs>
+        <w:ind w:left="3600" w:hanging="360"/>
+      </w:pPr>
+      <w:rPr>
+        <w:rFonts w:ascii="Wingdings" w:hAnsi="Wingdings" w:hint="default"/>
+        <w:sz w:val="20"/>
+      </w:rPr>
+    </w:lvl>
+    <w:lvl w:ilvl="5" w:tentative="1">
+      <w:start w:val="1"/>
+      <w:numFmt w:val="bullet"/>
+      <w:lvlText w:val=""/>
+      <w:lvlJc w:val="left"/>
+      <w:pPr>
+        <w:tabs>
+          <w:tab w:val="num" w:pos="4320"/>
+        </w:tabs>
+        <w:ind w:left="4320" w:hanging="360"/>
+      </w:pPr>
+      <w:rPr>
+        <w:rFonts w:ascii="Wingdings" w:hAnsi="Wingdings" w:hint="default"/>
+        <w:sz w:val="20"/>
+      </w:rPr>
+    </w:lvl>
+    <w:lvl w:ilvl="6" w:tentative="1">
+      <w:start w:val="1"/>
+      <w:numFmt w:val="bullet"/>
+      <w:lvlText w:val=""/>
+      <w:lvlJc w:val="left"/>
+      <w:pPr>
+        <w:tabs>
+          <w:tab w:val="num" w:pos="5040"/>
+        </w:tabs>
+        <w:ind w:left="5040" w:hanging="360"/>
+      </w:pPr>
+      <w:rPr>
+        <w:rFonts w:ascii="Wingdings" w:hAnsi="Wingdings" w:hint="default"/>
+        <w:sz w:val="20"/>
+      </w:rPr>
+    </w:lvl>
+    <w:lvl w:ilvl="7" w:tentative="1">
+      <w:start w:val="1"/>
+      <w:numFmt w:val="bullet"/>
+      <w:lvlText w:val=""/>
+      <w:lvlJc w:val="left"/>
+      <w:pPr>
+        <w:tabs>
+          <w:tab w:val="num" w:pos="5760"/>
+        </w:tabs>
+        <w:ind w:left="5760" w:hanging="360"/>
+      </w:pPr>
+      <w:rPr>
+        <w:rFonts w:ascii="Wingdings" w:hAnsi="Wingdings" w:hint="default"/>
+        <w:sz w:val="20"/>
+      </w:rPr>
+    </w:lvl>
+    <w:lvl w:ilvl="8" w:tentative="1">
+      <w:start w:val="1"/>
+      <w:numFmt w:val="bullet"/>
+      <w:lvlText w:val=""/>
+      <w:lvlJc w:val="left"/>
+      <w:pPr>
+        <w:tabs>
+          <w:tab w:val="num" w:pos="6480"/>
+        </w:tabs>
+        <w:ind w:left="6480" w:hanging="360"/>
+      </w:pPr>
+      <w:rPr>
+        <w:rFonts w:ascii="Wingdings" w:hAnsi="Wingdings" w:hint="default"/>
+        <w:sz w:val="20"/>
+      </w:rPr>
+    </w:lvl>
+  </w:abstractNum>
+  <w:abstractNum w:abstractNumId="1" w15:restartNumberingAfterBreak="0">
     <w:nsid w:val="2A5838F2"/>
     <w:multiLevelType w:val="hybridMultilevel"/>
     <w:tmpl w:val="9EB02D2A"/>
@@ -6142,7 +6551,752 @@
       </w:rPr>
     </w:lvl>
   </w:abstractNum>
-  <w:abstractNum w:abstractNumId="1" w15:restartNumberingAfterBreak="0">
+  <w:abstractNum w:abstractNumId="2" w15:restartNumberingAfterBreak="0">
+    <w:nsid w:val="2AD62030"/>
+    <w:multiLevelType w:val="multilevel"/>
+    <w:tmpl w:val="007CCC2A"/>
+    <w:lvl w:ilvl="0">
+      <w:start w:val="1"/>
+      <w:numFmt w:val="bullet"/>
+      <w:lvlText w:val=""/>
+      <w:lvlJc w:val="left"/>
+      <w:pPr>
+        <w:tabs>
+          <w:tab w:val="num" w:pos="720"/>
+        </w:tabs>
+        <w:ind w:left="720" w:hanging="360"/>
+      </w:pPr>
+      <w:rPr>
+        <w:rFonts w:ascii="Symbol" w:hAnsi="Symbol" w:hint="default"/>
+        <w:sz w:val="20"/>
+      </w:rPr>
+    </w:lvl>
+    <w:lvl w:ilvl="1" w:tentative="1">
+      <w:start w:val="1"/>
+      <w:numFmt w:val="bullet"/>
+      <w:lvlText w:val="o"/>
+      <w:lvlJc w:val="left"/>
+      <w:pPr>
+        <w:tabs>
+          <w:tab w:val="num" w:pos="1440"/>
+        </w:tabs>
+        <w:ind w:left="1440" w:hanging="360"/>
+      </w:pPr>
+      <w:rPr>
+        <w:rFonts w:ascii="Courier New" w:hAnsi="Courier New" w:hint="default"/>
+        <w:sz w:val="20"/>
+      </w:rPr>
+    </w:lvl>
+    <w:lvl w:ilvl="2" w:tentative="1">
+      <w:start w:val="1"/>
+      <w:numFmt w:val="bullet"/>
+      <w:lvlText w:val=""/>
+      <w:lvlJc w:val="left"/>
+      <w:pPr>
+        <w:tabs>
+          <w:tab w:val="num" w:pos="2160"/>
+        </w:tabs>
+        <w:ind w:left="2160" w:hanging="360"/>
+      </w:pPr>
+      <w:rPr>
+        <w:rFonts w:ascii="Wingdings" w:hAnsi="Wingdings" w:hint="default"/>
+        <w:sz w:val="20"/>
+      </w:rPr>
+    </w:lvl>
+    <w:lvl w:ilvl="3" w:tentative="1">
+      <w:start w:val="1"/>
+      <w:numFmt w:val="bullet"/>
+      <w:lvlText w:val=""/>
+      <w:lvlJc w:val="left"/>
+      <w:pPr>
+        <w:tabs>
+          <w:tab w:val="num" w:pos="2880"/>
+        </w:tabs>
+        <w:ind w:left="2880" w:hanging="360"/>
+      </w:pPr>
+      <w:rPr>
+        <w:rFonts w:ascii="Wingdings" w:hAnsi="Wingdings" w:hint="default"/>
+        <w:sz w:val="20"/>
+      </w:rPr>
+    </w:lvl>
+    <w:lvl w:ilvl="4" w:tentative="1">
+      <w:start w:val="1"/>
+      <w:numFmt w:val="bullet"/>
+      <w:lvlText w:val=""/>
+      <w:lvlJc w:val="left"/>
+      <w:pPr>
+        <w:tabs>
+          <w:tab w:val="num" w:pos="3600"/>
+        </w:tabs>
+        <w:ind w:left="3600" w:hanging="360"/>
+      </w:pPr>
+      <w:rPr>
+        <w:rFonts w:ascii="Wingdings" w:hAnsi="Wingdings" w:hint="default"/>
+        <w:sz w:val="20"/>
+      </w:rPr>
+    </w:lvl>
+    <w:lvl w:ilvl="5" w:tentative="1">
+      <w:start w:val="1"/>
+      <w:numFmt w:val="bullet"/>
+      <w:lvlText w:val=""/>
+      <w:lvlJc w:val="left"/>
+      <w:pPr>
+        <w:tabs>
+          <w:tab w:val="num" w:pos="4320"/>
+        </w:tabs>
+        <w:ind w:left="4320" w:hanging="360"/>
+      </w:pPr>
+      <w:rPr>
+        <w:rFonts w:ascii="Wingdings" w:hAnsi="Wingdings" w:hint="default"/>
+        <w:sz w:val="20"/>
+      </w:rPr>
+    </w:lvl>
+    <w:lvl w:ilvl="6" w:tentative="1">
+      <w:start w:val="1"/>
+      <w:numFmt w:val="bullet"/>
+      <w:lvlText w:val=""/>
+      <w:lvlJc w:val="left"/>
+      <w:pPr>
+        <w:tabs>
+          <w:tab w:val="num" w:pos="5040"/>
+        </w:tabs>
+        <w:ind w:left="5040" w:hanging="360"/>
+      </w:pPr>
+      <w:rPr>
+        <w:rFonts w:ascii="Wingdings" w:hAnsi="Wingdings" w:hint="default"/>
+        <w:sz w:val="20"/>
+      </w:rPr>
+    </w:lvl>
+    <w:lvl w:ilvl="7" w:tentative="1">
+      <w:start w:val="1"/>
+      <w:numFmt w:val="bullet"/>
+      <w:lvlText w:val=""/>
+      <w:lvlJc w:val="left"/>
+      <w:pPr>
+        <w:tabs>
+          <w:tab w:val="num" w:pos="5760"/>
+        </w:tabs>
+        <w:ind w:left="5760" w:hanging="360"/>
+      </w:pPr>
+      <w:rPr>
+        <w:rFonts w:ascii="Wingdings" w:hAnsi="Wingdings" w:hint="default"/>
+        <w:sz w:val="20"/>
+      </w:rPr>
+    </w:lvl>
+    <w:lvl w:ilvl="8" w:tentative="1">
+      <w:start w:val="1"/>
+      <w:numFmt w:val="bullet"/>
+      <w:lvlText w:val=""/>
+      <w:lvlJc w:val="left"/>
+      <w:pPr>
+        <w:tabs>
+          <w:tab w:val="num" w:pos="6480"/>
+        </w:tabs>
+        <w:ind w:left="6480" w:hanging="360"/>
+      </w:pPr>
+      <w:rPr>
+        <w:rFonts w:ascii="Wingdings" w:hAnsi="Wingdings" w:hint="default"/>
+        <w:sz w:val="20"/>
+      </w:rPr>
+    </w:lvl>
+  </w:abstractNum>
+  <w:abstractNum w:abstractNumId="3" w15:restartNumberingAfterBreak="0">
+    <w:nsid w:val="39F80F8C"/>
+    <w:multiLevelType w:val="multilevel"/>
+    <w:tmpl w:val="4802043E"/>
+    <w:lvl w:ilvl="0">
+      <w:start w:val="1"/>
+      <w:numFmt w:val="bullet"/>
+      <w:lvlText w:val=""/>
+      <w:lvlJc w:val="left"/>
+      <w:pPr>
+        <w:tabs>
+          <w:tab w:val="num" w:pos="720"/>
+        </w:tabs>
+        <w:ind w:left="720" w:hanging="360"/>
+      </w:pPr>
+      <w:rPr>
+        <w:rFonts w:ascii="Symbol" w:hAnsi="Symbol" w:hint="default"/>
+        <w:sz w:val="20"/>
+      </w:rPr>
+    </w:lvl>
+    <w:lvl w:ilvl="1" w:tentative="1">
+      <w:start w:val="1"/>
+      <w:numFmt w:val="bullet"/>
+      <w:lvlText w:val="o"/>
+      <w:lvlJc w:val="left"/>
+      <w:pPr>
+        <w:tabs>
+          <w:tab w:val="num" w:pos="1440"/>
+        </w:tabs>
+        <w:ind w:left="1440" w:hanging="360"/>
+      </w:pPr>
+      <w:rPr>
+        <w:rFonts w:ascii="Courier New" w:hAnsi="Courier New" w:hint="default"/>
+        <w:sz w:val="20"/>
+      </w:rPr>
+    </w:lvl>
+    <w:lvl w:ilvl="2" w:tentative="1">
+      <w:start w:val="1"/>
+      <w:numFmt w:val="bullet"/>
+      <w:lvlText w:val=""/>
+      <w:lvlJc w:val="left"/>
+      <w:pPr>
+        <w:tabs>
+          <w:tab w:val="num" w:pos="2160"/>
+        </w:tabs>
+        <w:ind w:left="2160" w:hanging="360"/>
+      </w:pPr>
+      <w:rPr>
+        <w:rFonts w:ascii="Wingdings" w:hAnsi="Wingdings" w:hint="default"/>
+        <w:sz w:val="20"/>
+      </w:rPr>
+    </w:lvl>
+    <w:lvl w:ilvl="3" w:tentative="1">
+      <w:start w:val="1"/>
+      <w:numFmt w:val="bullet"/>
+      <w:lvlText w:val=""/>
+      <w:lvlJc w:val="left"/>
+      <w:pPr>
+        <w:tabs>
+          <w:tab w:val="num" w:pos="2880"/>
+        </w:tabs>
+        <w:ind w:left="2880" w:hanging="360"/>
+      </w:pPr>
+      <w:rPr>
+        <w:rFonts w:ascii="Wingdings" w:hAnsi="Wingdings" w:hint="default"/>
+        <w:sz w:val="20"/>
+      </w:rPr>
+    </w:lvl>
+    <w:lvl w:ilvl="4" w:tentative="1">
+      <w:start w:val="1"/>
+      <w:numFmt w:val="bullet"/>
+      <w:lvlText w:val=""/>
+      <w:lvlJc w:val="left"/>
+      <w:pPr>
+        <w:tabs>
+          <w:tab w:val="num" w:pos="3600"/>
+        </w:tabs>
+        <w:ind w:left="3600" w:hanging="360"/>
+      </w:pPr>
+      <w:rPr>
+        <w:rFonts w:ascii="Wingdings" w:hAnsi="Wingdings" w:hint="default"/>
+        <w:sz w:val="20"/>
+      </w:rPr>
+    </w:lvl>
+    <w:lvl w:ilvl="5" w:tentative="1">
+      <w:start w:val="1"/>
+      <w:numFmt w:val="bullet"/>
+      <w:lvlText w:val=""/>
+      <w:lvlJc w:val="left"/>
+      <w:pPr>
+        <w:tabs>
+          <w:tab w:val="num" w:pos="4320"/>
+        </w:tabs>
+        <w:ind w:left="4320" w:hanging="360"/>
+      </w:pPr>
+      <w:rPr>
+        <w:rFonts w:ascii="Wingdings" w:hAnsi="Wingdings" w:hint="default"/>
+        <w:sz w:val="20"/>
+      </w:rPr>
+    </w:lvl>
+    <w:lvl w:ilvl="6" w:tentative="1">
+      <w:start w:val="1"/>
+      <w:numFmt w:val="bullet"/>
+      <w:lvlText w:val=""/>
+      <w:lvlJc w:val="left"/>
+      <w:pPr>
+        <w:tabs>
+          <w:tab w:val="num" w:pos="5040"/>
+        </w:tabs>
+        <w:ind w:left="5040" w:hanging="360"/>
+      </w:pPr>
+      <w:rPr>
+        <w:rFonts w:ascii="Wingdings" w:hAnsi="Wingdings" w:hint="default"/>
+        <w:sz w:val="20"/>
+      </w:rPr>
+    </w:lvl>
+    <w:lvl w:ilvl="7" w:tentative="1">
+      <w:start w:val="1"/>
+      <w:numFmt w:val="bullet"/>
+      <w:lvlText w:val=""/>
+      <w:lvlJc w:val="left"/>
+      <w:pPr>
+        <w:tabs>
+          <w:tab w:val="num" w:pos="5760"/>
+        </w:tabs>
+        <w:ind w:left="5760" w:hanging="360"/>
+      </w:pPr>
+      <w:rPr>
+        <w:rFonts w:ascii="Wingdings" w:hAnsi="Wingdings" w:hint="default"/>
+        <w:sz w:val="20"/>
+      </w:rPr>
+    </w:lvl>
+    <w:lvl w:ilvl="8" w:tentative="1">
+      <w:start w:val="1"/>
+      <w:numFmt w:val="bullet"/>
+      <w:lvlText w:val=""/>
+      <w:lvlJc w:val="left"/>
+      <w:pPr>
+        <w:tabs>
+          <w:tab w:val="num" w:pos="6480"/>
+        </w:tabs>
+        <w:ind w:left="6480" w:hanging="360"/>
+      </w:pPr>
+      <w:rPr>
+        <w:rFonts w:ascii="Wingdings" w:hAnsi="Wingdings" w:hint="default"/>
+        <w:sz w:val="20"/>
+      </w:rPr>
+    </w:lvl>
+  </w:abstractNum>
+  <w:abstractNum w:abstractNumId="4" w15:restartNumberingAfterBreak="0">
+    <w:nsid w:val="4B194720"/>
+    <w:multiLevelType w:val="multilevel"/>
+    <w:tmpl w:val="D2C2FE1C"/>
+    <w:lvl w:ilvl="0">
+      <w:start w:val="1"/>
+      <w:numFmt w:val="bullet"/>
+      <w:lvlText w:val=""/>
+      <w:lvlJc w:val="left"/>
+      <w:pPr>
+        <w:tabs>
+          <w:tab w:val="num" w:pos="720"/>
+        </w:tabs>
+        <w:ind w:left="720" w:hanging="360"/>
+      </w:pPr>
+      <w:rPr>
+        <w:rFonts w:ascii="Symbol" w:hAnsi="Symbol" w:hint="default"/>
+        <w:sz w:val="20"/>
+      </w:rPr>
+    </w:lvl>
+    <w:lvl w:ilvl="1" w:tentative="1">
+      <w:start w:val="1"/>
+      <w:numFmt w:val="bullet"/>
+      <w:lvlText w:val="o"/>
+      <w:lvlJc w:val="left"/>
+      <w:pPr>
+        <w:tabs>
+          <w:tab w:val="num" w:pos="1440"/>
+        </w:tabs>
+        <w:ind w:left="1440" w:hanging="360"/>
+      </w:pPr>
+      <w:rPr>
+        <w:rFonts w:ascii="Courier New" w:hAnsi="Courier New" w:hint="default"/>
+        <w:sz w:val="20"/>
+      </w:rPr>
+    </w:lvl>
+    <w:lvl w:ilvl="2" w:tentative="1">
+      <w:start w:val="1"/>
+      <w:numFmt w:val="bullet"/>
+      <w:lvlText w:val=""/>
+      <w:lvlJc w:val="left"/>
+      <w:pPr>
+        <w:tabs>
+          <w:tab w:val="num" w:pos="2160"/>
+        </w:tabs>
+        <w:ind w:left="2160" w:hanging="360"/>
+      </w:pPr>
+      <w:rPr>
+        <w:rFonts w:ascii="Wingdings" w:hAnsi="Wingdings" w:hint="default"/>
+        <w:sz w:val="20"/>
+      </w:rPr>
+    </w:lvl>
+    <w:lvl w:ilvl="3" w:tentative="1">
+      <w:start w:val="1"/>
+      <w:numFmt w:val="bullet"/>
+      <w:lvlText w:val=""/>
+      <w:lvlJc w:val="left"/>
+      <w:pPr>
+        <w:tabs>
+          <w:tab w:val="num" w:pos="2880"/>
+        </w:tabs>
+        <w:ind w:left="2880" w:hanging="360"/>
+      </w:pPr>
+      <w:rPr>
+        <w:rFonts w:ascii="Wingdings" w:hAnsi="Wingdings" w:hint="default"/>
+        <w:sz w:val="20"/>
+      </w:rPr>
+    </w:lvl>
+    <w:lvl w:ilvl="4" w:tentative="1">
+      <w:start w:val="1"/>
+      <w:numFmt w:val="bullet"/>
+      <w:lvlText w:val=""/>
+      <w:lvlJc w:val="left"/>
+      <w:pPr>
+        <w:tabs>
+          <w:tab w:val="num" w:pos="3600"/>
+        </w:tabs>
+        <w:ind w:left="3600" w:hanging="360"/>
+      </w:pPr>
+      <w:rPr>
+        <w:rFonts w:ascii="Wingdings" w:hAnsi="Wingdings" w:hint="default"/>
+        <w:sz w:val="20"/>
+      </w:rPr>
+    </w:lvl>
+    <w:lvl w:ilvl="5" w:tentative="1">
+      <w:start w:val="1"/>
+      <w:numFmt w:val="bullet"/>
+      <w:lvlText w:val=""/>
+      <w:lvlJc w:val="left"/>
+      <w:pPr>
+        <w:tabs>
+          <w:tab w:val="num" w:pos="4320"/>
+        </w:tabs>
+        <w:ind w:left="4320" w:hanging="360"/>
+      </w:pPr>
+      <w:rPr>
+        <w:rFonts w:ascii="Wingdings" w:hAnsi="Wingdings" w:hint="default"/>
+        <w:sz w:val="20"/>
+      </w:rPr>
+    </w:lvl>
+    <w:lvl w:ilvl="6" w:tentative="1">
+      <w:start w:val="1"/>
+      <w:numFmt w:val="bullet"/>
+      <w:lvlText w:val=""/>
+      <w:lvlJc w:val="left"/>
+      <w:pPr>
+        <w:tabs>
+          <w:tab w:val="num" w:pos="5040"/>
+        </w:tabs>
+        <w:ind w:left="5040" w:hanging="360"/>
+      </w:pPr>
+      <w:rPr>
+        <w:rFonts w:ascii="Wingdings" w:hAnsi="Wingdings" w:hint="default"/>
+        <w:sz w:val="20"/>
+      </w:rPr>
+    </w:lvl>
+    <w:lvl w:ilvl="7" w:tentative="1">
+      <w:start w:val="1"/>
+      <w:numFmt w:val="bullet"/>
+      <w:lvlText w:val=""/>
+      <w:lvlJc w:val="left"/>
+      <w:pPr>
+        <w:tabs>
+          <w:tab w:val="num" w:pos="5760"/>
+        </w:tabs>
+        <w:ind w:left="5760" w:hanging="360"/>
+      </w:pPr>
+      <w:rPr>
+        <w:rFonts w:ascii="Wingdings" w:hAnsi="Wingdings" w:hint="default"/>
+        <w:sz w:val="20"/>
+      </w:rPr>
+    </w:lvl>
+    <w:lvl w:ilvl="8" w:tentative="1">
+      <w:start w:val="1"/>
+      <w:numFmt w:val="bullet"/>
+      <w:lvlText w:val=""/>
+      <w:lvlJc w:val="left"/>
+      <w:pPr>
+        <w:tabs>
+          <w:tab w:val="num" w:pos="6480"/>
+        </w:tabs>
+        <w:ind w:left="6480" w:hanging="360"/>
+      </w:pPr>
+      <w:rPr>
+        <w:rFonts w:ascii="Wingdings" w:hAnsi="Wingdings" w:hint="default"/>
+        <w:sz w:val="20"/>
+      </w:rPr>
+    </w:lvl>
+  </w:abstractNum>
+  <w:abstractNum w:abstractNumId="5" w15:restartNumberingAfterBreak="0">
+    <w:nsid w:val="56F00FC7"/>
+    <w:multiLevelType w:val="multilevel"/>
+    <w:tmpl w:val="DD5EDC6C"/>
+    <w:lvl w:ilvl="0">
+      <w:start w:val="1"/>
+      <w:numFmt w:val="bullet"/>
+      <w:lvlText w:val=""/>
+      <w:lvlJc w:val="left"/>
+      <w:pPr>
+        <w:tabs>
+          <w:tab w:val="num" w:pos="720"/>
+        </w:tabs>
+        <w:ind w:left="720" w:hanging="360"/>
+      </w:pPr>
+      <w:rPr>
+        <w:rFonts w:ascii="Symbol" w:hAnsi="Symbol" w:hint="default"/>
+        <w:sz w:val="20"/>
+      </w:rPr>
+    </w:lvl>
+    <w:lvl w:ilvl="1" w:tentative="1">
+      <w:start w:val="1"/>
+      <w:numFmt w:val="bullet"/>
+      <w:lvlText w:val="o"/>
+      <w:lvlJc w:val="left"/>
+      <w:pPr>
+        <w:tabs>
+          <w:tab w:val="num" w:pos="1440"/>
+        </w:tabs>
+        <w:ind w:left="1440" w:hanging="360"/>
+      </w:pPr>
+      <w:rPr>
+        <w:rFonts w:ascii="Courier New" w:hAnsi="Courier New" w:hint="default"/>
+        <w:sz w:val="20"/>
+      </w:rPr>
+    </w:lvl>
+    <w:lvl w:ilvl="2" w:tentative="1">
+      <w:start w:val="1"/>
+      <w:numFmt w:val="bullet"/>
+      <w:lvlText w:val=""/>
+      <w:lvlJc w:val="left"/>
+      <w:pPr>
+        <w:tabs>
+          <w:tab w:val="num" w:pos="2160"/>
+        </w:tabs>
+        <w:ind w:left="2160" w:hanging="360"/>
+      </w:pPr>
+      <w:rPr>
+        <w:rFonts w:ascii="Wingdings" w:hAnsi="Wingdings" w:hint="default"/>
+        <w:sz w:val="20"/>
+      </w:rPr>
+    </w:lvl>
+    <w:lvl w:ilvl="3" w:tentative="1">
+      <w:start w:val="1"/>
+      <w:numFmt w:val="bullet"/>
+      <w:lvlText w:val=""/>
+      <w:lvlJc w:val="left"/>
+      <w:pPr>
+        <w:tabs>
+          <w:tab w:val="num" w:pos="2880"/>
+        </w:tabs>
+        <w:ind w:left="2880" w:hanging="360"/>
+      </w:pPr>
+      <w:rPr>
+        <w:rFonts w:ascii="Wingdings" w:hAnsi="Wingdings" w:hint="default"/>
+        <w:sz w:val="20"/>
+      </w:rPr>
+    </w:lvl>
+    <w:lvl w:ilvl="4" w:tentative="1">
+      <w:start w:val="1"/>
+      <w:numFmt w:val="bullet"/>
+      <w:lvlText w:val=""/>
+      <w:lvlJc w:val="left"/>
+      <w:pPr>
+        <w:tabs>
+          <w:tab w:val="num" w:pos="3600"/>
+        </w:tabs>
+        <w:ind w:left="3600" w:hanging="360"/>
+      </w:pPr>
+      <w:rPr>
+        <w:rFonts w:ascii="Wingdings" w:hAnsi="Wingdings" w:hint="default"/>
+        <w:sz w:val="20"/>
+      </w:rPr>
+    </w:lvl>
+    <w:lvl w:ilvl="5" w:tentative="1">
+      <w:start w:val="1"/>
+      <w:numFmt w:val="bullet"/>
+      <w:lvlText w:val=""/>
+      <w:lvlJc w:val="left"/>
+      <w:pPr>
+        <w:tabs>
+          <w:tab w:val="num" w:pos="4320"/>
+        </w:tabs>
+        <w:ind w:left="4320" w:hanging="360"/>
+      </w:pPr>
+      <w:rPr>
+        <w:rFonts w:ascii="Wingdings" w:hAnsi="Wingdings" w:hint="default"/>
+        <w:sz w:val="20"/>
+      </w:rPr>
+    </w:lvl>
+    <w:lvl w:ilvl="6" w:tentative="1">
+      <w:start w:val="1"/>
+      <w:numFmt w:val="bullet"/>
+      <w:lvlText w:val=""/>
+      <w:lvlJc w:val="left"/>
+      <w:pPr>
+        <w:tabs>
+          <w:tab w:val="num" w:pos="5040"/>
+        </w:tabs>
+        <w:ind w:left="5040" w:hanging="360"/>
+      </w:pPr>
+      <w:rPr>
+        <w:rFonts w:ascii="Wingdings" w:hAnsi="Wingdings" w:hint="default"/>
+        <w:sz w:val="20"/>
+      </w:rPr>
+    </w:lvl>
+    <w:lvl w:ilvl="7" w:tentative="1">
+      <w:start w:val="1"/>
+      <w:numFmt w:val="bullet"/>
+      <w:lvlText w:val=""/>
+      <w:lvlJc w:val="left"/>
+      <w:pPr>
+        <w:tabs>
+          <w:tab w:val="num" w:pos="5760"/>
+        </w:tabs>
+        <w:ind w:left="5760" w:hanging="360"/>
+      </w:pPr>
+      <w:rPr>
+        <w:rFonts w:ascii="Wingdings" w:hAnsi="Wingdings" w:hint="default"/>
+        <w:sz w:val="20"/>
+      </w:rPr>
+    </w:lvl>
+    <w:lvl w:ilvl="8" w:tentative="1">
+      <w:start w:val="1"/>
+      <w:numFmt w:val="bullet"/>
+      <w:lvlText w:val=""/>
+      <w:lvlJc w:val="left"/>
+      <w:pPr>
+        <w:tabs>
+          <w:tab w:val="num" w:pos="6480"/>
+        </w:tabs>
+        <w:ind w:left="6480" w:hanging="360"/>
+      </w:pPr>
+      <w:rPr>
+        <w:rFonts w:ascii="Wingdings" w:hAnsi="Wingdings" w:hint="default"/>
+        <w:sz w:val="20"/>
+      </w:rPr>
+    </w:lvl>
+  </w:abstractNum>
+  <w:abstractNum w:abstractNumId="6" w15:restartNumberingAfterBreak="0">
+    <w:nsid w:val="6CCB7B11"/>
+    <w:multiLevelType w:val="multilevel"/>
+    <w:tmpl w:val="28B875CE"/>
+    <w:lvl w:ilvl="0">
+      <w:start w:val="1"/>
+      <w:numFmt w:val="bullet"/>
+      <w:lvlText w:val=""/>
+      <w:lvlJc w:val="left"/>
+      <w:pPr>
+        <w:tabs>
+          <w:tab w:val="num" w:pos="720"/>
+        </w:tabs>
+        <w:ind w:left="720" w:hanging="360"/>
+      </w:pPr>
+      <w:rPr>
+        <w:rFonts w:ascii="Symbol" w:hAnsi="Symbol" w:hint="default"/>
+        <w:sz w:val="20"/>
+      </w:rPr>
+    </w:lvl>
+    <w:lvl w:ilvl="1" w:tentative="1">
+      <w:start w:val="1"/>
+      <w:numFmt w:val="bullet"/>
+      <w:lvlText w:val="o"/>
+      <w:lvlJc w:val="left"/>
+      <w:pPr>
+        <w:tabs>
+          <w:tab w:val="num" w:pos="1440"/>
+        </w:tabs>
+        <w:ind w:left="1440" w:hanging="360"/>
+      </w:pPr>
+      <w:rPr>
+        <w:rFonts w:ascii="Courier New" w:hAnsi="Courier New" w:hint="default"/>
+        <w:sz w:val="20"/>
+      </w:rPr>
+    </w:lvl>
+    <w:lvl w:ilvl="2" w:tentative="1">
+      <w:start w:val="1"/>
+      <w:numFmt w:val="bullet"/>
+      <w:lvlText w:val=""/>
+      <w:lvlJc w:val="left"/>
+      <w:pPr>
+        <w:tabs>
+          <w:tab w:val="num" w:pos="2160"/>
+        </w:tabs>
+        <w:ind w:left="2160" w:hanging="360"/>
+      </w:pPr>
+      <w:rPr>
+        <w:rFonts w:ascii="Wingdings" w:hAnsi="Wingdings" w:hint="default"/>
+        <w:sz w:val="20"/>
+      </w:rPr>
+    </w:lvl>
+    <w:lvl w:ilvl="3" w:tentative="1">
+      <w:start w:val="1"/>
+      <w:numFmt w:val="bullet"/>
+      <w:lvlText w:val=""/>
+      <w:lvlJc w:val="left"/>
+      <w:pPr>
+        <w:tabs>
+          <w:tab w:val="num" w:pos="2880"/>
+        </w:tabs>
+        <w:ind w:left="2880" w:hanging="360"/>
+      </w:pPr>
+      <w:rPr>
+        <w:rFonts w:ascii="Wingdings" w:hAnsi="Wingdings" w:hint="default"/>
+        <w:sz w:val="20"/>
+      </w:rPr>
+    </w:lvl>
+    <w:lvl w:ilvl="4" w:tentative="1">
+      <w:start w:val="1"/>
+      <w:numFmt w:val="bullet"/>
+      <w:lvlText w:val=""/>
+      <w:lvlJc w:val="left"/>
+      <w:pPr>
+        <w:tabs>
+          <w:tab w:val="num" w:pos="3600"/>
+        </w:tabs>
+        <w:ind w:left="3600" w:hanging="360"/>
+      </w:pPr>
+      <w:rPr>
+        <w:rFonts w:ascii="Wingdings" w:hAnsi="Wingdings" w:hint="default"/>
+        <w:sz w:val="20"/>
+      </w:rPr>
+    </w:lvl>
+    <w:lvl w:ilvl="5" w:tentative="1">
+      <w:start w:val="1"/>
+      <w:numFmt w:val="bullet"/>
+      <w:lvlText w:val=""/>
+      <w:lvlJc w:val="left"/>
+      <w:pPr>
+        <w:tabs>
+          <w:tab w:val="num" w:pos="4320"/>
+        </w:tabs>
+        <w:ind w:left="4320" w:hanging="360"/>
+      </w:pPr>
+      <w:rPr>
+        <w:rFonts w:ascii="Wingdings" w:hAnsi="Wingdings" w:hint="default"/>
+        <w:sz w:val="20"/>
+      </w:rPr>
+    </w:lvl>
+    <w:lvl w:ilvl="6" w:tentative="1">
+      <w:start w:val="1"/>
+      <w:numFmt w:val="bullet"/>
+      <w:lvlText w:val=""/>
+      <w:lvlJc w:val="left"/>
+      <w:pPr>
+        <w:tabs>
+          <w:tab w:val="num" w:pos="5040"/>
+        </w:tabs>
+        <w:ind w:left="5040" w:hanging="360"/>
+      </w:pPr>
+      <w:rPr>
+        <w:rFonts w:ascii="Wingdings" w:hAnsi="Wingdings" w:hint="default"/>
+        <w:sz w:val="20"/>
+      </w:rPr>
+    </w:lvl>
+    <w:lvl w:ilvl="7" w:tentative="1">
+      <w:start w:val="1"/>
+      <w:numFmt w:val="bullet"/>
+      <w:lvlText w:val=""/>
+      <w:lvlJc w:val="left"/>
+      <w:pPr>
+        <w:tabs>
+          <w:tab w:val="num" w:pos="5760"/>
+        </w:tabs>
+        <w:ind w:left="5760" w:hanging="360"/>
+      </w:pPr>
+      <w:rPr>
+        <w:rFonts w:ascii="Wingdings" w:hAnsi="Wingdings" w:hint="default"/>
+        <w:sz w:val="20"/>
+      </w:rPr>
+    </w:lvl>
+    <w:lvl w:ilvl="8" w:tentative="1">
+      <w:start w:val="1"/>
+      <w:numFmt w:val="bullet"/>
+      <w:lvlText w:val=""/>
+      <w:lvlJc w:val="left"/>
+      <w:pPr>
+        <w:tabs>
+          <w:tab w:val="num" w:pos="6480"/>
+        </w:tabs>
+        <w:ind w:left="6480" w:hanging="360"/>
+      </w:pPr>
+      <w:rPr>
+        <w:rFonts w:ascii="Wingdings" w:hAnsi="Wingdings" w:hint="default"/>
+        <w:sz w:val="20"/>
+      </w:rPr>
+    </w:lvl>
+  </w:abstractNum>
+  <w:abstractNum w:abstractNumId="7" w15:restartNumberingAfterBreak="0">
     <w:nsid w:val="6CE13B78"/>
     <w:multiLevelType w:val="hybridMultilevel"/>
     <w:tmpl w:val="6D70EBDE"/>
@@ -6196,7 +7350,7 @@
       <w:lvlJc w:val="left"/>
     </w:lvl>
   </w:abstractNum>
-  <w:abstractNum w:abstractNumId="2" w15:restartNumberingAfterBreak="0">
+  <w:abstractNum w:abstractNumId="8" w15:restartNumberingAfterBreak="0">
     <w:nsid w:val="738050E2"/>
     <w:multiLevelType w:val="hybridMultilevel"/>
     <w:tmpl w:val="4EFEBF62"/>
@@ -6250,7 +7404,7 @@
       <w:lvlJc w:val="left"/>
     </w:lvl>
   </w:abstractNum>
-  <w:abstractNum w:abstractNumId="3" w15:restartNumberingAfterBreak="0">
+  <w:abstractNum w:abstractNumId="9" w15:restartNumberingAfterBreak="0">
     <w:nsid w:val="740F27EE"/>
     <w:multiLevelType w:val="hybridMultilevel"/>
     <w:tmpl w:val="447CC62C"/>
@@ -6364,22 +7518,40 @@
     </w:lvl>
   </w:abstractNum>
   <w:num w:numId="1" w16cid:durableId="1646860371">
-    <w:abstractNumId w:val="1"/>
+    <w:abstractNumId w:val="7"/>
     <w:lvlOverride w:ilvl="0">
       <w:startOverride w:val="1"/>
     </w:lvlOverride>
   </w:num>
   <w:num w:numId="2" w16cid:durableId="238562914">
-    <w:abstractNumId w:val="2"/>
+    <w:abstractNumId w:val="8"/>
     <w:lvlOverride w:ilvl="0">
       <w:startOverride w:val="1"/>
     </w:lvlOverride>
   </w:num>
   <w:num w:numId="3" w16cid:durableId="1187863700">
+    <w:abstractNumId w:val="9"/>
+  </w:num>
+  <w:num w:numId="4" w16cid:durableId="818114558">
+    <w:abstractNumId w:val="1"/>
+  </w:num>
+  <w:num w:numId="5" w16cid:durableId="1645428958">
+    <w:abstractNumId w:val="6"/>
+  </w:num>
+  <w:num w:numId="6" w16cid:durableId="48039180">
     <w:abstractNumId w:val="3"/>
   </w:num>
-  <w:num w:numId="4" w16cid:durableId="818114558">
+  <w:num w:numId="7" w16cid:durableId="38826392">
+    <w:abstractNumId w:val="4"/>
+  </w:num>
+  <w:num w:numId="8" w16cid:durableId="1877110249">
     <w:abstractNumId w:val="0"/>
+  </w:num>
+  <w:num w:numId="9" w16cid:durableId="1652708471">
+    <w:abstractNumId w:val="5"/>
+  </w:num>
+  <w:num w:numId="10" w16cid:durableId="45641048">
+    <w:abstractNumId w:val="2"/>
   </w:num>
 </w:numbering>
 </file>
@@ -6987,7 +8159,6 @@
   <w:style w:type="character" w:default="1" w:styleId="DefaultParagraphFont">
     <w:name w:val="Default Paragraph Font"/>
     <w:uiPriority w:val="1"/>
-    <w:semiHidden/>
     <w:unhideWhenUsed/>
   </w:style>
   <w:style w:type="table" w:default="1" w:styleId="TableNormal">

</xml_diff>